<commit_message>
Refactor Achievers incentive structure: clarify Direct vs Direct Team targets, update tables and notes for accuracy; enhance documentation for better understanding.
</commit_message>
<xml_diff>
--- a/00-documents/Apolium_Technical_Architecture_DEV.docx
+++ b/00-documents/Apolium_Technical_Architecture_DEV.docx
@@ -1,6 +1,6 @@
 
 <file path=word/document.xml><?xml version="1.0" encoding="utf-8"?>
-<w:document xmlns:wpc="http://schemas.microsoft.com/office/word/2010/wordprocessingCanvas" xmlns:cx="http://schemas.microsoft.com/office/drawing/2014/chartex" xmlns:cx1="http://schemas.microsoft.com/office/drawing/2015/9/8/chartex" xmlns:cx2="http://schemas.microsoft.com/office/drawing/2015/10/21/chartex" xmlns:cx3="http://schemas.microsoft.com/office/drawing/2016/5/9/chartex" xmlns:cx4="http://schemas.microsoft.com/office/drawing/2016/5/10/chartex" xmlns:cx5="http://schemas.microsoft.com/office/drawing/2016/5/11/chartex" xmlns:cx6="http://schemas.microsoft.com/office/drawing/2016/5/12/chartex" xmlns:cx7="http://schemas.microsoft.com/office/drawing/2016/5/13/chartex" xmlns:cx8="http://schemas.microsoft.com/office/drawing/2016/5/14/chartex" xmlns:mc="http://schemas.openxmlformats.org/markup-compatibility/2006" xmlns:aink="http://schemas.microsoft.com/office/drawing/2016/ink" xmlns:am3d="http://schemas.microsoft.com/office/drawing/2017/model3d" xmlns:o="urn:schemas-microsoft-com:office:office" xmlns:oel="http://schemas.microsoft.com/office/2019/extlst" xmlns:r="http://schemas.openxmlformats.org/officeDocument/2006/relationships" xmlns:m="http://schemas.openxmlformats.org/officeDocument/2006/math" xmlns:v="urn:schemas-microsoft-com:vml" xmlns:wp14="http://schemas.microsoft.com/office/word/2010/wordprocessingDrawing" xmlns:wp="http://schemas.openxmlformats.org/drawingml/2006/wordprocessingDrawing" xmlns:w10="urn:schemas-microsoft-com:office:word" xmlns:w="http://schemas.openxmlformats.org/wordprocessingml/2006/main" xmlns:w14="http://schemas.microsoft.com/office/word/2010/wordml" xmlns:w15="http://schemas.microsoft.com/office/word/2012/wordml" xmlns:w16cei="http://schemas.microsoft.com/office/word/2026/wordml/cei" xmlns:w16cex="http://schemas.microsoft.com/office/word/2018/wordml/cex" xmlns:w16cid="http://schemas.microsoft.com/office/word/2016/wordml/cid" xmlns:w16="http://schemas.microsoft.com/office/word/2018/wordml" xmlns:w16du="http://schemas.microsoft.com/office/word/2023/wordml/word16du" xmlns:w16sdtdh="http://schemas.microsoft.com/office/word/2020/wordml/sdtdatahash" xmlns:w16sdtfl="http://schemas.microsoft.com/office/word/2024/wordml/sdtformatlock" xmlns:w16se="http://schemas.microsoft.com/office/word/2015/wordml/symex" xmlns:wpg="http://schemas.microsoft.com/office/word/2010/wordprocessingGroup" xmlns:wpi="http://schemas.microsoft.com/office/word/2010/wordprocessingInk" xmlns:wne="http://schemas.microsoft.com/office/word/2006/wordml" xmlns:wps="http://schemas.microsoft.com/office/word/2010/wordprocessingShape" mc:Ignorable="w14 w15 w16se w16cid w16 w16cex w16sdtdh w16sdtfl w16du wp14">
+<w:document xmlns:wpc="http://schemas.microsoft.com/office/word/2010/wordprocessingCanvas" xmlns:cx="http://schemas.microsoft.com/office/drawing/2014/chartex" xmlns:cx1="http://schemas.microsoft.com/office/drawing/2015/9/8/chartex" xmlns:cx2="http://schemas.microsoft.com/office/drawing/2015/10/21/chartex" xmlns:cx3="http://schemas.microsoft.com/office/drawing/2016/5/9/chartex" xmlns:cx4="http://schemas.microsoft.com/office/drawing/2016/5/10/chartex" xmlns:cx5="http://schemas.microsoft.com/office/drawing/2016/5/11/chartex" xmlns:cx6="http://schemas.microsoft.com/office/drawing/2016/5/12/chartex" xmlns:cx7="http://schemas.microsoft.com/office/drawing/2016/5/13/chartex" xmlns:cx8="http://schemas.microsoft.com/office/drawing/2016/5/14/chartex" xmlns:mc="http://schemas.openxmlformats.org/markup-compatibility/2006" xmlns:aink="http://schemas.microsoft.com/office/drawing/2016/ink" xmlns:am3d="http://schemas.microsoft.com/office/drawing/2017/model3d" xmlns:o="urn:schemas-microsoft-com:office:office" xmlns:oel="http://schemas.microsoft.com/office/2019/extlst" xmlns:r="http://schemas.openxmlformats.org/officeDocument/2006/relationships" xmlns:m="http://schemas.openxmlformats.org/officeDocument/2006/math" xmlns:v="urn:schemas-microsoft-com:vml" xmlns:wp14="http://schemas.microsoft.com/office/word/2010/wordprocessingDrawing" xmlns:wp="http://schemas.openxmlformats.org/drawingml/2006/wordprocessingDrawing" xmlns:w10="urn:schemas-microsoft-com:office:word" xmlns:w="http://schemas.openxmlformats.org/wordprocessingml/2006/main" xmlns:w14="http://schemas.microsoft.com/office/word/2010/wordml" xmlns:w15="http://schemas.microsoft.com/office/word/2012/wordml" xmlns:w16cex="http://schemas.microsoft.com/office/word/2018/wordml/cex" xmlns:w16cid="http://schemas.microsoft.com/office/word/2016/wordml/cid" xmlns:w16="http://schemas.microsoft.com/office/word/2018/wordml" xmlns:w16du="http://schemas.microsoft.com/office/word/2023/wordml/word16du" xmlns:w16sdtdh="http://schemas.microsoft.com/office/word/2020/wordml/sdtdatahash" xmlns:w16sdtfl="http://schemas.microsoft.com/office/word/2024/wordml/sdtformatlock" xmlns:w16se="http://schemas.microsoft.com/office/word/2015/wordml/symex" xmlns:wpg="http://schemas.microsoft.com/office/word/2010/wordprocessingGroup" xmlns:wpi="http://schemas.microsoft.com/office/word/2010/wordprocessingInk" xmlns:wne="http://schemas.microsoft.com/office/word/2006/wordml" xmlns:wps="http://schemas.microsoft.com/office/word/2010/wordprocessingShape" mc:Ignorable="w14 w15 w16se w16cid w16 w16cex w16sdtdh w16sdtfl w16du wp14">
   <w:body>
     <w:p>
       <w:pPr>
@@ -19,7 +19,7 @@
           <w:spacing w:val="60"/>
           <w:sz w:val="18"/>
         </w:rPr>
-        <w:t>TECHNICAL ARCHITECTURE  ·  V1.0  ·  INTERNAL</w:t>
+        <w:t>TECHNICAL ARCHITECTURE  ·  V1.2  ·  INTERNAL</w:t>
       </w:r>
     </w:p>
     <w:p>
@@ -549,7 +549,7 @@
       <w:r>
         <w:fldChar w:fldCharType="separate"/>
       </w:r>
-      <w:hyperlink w:anchor="_Toc236790525" w:history="1">
+      <w:hyperlink w:anchor="_Toc239422371" w:history="1">
         <w:r>
           <w:rPr>
             <w:rStyle w:val="Hyperlink"/>
@@ -586,7 +586,7 @@
             <w:noProof/>
             <w:webHidden/>
           </w:rPr>
-          <w:instrText xml:space="preserve"> PAGEREF _Toc236790525 \h </w:instrText>
+          <w:instrText xml:space="preserve"> PAGEREF _Toc239422371 \h </w:instrText>
         </w:r>
         <w:r>
           <w:rPr>
@@ -633,7 +633,7 @@
           <w14:ligatures w14:val="standardContextual"/>
         </w:rPr>
       </w:pPr>
-      <w:hyperlink w:anchor="_Toc236790526" w:history="1">
+      <w:hyperlink w:anchor="_Toc239422372" w:history="1">
         <w:r>
           <w:rPr>
             <w:rStyle w:val="Hyperlink"/>
@@ -661,7 +661,7 @@
             <w:noProof/>
             <w:webHidden/>
           </w:rPr>
-          <w:instrText xml:space="preserve"> PAGEREF _Toc236790526 \h </w:instrText>
+          <w:instrText xml:space="preserve"> PAGEREF _Toc239422372 \h </w:instrText>
         </w:r>
         <w:r>
           <w:rPr>
@@ -708,7 +708,7 @@
           <w14:ligatures w14:val="standardContextual"/>
         </w:rPr>
       </w:pPr>
-      <w:hyperlink w:anchor="_Toc236790527" w:history="1">
+      <w:hyperlink w:anchor="_Toc239422373" w:history="1">
         <w:r>
           <w:rPr>
             <w:rStyle w:val="Hyperlink"/>
@@ -736,7 +736,7 @@
             <w:noProof/>
             <w:webHidden/>
           </w:rPr>
-          <w:instrText xml:space="preserve"> PAGEREF _Toc236790527 \h </w:instrText>
+          <w:instrText xml:space="preserve"> PAGEREF _Toc239422373 \h </w:instrText>
         </w:r>
         <w:r>
           <w:rPr>
@@ -783,7 +783,7 @@
           <w14:ligatures w14:val="standardContextual"/>
         </w:rPr>
       </w:pPr>
-      <w:hyperlink w:anchor="_Toc236790528" w:history="1">
+      <w:hyperlink w:anchor="_Toc239422374" w:history="1">
         <w:r>
           <w:rPr>
             <w:rStyle w:val="Hyperlink"/>
@@ -811,7 +811,7 @@
             <w:noProof/>
             <w:webHidden/>
           </w:rPr>
-          <w:instrText xml:space="preserve"> PAGEREF _Toc236790528 \h </w:instrText>
+          <w:instrText xml:space="preserve"> PAGEREF _Toc239422374 \h </w:instrText>
         </w:r>
         <w:r>
           <w:rPr>
@@ -858,7 +858,7 @@
           <w14:ligatures w14:val="standardContextual"/>
         </w:rPr>
       </w:pPr>
-      <w:hyperlink w:anchor="_Toc236790529" w:history="1">
+      <w:hyperlink w:anchor="_Toc239422375" w:history="1">
         <w:r>
           <w:rPr>
             <w:rStyle w:val="Hyperlink"/>
@@ -895,7 +895,7 @@
             <w:noProof/>
             <w:webHidden/>
           </w:rPr>
-          <w:instrText xml:space="preserve"> PAGEREF _Toc236790529 \h </w:instrText>
+          <w:instrText xml:space="preserve"> PAGEREF _Toc239422375 \h </w:instrText>
         </w:r>
         <w:r>
           <w:rPr>
@@ -942,7 +942,7 @@
           <w14:ligatures w14:val="standardContextual"/>
         </w:rPr>
       </w:pPr>
-      <w:hyperlink w:anchor="_Toc236790530" w:history="1">
+      <w:hyperlink w:anchor="_Toc239422376" w:history="1">
         <w:r>
           <w:rPr>
             <w:rStyle w:val="Hyperlink"/>
@@ -970,7 +970,7 @@
             <w:noProof/>
             <w:webHidden/>
           </w:rPr>
-          <w:instrText xml:space="preserve"> PAGEREF _Toc236790530 \h </w:instrText>
+          <w:instrText xml:space="preserve"> PAGEREF _Toc239422376 \h </w:instrText>
         </w:r>
         <w:r>
           <w:rPr>
@@ -1017,7 +1017,7 @@
           <w14:ligatures w14:val="standardContextual"/>
         </w:rPr>
       </w:pPr>
-      <w:hyperlink w:anchor="_Toc236790531" w:history="1">
+      <w:hyperlink w:anchor="_Toc239422377" w:history="1">
         <w:r>
           <w:rPr>
             <w:rStyle w:val="Hyperlink"/>
@@ -1045,7 +1045,7 @@
             <w:noProof/>
             <w:webHidden/>
           </w:rPr>
-          <w:instrText xml:space="preserve"> PAGEREF _Toc236790531 \h </w:instrText>
+          <w:instrText xml:space="preserve"> PAGEREF _Toc239422377 \h </w:instrText>
         </w:r>
         <w:r>
           <w:rPr>
@@ -1092,7 +1092,7 @@
           <w14:ligatures w14:val="standardContextual"/>
         </w:rPr>
       </w:pPr>
-      <w:hyperlink w:anchor="_Toc236790532" w:history="1">
+      <w:hyperlink w:anchor="_Toc239422378" w:history="1">
         <w:r>
           <w:rPr>
             <w:rStyle w:val="Hyperlink"/>
@@ -1120,7 +1120,7 @@
             <w:noProof/>
             <w:webHidden/>
           </w:rPr>
-          <w:instrText xml:space="preserve"> PAGEREF _Toc236790532 \h </w:instrText>
+          <w:instrText xml:space="preserve"> PAGEREF _Toc239422378 \h </w:instrText>
         </w:r>
         <w:r>
           <w:rPr>
@@ -1167,7 +1167,7 @@
           <w14:ligatures w14:val="standardContextual"/>
         </w:rPr>
       </w:pPr>
-      <w:hyperlink w:anchor="_Toc236790533" w:history="1">
+      <w:hyperlink w:anchor="_Toc239422379" w:history="1">
         <w:r>
           <w:rPr>
             <w:rStyle w:val="Hyperlink"/>
@@ -1204,7 +1204,7 @@
             <w:noProof/>
             <w:webHidden/>
           </w:rPr>
-          <w:instrText xml:space="preserve"> PAGEREF _Toc236790533 \h </w:instrText>
+          <w:instrText xml:space="preserve"> PAGEREF _Toc239422379 \h </w:instrText>
         </w:r>
         <w:r>
           <w:rPr>
@@ -1251,7 +1251,7 @@
           <w14:ligatures w14:val="standardContextual"/>
         </w:rPr>
       </w:pPr>
-      <w:hyperlink w:anchor="_Toc236790534" w:history="1">
+      <w:hyperlink w:anchor="_Toc239422380" w:history="1">
         <w:r>
           <w:rPr>
             <w:rStyle w:val="Hyperlink"/>
@@ -1279,7 +1279,7 @@
             <w:noProof/>
             <w:webHidden/>
           </w:rPr>
-          <w:instrText xml:space="preserve"> PAGEREF _Toc236790534 \h </w:instrText>
+          <w:instrText xml:space="preserve"> PAGEREF _Toc239422380 \h </w:instrText>
         </w:r>
         <w:r>
           <w:rPr>
@@ -1326,7 +1326,7 @@
           <w14:ligatures w14:val="standardContextual"/>
         </w:rPr>
       </w:pPr>
-      <w:hyperlink w:anchor="_Toc236790535" w:history="1">
+      <w:hyperlink w:anchor="_Toc239422381" w:history="1">
         <w:r>
           <w:rPr>
             <w:rStyle w:val="Hyperlink"/>
@@ -1354,7 +1354,7 @@
             <w:noProof/>
             <w:webHidden/>
           </w:rPr>
-          <w:instrText xml:space="preserve"> PAGEREF _Toc236790535 \h </w:instrText>
+          <w:instrText xml:space="preserve"> PAGEREF _Toc239422381 \h </w:instrText>
         </w:r>
         <w:r>
           <w:rPr>
@@ -1401,7 +1401,7 @@
           <w14:ligatures w14:val="standardContextual"/>
         </w:rPr>
       </w:pPr>
-      <w:hyperlink w:anchor="_Toc236790536" w:history="1">
+      <w:hyperlink w:anchor="_Toc239422382" w:history="1">
         <w:r>
           <w:rPr>
             <w:rStyle w:val="Hyperlink"/>
@@ -1429,7 +1429,7 @@
             <w:noProof/>
             <w:webHidden/>
           </w:rPr>
-          <w:instrText xml:space="preserve"> PAGEREF _Toc236790536 \h </w:instrText>
+          <w:instrText xml:space="preserve"> PAGEREF _Toc239422382 \h </w:instrText>
         </w:r>
         <w:r>
           <w:rPr>
@@ -1476,7 +1476,7 @@
           <w14:ligatures w14:val="standardContextual"/>
         </w:rPr>
       </w:pPr>
-      <w:hyperlink w:anchor="_Toc236790537" w:history="1">
+      <w:hyperlink w:anchor="_Toc239422383" w:history="1">
         <w:r>
           <w:rPr>
             <w:rStyle w:val="Hyperlink"/>
@@ -1504,7 +1504,7 @@
             <w:noProof/>
             <w:webHidden/>
           </w:rPr>
-          <w:instrText xml:space="preserve"> PAGEREF _Toc236790537 \h </w:instrText>
+          <w:instrText xml:space="preserve"> PAGEREF _Toc239422383 \h </w:instrText>
         </w:r>
         <w:r>
           <w:rPr>
@@ -1551,7 +1551,7 @@
           <w14:ligatures w14:val="standardContextual"/>
         </w:rPr>
       </w:pPr>
-      <w:hyperlink w:anchor="_Toc236790538" w:history="1">
+      <w:hyperlink w:anchor="_Toc239422384" w:history="1">
         <w:r>
           <w:rPr>
             <w:rStyle w:val="Hyperlink"/>
@@ -1579,7 +1579,7 @@
             <w:noProof/>
             <w:webHidden/>
           </w:rPr>
-          <w:instrText xml:space="preserve"> PAGEREF _Toc236790538 \h </w:instrText>
+          <w:instrText xml:space="preserve"> PAGEREF _Toc239422384 \h </w:instrText>
         </w:r>
         <w:r>
           <w:rPr>
@@ -1626,7 +1626,7 @@
           <w14:ligatures w14:val="standardContextual"/>
         </w:rPr>
       </w:pPr>
-      <w:hyperlink w:anchor="_Toc236790539" w:history="1">
+      <w:hyperlink w:anchor="_Toc239422385" w:history="1">
         <w:r>
           <w:rPr>
             <w:rStyle w:val="Hyperlink"/>
@@ -1654,82 +1654,7 @@
             <w:noProof/>
             <w:webHidden/>
           </w:rPr>
-          <w:instrText xml:space="preserve"> PAGEREF _Toc236790539 \h </w:instrText>
-        </w:r>
-        <w:r>
-          <w:rPr>
-            <w:noProof/>
-            <w:webHidden/>
-          </w:rPr>
-        </w:r>
-        <w:r>
-          <w:rPr>
-            <w:noProof/>
-            <w:webHidden/>
-          </w:rPr>
-          <w:fldChar w:fldCharType="separate"/>
-        </w:r>
-        <w:r>
-          <w:rPr>
-            <w:noProof/>
-            <w:webHidden/>
-          </w:rPr>
-          <w:t>12</w:t>
-        </w:r>
-        <w:r>
-          <w:rPr>
-            <w:noProof/>
-            <w:webHidden/>
-          </w:rPr>
-          <w:fldChar w:fldCharType="end"/>
-        </w:r>
-      </w:hyperlink>
-    </w:p>
-    <w:p>
-      <w:pPr>
-        <w:pStyle w:val="TOC2"/>
-        <w:tabs>
-          <w:tab w:val="right" w:leader="dot" w:pos="9638"/>
-        </w:tabs>
-        <w:rPr>
-          <w:rFonts w:asciiTheme="minorHAnsi" w:eastAsiaTheme="minorEastAsia" w:hAnsiTheme="minorHAnsi"/>
-          <w:noProof/>
-          <w:color w:val="auto"/>
-          <w:kern w:val="2"/>
-          <w:sz w:val="24"/>
-          <w:szCs w:val="24"/>
-          <w14:ligatures w14:val="standardContextual"/>
-        </w:rPr>
-      </w:pPr>
-      <w:hyperlink w:anchor="_Toc236790540" w:history="1">
-        <w:r>
-          <w:rPr>
-            <w:rStyle w:val="Hyperlink"/>
-            <w:rFonts w:ascii="Segoe UI Semibold" w:eastAsia="Segoe UI Semibold" w:hAnsi="Segoe UI Semibold" w:cs="Segoe UI Semibold"/>
-            <w:noProof/>
-          </w:rPr>
-          <w:t>3.7  Point ledger — append-only, partitioned</w:t>
-        </w:r>
-        <w:r>
-          <w:rPr>
-            <w:noProof/>
-            <w:webHidden/>
-          </w:rPr>
-          <w:tab/>
-        </w:r>
-        <w:r>
-          <w:rPr>
-            <w:noProof/>
-            <w:webHidden/>
-          </w:rPr>
-          <w:fldChar w:fldCharType="begin"/>
-        </w:r>
-        <w:r>
-          <w:rPr>
-            <w:noProof/>
-            <w:webHidden/>
-          </w:rPr>
-          <w:instrText xml:space="preserve"> PAGEREF _Toc236790540 \h </w:instrText>
+          <w:instrText xml:space="preserve"> PAGEREF _Toc239422385 \h </w:instrText>
         </w:r>
         <w:r>
           <w:rPr>
@@ -1776,7 +1701,82 @@
           <w14:ligatures w14:val="standardContextual"/>
         </w:rPr>
       </w:pPr>
-      <w:hyperlink w:anchor="_Toc236790541" w:history="1">
+      <w:hyperlink w:anchor="_Toc239422386" w:history="1">
+        <w:r>
+          <w:rPr>
+            <w:rStyle w:val="Hyperlink"/>
+            <w:rFonts w:ascii="Segoe UI Semibold" w:eastAsia="Segoe UI Semibold" w:hAnsi="Segoe UI Semibold" w:cs="Segoe UI Semibold"/>
+            <w:noProof/>
+          </w:rPr>
+          <w:t>3.7  Point ledger — append-only, partitioned</w:t>
+        </w:r>
+        <w:r>
+          <w:rPr>
+            <w:noProof/>
+            <w:webHidden/>
+          </w:rPr>
+          <w:tab/>
+        </w:r>
+        <w:r>
+          <w:rPr>
+            <w:noProof/>
+            <w:webHidden/>
+          </w:rPr>
+          <w:fldChar w:fldCharType="begin"/>
+        </w:r>
+        <w:r>
+          <w:rPr>
+            <w:noProof/>
+            <w:webHidden/>
+          </w:rPr>
+          <w:instrText xml:space="preserve"> PAGEREF _Toc239422386 \h </w:instrText>
+        </w:r>
+        <w:r>
+          <w:rPr>
+            <w:noProof/>
+            <w:webHidden/>
+          </w:rPr>
+        </w:r>
+        <w:r>
+          <w:rPr>
+            <w:noProof/>
+            <w:webHidden/>
+          </w:rPr>
+          <w:fldChar w:fldCharType="separate"/>
+        </w:r>
+        <w:r>
+          <w:rPr>
+            <w:noProof/>
+            <w:webHidden/>
+          </w:rPr>
+          <w:t>13</w:t>
+        </w:r>
+        <w:r>
+          <w:rPr>
+            <w:noProof/>
+            <w:webHidden/>
+          </w:rPr>
+          <w:fldChar w:fldCharType="end"/>
+        </w:r>
+      </w:hyperlink>
+    </w:p>
+    <w:p>
+      <w:pPr>
+        <w:pStyle w:val="TOC2"/>
+        <w:tabs>
+          <w:tab w:val="right" w:leader="dot" w:pos="9638"/>
+        </w:tabs>
+        <w:rPr>
+          <w:rFonts w:asciiTheme="minorHAnsi" w:eastAsiaTheme="minorEastAsia" w:hAnsiTheme="minorHAnsi"/>
+          <w:noProof/>
+          <w:color w:val="auto"/>
+          <w:kern w:val="2"/>
+          <w:sz w:val="24"/>
+          <w:szCs w:val="24"/>
+          <w14:ligatures w14:val="standardContextual"/>
+        </w:rPr>
+      </w:pPr>
+      <w:hyperlink w:anchor="_Toc239422387" w:history="1">
         <w:r>
           <w:rPr>
             <w:rStyle w:val="Hyperlink"/>
@@ -1804,7 +1804,7 @@
             <w:noProof/>
             <w:webHidden/>
           </w:rPr>
-          <w:instrText xml:space="preserve"> PAGEREF _Toc236790541 \h </w:instrText>
+          <w:instrText xml:space="preserve"> PAGEREF _Toc239422387 \h </w:instrText>
         </w:r>
         <w:r>
           <w:rPr>
@@ -1851,7 +1851,7 @@
           <w14:ligatures w14:val="standardContextual"/>
         </w:rPr>
       </w:pPr>
-      <w:hyperlink w:anchor="_Toc236790542" w:history="1">
+      <w:hyperlink w:anchor="_Toc239422388" w:history="1">
         <w:r>
           <w:rPr>
             <w:rStyle w:val="Hyperlink"/>
@@ -1879,7 +1879,7 @@
             <w:noProof/>
             <w:webHidden/>
           </w:rPr>
-          <w:instrText xml:space="preserve"> PAGEREF _Toc236790542 \h </w:instrText>
+          <w:instrText xml:space="preserve"> PAGEREF _Toc239422388 \h </w:instrText>
         </w:r>
         <w:r>
           <w:rPr>
@@ -1926,7 +1926,7 @@
           <w14:ligatures w14:val="standardContextual"/>
         </w:rPr>
       </w:pPr>
-      <w:hyperlink w:anchor="_Toc236790543" w:history="1">
+      <w:hyperlink w:anchor="_Toc239422389" w:history="1">
         <w:r>
           <w:rPr>
             <w:rStyle w:val="Hyperlink"/>
@@ -1963,7 +1963,7 @@
             <w:noProof/>
             <w:webHidden/>
           </w:rPr>
-          <w:instrText xml:space="preserve"> PAGEREF _Toc236790543 \h </w:instrText>
+          <w:instrText xml:space="preserve"> PAGEREF _Toc239422389 \h </w:instrText>
         </w:r>
         <w:r>
           <w:rPr>
@@ -2010,7 +2010,7 @@
           <w14:ligatures w14:val="standardContextual"/>
         </w:rPr>
       </w:pPr>
-      <w:hyperlink w:anchor="_Toc236790544" w:history="1">
+      <w:hyperlink w:anchor="_Toc239422390" w:history="1">
         <w:r>
           <w:rPr>
             <w:rStyle w:val="Hyperlink"/>
@@ -2038,7 +2038,7 @@
             <w:noProof/>
             <w:webHidden/>
           </w:rPr>
-          <w:instrText xml:space="preserve"> PAGEREF _Toc236790544 \h </w:instrText>
+          <w:instrText xml:space="preserve"> PAGEREF _Toc239422390 \h </w:instrText>
         </w:r>
         <w:r>
           <w:rPr>
@@ -2085,7 +2085,7 @@
           <w14:ligatures w14:val="standardContextual"/>
         </w:rPr>
       </w:pPr>
-      <w:hyperlink w:anchor="_Toc236790545" w:history="1">
+      <w:hyperlink w:anchor="_Toc239422391" w:history="1">
         <w:r>
           <w:rPr>
             <w:rStyle w:val="Hyperlink"/>
@@ -2113,7 +2113,7 @@
             <w:noProof/>
             <w:webHidden/>
           </w:rPr>
-          <w:instrText xml:space="preserve"> PAGEREF _Toc236790545 \h </w:instrText>
+          <w:instrText xml:space="preserve"> PAGEREF _Toc239422391 \h </w:instrText>
         </w:r>
         <w:r>
           <w:rPr>
@@ -2160,7 +2160,7 @@
           <w14:ligatures w14:val="standardContextual"/>
         </w:rPr>
       </w:pPr>
-      <w:hyperlink w:anchor="_Toc236790546" w:history="1">
+      <w:hyperlink w:anchor="_Toc239422392" w:history="1">
         <w:r>
           <w:rPr>
             <w:rStyle w:val="Hyperlink"/>
@@ -2188,7 +2188,7 @@
             <w:noProof/>
             <w:webHidden/>
           </w:rPr>
-          <w:instrText xml:space="preserve"> PAGEREF _Toc236790546 \h </w:instrText>
+          <w:instrText xml:space="preserve"> PAGEREF _Toc239422392 \h </w:instrText>
         </w:r>
         <w:r>
           <w:rPr>
@@ -2235,7 +2235,7 @@
           <w14:ligatures w14:val="standardContextual"/>
         </w:rPr>
       </w:pPr>
-      <w:hyperlink w:anchor="_Toc236790547" w:history="1">
+      <w:hyperlink w:anchor="_Toc239422393" w:history="1">
         <w:r>
           <w:rPr>
             <w:rStyle w:val="Hyperlink"/>
@@ -2263,7 +2263,7 @@
             <w:noProof/>
             <w:webHidden/>
           </w:rPr>
-          <w:instrText xml:space="preserve"> PAGEREF _Toc236790547 \h </w:instrText>
+          <w:instrText xml:space="preserve"> PAGEREF _Toc239422393 \h </w:instrText>
         </w:r>
         <w:r>
           <w:rPr>
@@ -2310,7 +2310,7 @@
           <w14:ligatures w14:val="standardContextual"/>
         </w:rPr>
       </w:pPr>
-      <w:hyperlink w:anchor="_Toc236790548" w:history="1">
+      <w:hyperlink w:anchor="_Toc239422394" w:history="1">
         <w:r>
           <w:rPr>
             <w:rStyle w:val="Hyperlink"/>
@@ -2347,7 +2347,7 @@
             <w:noProof/>
             <w:webHidden/>
           </w:rPr>
-          <w:instrText xml:space="preserve"> PAGEREF _Toc236790548 \h </w:instrText>
+          <w:instrText xml:space="preserve"> PAGEREF _Toc239422394 \h </w:instrText>
         </w:r>
         <w:r>
           <w:rPr>
@@ -2394,7 +2394,7 @@
           <w14:ligatures w14:val="standardContextual"/>
         </w:rPr>
       </w:pPr>
-      <w:hyperlink w:anchor="_Toc236790549" w:history="1">
+      <w:hyperlink w:anchor="_Toc239422395" w:history="1">
         <w:r>
           <w:rPr>
             <w:rStyle w:val="Hyperlink"/>
@@ -2422,7 +2422,7 @@
             <w:noProof/>
             <w:webHidden/>
           </w:rPr>
-          <w:instrText xml:space="preserve"> PAGEREF _Toc236790549 \h </w:instrText>
+          <w:instrText xml:space="preserve"> PAGEREF _Toc239422395 \h </w:instrText>
         </w:r>
         <w:r>
           <w:rPr>
@@ -2469,7 +2469,7 @@
           <w14:ligatures w14:val="standardContextual"/>
         </w:rPr>
       </w:pPr>
-      <w:hyperlink w:anchor="_Toc236790550" w:history="1">
+      <w:hyperlink w:anchor="_Toc239422396" w:history="1">
         <w:r>
           <w:rPr>
             <w:rStyle w:val="Hyperlink"/>
@@ -2497,7 +2497,7 @@
             <w:noProof/>
             <w:webHidden/>
           </w:rPr>
-          <w:instrText xml:space="preserve"> PAGEREF _Toc236790550 \h </w:instrText>
+          <w:instrText xml:space="preserve"> PAGEREF _Toc239422396 \h </w:instrText>
         </w:r>
         <w:r>
           <w:rPr>
@@ -2544,7 +2544,7 @@
           <w14:ligatures w14:val="standardContextual"/>
         </w:rPr>
       </w:pPr>
-      <w:hyperlink w:anchor="_Toc236790551" w:history="1">
+      <w:hyperlink w:anchor="_Toc239422397" w:history="1">
         <w:r>
           <w:rPr>
             <w:rStyle w:val="Hyperlink"/>
@@ -2572,7 +2572,7 @@
             <w:noProof/>
             <w:webHidden/>
           </w:rPr>
-          <w:instrText xml:space="preserve"> PAGEREF _Toc236790551 \h </w:instrText>
+          <w:instrText xml:space="preserve"> PAGEREF _Toc239422397 \h </w:instrText>
         </w:r>
         <w:r>
           <w:rPr>
@@ -2619,7 +2619,7 @@
           <w14:ligatures w14:val="standardContextual"/>
         </w:rPr>
       </w:pPr>
-      <w:hyperlink w:anchor="_Toc236790552" w:history="1">
+      <w:hyperlink w:anchor="_Toc239422398" w:history="1">
         <w:r>
           <w:rPr>
             <w:rStyle w:val="Hyperlink"/>
@@ -2647,7 +2647,7 @@
             <w:noProof/>
             <w:webHidden/>
           </w:rPr>
-          <w:instrText xml:space="preserve"> PAGEREF _Toc236790552 \h </w:instrText>
+          <w:instrText xml:space="preserve"> PAGEREF _Toc239422398 \h </w:instrText>
         </w:r>
         <w:r>
           <w:rPr>
@@ -2694,7 +2694,7 @@
           <w14:ligatures w14:val="standardContextual"/>
         </w:rPr>
       </w:pPr>
-      <w:hyperlink w:anchor="_Toc236790553" w:history="1">
+      <w:hyperlink w:anchor="_Toc239422399" w:history="1">
         <w:r>
           <w:rPr>
             <w:rStyle w:val="Hyperlink"/>
@@ -2731,7 +2731,7 @@
             <w:noProof/>
             <w:webHidden/>
           </w:rPr>
-          <w:instrText xml:space="preserve"> PAGEREF _Toc236790553 \h </w:instrText>
+          <w:instrText xml:space="preserve"> PAGEREF _Toc239422399 \h </w:instrText>
         </w:r>
         <w:r>
           <w:rPr>
@@ -2778,7 +2778,7 @@
           <w14:ligatures w14:val="standardContextual"/>
         </w:rPr>
       </w:pPr>
-      <w:hyperlink w:anchor="_Toc236790554" w:history="1">
+      <w:hyperlink w:anchor="_Toc239422400" w:history="1">
         <w:r>
           <w:rPr>
             <w:rStyle w:val="Hyperlink"/>
@@ -2806,7 +2806,7 @@
             <w:noProof/>
             <w:webHidden/>
           </w:rPr>
-          <w:instrText xml:space="preserve"> PAGEREF _Toc236790554 \h </w:instrText>
+          <w:instrText xml:space="preserve"> PAGEREF _Toc239422400 \h </w:instrText>
         </w:r>
         <w:r>
           <w:rPr>
@@ -2853,7 +2853,7 @@
           <w14:ligatures w14:val="standardContextual"/>
         </w:rPr>
       </w:pPr>
-      <w:hyperlink w:anchor="_Toc236790555" w:history="1">
+      <w:hyperlink w:anchor="_Toc239422401" w:history="1">
         <w:r>
           <w:rPr>
             <w:rStyle w:val="Hyperlink"/>
@@ -2881,7 +2881,7 @@
             <w:noProof/>
             <w:webHidden/>
           </w:rPr>
-          <w:instrText xml:space="preserve"> PAGEREF _Toc236790555 \h </w:instrText>
+          <w:instrText xml:space="preserve"> PAGEREF _Toc239422401 \h </w:instrText>
         </w:r>
         <w:r>
           <w:rPr>
@@ -2928,7 +2928,7 @@
           <w14:ligatures w14:val="standardContextual"/>
         </w:rPr>
       </w:pPr>
-      <w:hyperlink w:anchor="_Toc236790556" w:history="1">
+      <w:hyperlink w:anchor="_Toc239422402" w:history="1">
         <w:r>
           <w:rPr>
             <w:rStyle w:val="Hyperlink"/>
@@ -2956,7 +2956,7 @@
             <w:noProof/>
             <w:webHidden/>
           </w:rPr>
-          <w:instrText xml:space="preserve"> PAGEREF _Toc236790556 \h </w:instrText>
+          <w:instrText xml:space="preserve"> PAGEREF _Toc239422402 \h </w:instrText>
         </w:r>
         <w:r>
           <w:rPr>
@@ -3003,7 +3003,7 @@
           <w14:ligatures w14:val="standardContextual"/>
         </w:rPr>
       </w:pPr>
-      <w:hyperlink w:anchor="_Toc236790557" w:history="1">
+      <w:hyperlink w:anchor="_Toc239422403" w:history="1">
         <w:r>
           <w:rPr>
             <w:rStyle w:val="Hyperlink"/>
@@ -3040,7 +3040,7 @@
             <w:noProof/>
             <w:webHidden/>
           </w:rPr>
-          <w:instrText xml:space="preserve"> PAGEREF _Toc236790557 \h </w:instrText>
+          <w:instrText xml:space="preserve"> PAGEREF _Toc239422403 \h </w:instrText>
         </w:r>
         <w:r>
           <w:rPr>
@@ -3087,7 +3087,7 @@
           <w14:ligatures w14:val="standardContextual"/>
         </w:rPr>
       </w:pPr>
-      <w:hyperlink w:anchor="_Toc236790558" w:history="1">
+      <w:hyperlink w:anchor="_Toc239422404" w:history="1">
         <w:r>
           <w:rPr>
             <w:rStyle w:val="Hyperlink"/>
@@ -3115,7 +3115,7 @@
             <w:noProof/>
             <w:webHidden/>
           </w:rPr>
-          <w:instrText xml:space="preserve"> PAGEREF _Toc236790558 \h </w:instrText>
+          <w:instrText xml:space="preserve"> PAGEREF _Toc239422404 \h </w:instrText>
         </w:r>
         <w:r>
           <w:rPr>
@@ -3162,7 +3162,7 @@
           <w14:ligatures w14:val="standardContextual"/>
         </w:rPr>
       </w:pPr>
-      <w:hyperlink w:anchor="_Toc236790559" w:history="1">
+      <w:hyperlink w:anchor="_Toc239422405" w:history="1">
         <w:r>
           <w:rPr>
             <w:rStyle w:val="Hyperlink"/>
@@ -3190,7 +3190,7 @@
             <w:noProof/>
             <w:webHidden/>
           </w:rPr>
-          <w:instrText xml:space="preserve"> PAGEREF _Toc236790559 \h </w:instrText>
+          <w:instrText xml:space="preserve"> PAGEREF _Toc239422405 \h </w:instrText>
         </w:r>
         <w:r>
           <w:rPr>
@@ -3237,7 +3237,7 @@
           <w14:ligatures w14:val="standardContextual"/>
         </w:rPr>
       </w:pPr>
-      <w:hyperlink w:anchor="_Toc236790560" w:history="1">
+      <w:hyperlink w:anchor="_Toc239422406" w:history="1">
         <w:r>
           <w:rPr>
             <w:rStyle w:val="Hyperlink"/>
@@ -3265,7 +3265,7 @@
             <w:noProof/>
             <w:webHidden/>
           </w:rPr>
-          <w:instrText xml:space="preserve"> PAGEREF _Toc236790560 \h </w:instrText>
+          <w:instrText xml:space="preserve"> PAGEREF _Toc239422406 \h </w:instrText>
         </w:r>
         <w:r>
           <w:rPr>
@@ -3312,7 +3312,7 @@
           <w14:ligatures w14:val="standardContextual"/>
         </w:rPr>
       </w:pPr>
-      <w:hyperlink w:anchor="_Toc236790561" w:history="1">
+      <w:hyperlink w:anchor="_Toc239422407" w:history="1">
         <w:r>
           <w:rPr>
             <w:rStyle w:val="Hyperlink"/>
@@ -3340,7 +3340,7 @@
             <w:noProof/>
             <w:webHidden/>
           </w:rPr>
-          <w:instrText xml:space="preserve"> PAGEREF _Toc236790561 \h </w:instrText>
+          <w:instrText xml:space="preserve"> PAGEREF _Toc239422407 \h </w:instrText>
         </w:r>
         <w:r>
           <w:rPr>
@@ -3387,7 +3387,7 @@
           <w14:ligatures w14:val="standardContextual"/>
         </w:rPr>
       </w:pPr>
-      <w:hyperlink w:anchor="_Toc236790562" w:history="1">
+      <w:hyperlink w:anchor="_Toc239422408" w:history="1">
         <w:r>
           <w:rPr>
             <w:rStyle w:val="Hyperlink"/>
@@ -3415,7 +3415,7 @@
             <w:noProof/>
             <w:webHidden/>
           </w:rPr>
-          <w:instrText xml:space="preserve"> PAGEREF _Toc236790562 \h </w:instrText>
+          <w:instrText xml:space="preserve"> PAGEREF _Toc239422408 \h </w:instrText>
         </w:r>
         <w:r>
           <w:rPr>
@@ -3462,7 +3462,7 @@
           <w14:ligatures w14:val="standardContextual"/>
         </w:rPr>
       </w:pPr>
-      <w:hyperlink w:anchor="_Toc236790563" w:history="1">
+      <w:hyperlink w:anchor="_Toc239422409" w:history="1">
         <w:r>
           <w:rPr>
             <w:rStyle w:val="Hyperlink"/>
@@ -3490,7 +3490,7 @@
             <w:noProof/>
             <w:webHidden/>
           </w:rPr>
-          <w:instrText xml:space="preserve"> PAGEREF _Toc236790563 \h </w:instrText>
+          <w:instrText xml:space="preserve"> PAGEREF _Toc239422409 \h </w:instrText>
         </w:r>
         <w:r>
           <w:rPr>
@@ -3537,7 +3537,7 @@
           <w14:ligatures w14:val="standardContextual"/>
         </w:rPr>
       </w:pPr>
-      <w:hyperlink w:anchor="_Toc236790564" w:history="1">
+      <w:hyperlink w:anchor="_Toc239422410" w:history="1">
         <w:r>
           <w:rPr>
             <w:rStyle w:val="Hyperlink"/>
@@ -3574,7 +3574,7 @@
             <w:noProof/>
             <w:webHidden/>
           </w:rPr>
-          <w:instrText xml:space="preserve"> PAGEREF _Toc236790564 \h </w:instrText>
+          <w:instrText xml:space="preserve"> PAGEREF _Toc239422410 \h </w:instrText>
         </w:r>
         <w:r>
           <w:rPr>
@@ -3621,7 +3621,7 @@
           <w14:ligatures w14:val="standardContextual"/>
         </w:rPr>
       </w:pPr>
-      <w:hyperlink w:anchor="_Toc236790565" w:history="1">
+      <w:hyperlink w:anchor="_Toc239422411" w:history="1">
         <w:r>
           <w:rPr>
             <w:rStyle w:val="Hyperlink"/>
@@ -3649,7 +3649,7 @@
             <w:noProof/>
             <w:webHidden/>
           </w:rPr>
-          <w:instrText xml:space="preserve"> PAGEREF _Toc236790565 \h </w:instrText>
+          <w:instrText xml:space="preserve"> PAGEREF _Toc239422411 \h </w:instrText>
         </w:r>
         <w:r>
           <w:rPr>
@@ -3696,7 +3696,7 @@
           <w14:ligatures w14:val="standardContextual"/>
         </w:rPr>
       </w:pPr>
-      <w:hyperlink w:anchor="_Toc236790566" w:history="1">
+      <w:hyperlink w:anchor="_Toc239422412" w:history="1">
         <w:r>
           <w:rPr>
             <w:rStyle w:val="Hyperlink"/>
@@ -3724,7 +3724,7 @@
             <w:noProof/>
             <w:webHidden/>
           </w:rPr>
-          <w:instrText xml:space="preserve"> PAGEREF _Toc236790566 \h </w:instrText>
+          <w:instrText xml:space="preserve"> PAGEREF _Toc239422412 \h </w:instrText>
         </w:r>
         <w:r>
           <w:rPr>
@@ -3771,7 +3771,7 @@
           <w14:ligatures w14:val="standardContextual"/>
         </w:rPr>
       </w:pPr>
-      <w:hyperlink w:anchor="_Toc236790567" w:history="1">
+      <w:hyperlink w:anchor="_Toc239422413" w:history="1">
         <w:r>
           <w:rPr>
             <w:rStyle w:val="Hyperlink"/>
@@ -3808,7 +3808,7 @@
             <w:noProof/>
             <w:webHidden/>
           </w:rPr>
-          <w:instrText xml:space="preserve"> PAGEREF _Toc236790567 \h </w:instrText>
+          <w:instrText xml:space="preserve"> PAGEREF _Toc239422413 \h </w:instrText>
         </w:r>
         <w:r>
           <w:rPr>
@@ -3855,7 +3855,7 @@
           <w14:ligatures w14:val="standardContextual"/>
         </w:rPr>
       </w:pPr>
-      <w:hyperlink w:anchor="_Toc236790568" w:history="1">
+      <w:hyperlink w:anchor="_Toc239422414" w:history="1">
         <w:r>
           <w:rPr>
             <w:rStyle w:val="Hyperlink"/>
@@ -3883,7 +3883,7 @@
             <w:noProof/>
             <w:webHidden/>
           </w:rPr>
-          <w:instrText xml:space="preserve"> PAGEREF _Toc236790568 \h </w:instrText>
+          <w:instrText xml:space="preserve"> PAGEREF _Toc239422414 \h </w:instrText>
         </w:r>
         <w:r>
           <w:rPr>
@@ -3903,7 +3903,7 @@
             <w:noProof/>
             <w:webHidden/>
           </w:rPr>
-          <w:t>32</w:t>
+          <w:t>33</w:t>
         </w:r>
         <w:r>
           <w:rPr>
@@ -3930,7 +3930,7 @@
           <w14:ligatures w14:val="standardContextual"/>
         </w:rPr>
       </w:pPr>
-      <w:hyperlink w:anchor="_Toc236790569" w:history="1">
+      <w:hyperlink w:anchor="_Toc239422415" w:history="1">
         <w:r>
           <w:rPr>
             <w:rStyle w:val="Hyperlink"/>
@@ -3967,7 +3967,7 @@
             <w:noProof/>
             <w:webHidden/>
           </w:rPr>
-          <w:instrText xml:space="preserve"> PAGEREF _Toc236790569 \h </w:instrText>
+          <w:instrText xml:space="preserve"> PAGEREF _Toc239422415 \h </w:instrText>
         </w:r>
         <w:r>
           <w:rPr>
@@ -4014,7 +4014,7 @@
           <w14:ligatures w14:val="standardContextual"/>
         </w:rPr>
       </w:pPr>
-      <w:hyperlink w:anchor="_Toc236790570" w:history="1">
+      <w:hyperlink w:anchor="_Toc239422416" w:history="1">
         <w:r>
           <w:rPr>
             <w:rStyle w:val="Hyperlink"/>
@@ -4042,7 +4042,7 @@
             <w:noProof/>
             <w:webHidden/>
           </w:rPr>
-          <w:instrText xml:space="preserve"> PAGEREF _Toc236790570 \h </w:instrText>
+          <w:instrText xml:space="preserve"> PAGEREF _Toc239422416 \h </w:instrText>
         </w:r>
         <w:r>
           <w:rPr>
@@ -4089,7 +4089,7 @@
           <w14:ligatures w14:val="standardContextual"/>
         </w:rPr>
       </w:pPr>
-      <w:hyperlink w:anchor="_Toc236790571" w:history="1">
+      <w:hyperlink w:anchor="_Toc239422417" w:history="1">
         <w:r>
           <w:rPr>
             <w:rStyle w:val="Hyperlink"/>
@@ -4117,7 +4117,7 @@
             <w:noProof/>
             <w:webHidden/>
           </w:rPr>
-          <w:instrText xml:space="preserve"> PAGEREF _Toc236790571 \h </w:instrText>
+          <w:instrText xml:space="preserve"> PAGEREF _Toc239422417 \h </w:instrText>
         </w:r>
         <w:r>
           <w:rPr>
@@ -4164,7 +4164,7 @@
           <w14:ligatures w14:val="standardContextual"/>
         </w:rPr>
       </w:pPr>
-      <w:hyperlink w:anchor="_Toc236790572" w:history="1">
+      <w:hyperlink w:anchor="_Toc239422418" w:history="1">
         <w:r>
           <w:rPr>
             <w:rStyle w:val="Hyperlink"/>
@@ -4192,7 +4192,7 @@
             <w:noProof/>
             <w:webHidden/>
           </w:rPr>
-          <w:instrText xml:space="preserve"> PAGEREF _Toc236790572 \h </w:instrText>
+          <w:instrText xml:space="preserve"> PAGEREF _Toc239422418 \h </w:instrText>
         </w:r>
         <w:r>
           <w:rPr>
@@ -4239,7 +4239,7 @@
           <w14:ligatures w14:val="standardContextual"/>
         </w:rPr>
       </w:pPr>
-      <w:hyperlink w:anchor="_Toc236790573" w:history="1">
+      <w:hyperlink w:anchor="_Toc239422419" w:history="1">
         <w:r>
           <w:rPr>
             <w:rStyle w:val="Hyperlink"/>
@@ -4267,7 +4267,7 @@
             <w:noProof/>
             <w:webHidden/>
           </w:rPr>
-          <w:instrText xml:space="preserve"> PAGEREF _Toc236790573 \h </w:instrText>
+          <w:instrText xml:space="preserve"> PAGEREF _Toc239422419 \h </w:instrText>
         </w:r>
         <w:r>
           <w:rPr>
@@ -4314,7 +4314,7 @@
           <w14:ligatures w14:val="standardContextual"/>
         </w:rPr>
       </w:pPr>
-      <w:hyperlink w:anchor="_Toc236790574" w:history="1">
+      <w:hyperlink w:anchor="_Toc239422420" w:history="1">
         <w:r>
           <w:rPr>
             <w:rStyle w:val="Hyperlink"/>
@@ -4342,7 +4342,7 @@
             <w:noProof/>
             <w:webHidden/>
           </w:rPr>
-          <w:instrText xml:space="preserve"> PAGEREF _Toc236790574 \h </w:instrText>
+          <w:instrText xml:space="preserve"> PAGEREF _Toc239422420 \h </w:instrText>
         </w:r>
         <w:r>
           <w:rPr>
@@ -4389,7 +4389,7 @@
           <w14:ligatures w14:val="standardContextual"/>
         </w:rPr>
       </w:pPr>
-      <w:hyperlink w:anchor="_Toc236790575" w:history="1">
+      <w:hyperlink w:anchor="_Toc239422421" w:history="1">
         <w:r>
           <w:rPr>
             <w:rStyle w:val="Hyperlink"/>
@@ -4417,7 +4417,7 @@
             <w:noProof/>
             <w:webHidden/>
           </w:rPr>
-          <w:instrText xml:space="preserve"> PAGEREF _Toc236790575 \h </w:instrText>
+          <w:instrText xml:space="preserve"> PAGEREF _Toc239422421 \h </w:instrText>
         </w:r>
         <w:r>
           <w:rPr>
@@ -4464,7 +4464,7 @@
           <w14:ligatures w14:val="standardContextual"/>
         </w:rPr>
       </w:pPr>
-      <w:hyperlink w:anchor="_Toc236790576" w:history="1">
+      <w:hyperlink w:anchor="_Toc239422422" w:history="1">
         <w:r>
           <w:rPr>
             <w:rStyle w:val="Hyperlink"/>
@@ -4501,7 +4501,7 @@
             <w:noProof/>
             <w:webHidden/>
           </w:rPr>
-          <w:instrText xml:space="preserve"> PAGEREF _Toc236790576 \h </w:instrText>
+          <w:instrText xml:space="preserve"> PAGEREF _Toc239422422 \h </w:instrText>
         </w:r>
         <w:r>
           <w:rPr>
@@ -4548,7 +4548,7 @@
           <w14:ligatures w14:val="standardContextual"/>
         </w:rPr>
       </w:pPr>
-      <w:hyperlink w:anchor="_Toc236790577" w:history="1">
+      <w:hyperlink w:anchor="_Toc239422423" w:history="1">
         <w:r>
           <w:rPr>
             <w:rStyle w:val="Hyperlink"/>
@@ -4576,7 +4576,7 @@
             <w:noProof/>
             <w:webHidden/>
           </w:rPr>
-          <w:instrText xml:space="preserve"> PAGEREF _Toc236790577 \h </w:instrText>
+          <w:instrText xml:space="preserve"> PAGEREF _Toc239422423 \h </w:instrText>
         </w:r>
         <w:r>
           <w:rPr>
@@ -4623,7 +4623,7 @@
           <w14:ligatures w14:val="standardContextual"/>
         </w:rPr>
       </w:pPr>
-      <w:hyperlink w:anchor="_Toc236790578" w:history="1">
+      <w:hyperlink w:anchor="_Toc239422424" w:history="1">
         <w:r>
           <w:rPr>
             <w:rStyle w:val="Hyperlink"/>
@@ -4651,7 +4651,7 @@
             <w:noProof/>
             <w:webHidden/>
           </w:rPr>
-          <w:instrText xml:space="preserve"> PAGEREF _Toc236790578 \h </w:instrText>
+          <w:instrText xml:space="preserve"> PAGEREF _Toc239422424 \h </w:instrText>
         </w:r>
         <w:r>
           <w:rPr>
@@ -4698,7 +4698,7 @@
           <w14:ligatures w14:val="standardContextual"/>
         </w:rPr>
       </w:pPr>
-      <w:hyperlink w:anchor="_Toc236790579" w:history="1">
+      <w:hyperlink w:anchor="_Toc239422425" w:history="1">
         <w:r>
           <w:rPr>
             <w:rStyle w:val="Hyperlink"/>
@@ -4726,7 +4726,7 @@
             <w:noProof/>
             <w:webHidden/>
           </w:rPr>
-          <w:instrText xml:space="preserve"> PAGEREF _Toc236790579 \h </w:instrText>
+          <w:instrText xml:space="preserve"> PAGEREF _Toc239422425 \h </w:instrText>
         </w:r>
         <w:r>
           <w:rPr>
@@ -4773,7 +4773,7 @@
           <w14:ligatures w14:val="standardContextual"/>
         </w:rPr>
       </w:pPr>
-      <w:hyperlink w:anchor="_Toc236790580" w:history="1">
+      <w:hyperlink w:anchor="_Toc239422426" w:history="1">
         <w:r>
           <w:rPr>
             <w:rStyle w:val="Hyperlink"/>
@@ -4801,7 +4801,7 @@
             <w:noProof/>
             <w:webHidden/>
           </w:rPr>
-          <w:instrText xml:space="preserve"> PAGEREF _Toc236790580 \h </w:instrText>
+          <w:instrText xml:space="preserve"> PAGEREF _Toc239422426 \h </w:instrText>
         </w:r>
         <w:r>
           <w:rPr>
@@ -4882,7 +4882,7 @@
               <w:pStyle w:val="Heading1"/>
               <w:spacing w:before="0" w:line="252" w:lineRule="auto"/>
             </w:pPr>
-            <w:bookmarkStart w:id="0" w:name="_Toc236790525"/>
+            <w:bookmarkStart w:id="0" w:name="_Toc239422371"/>
             <w:r>
               <w:rPr>
                 <w:rFonts w:ascii="Segoe UI" w:eastAsia="Segoe UI" w:hAnsi="Segoe UI" w:cs="Segoe UI"/>
@@ -4917,7 +4917,7 @@
         </w:pBdr>
         <w:spacing w:before="300" w:after="100" w:line="276" w:lineRule="auto"/>
       </w:pPr>
-      <w:bookmarkStart w:id="1" w:name="_Toc236790526"/>
+      <w:bookmarkStart w:id="1" w:name="_Toc239422372"/>
       <w:r>
         <w:rPr>
           <w:rFonts w:ascii="Segoe UI Semibold" w:eastAsia="Segoe UI Semibold" w:hAnsi="Segoe UI Semibold" w:cs="Segoe UI Semibold"/>
@@ -5495,7 +5495,7 @@
         </w:pBdr>
         <w:spacing w:before="300" w:after="100" w:line="276" w:lineRule="auto"/>
       </w:pPr>
-      <w:bookmarkStart w:id="2" w:name="_Toc236790527"/>
+      <w:bookmarkStart w:id="2" w:name="_Toc239422373"/>
       <w:r>
         <w:rPr>
           <w:rFonts w:ascii="Segoe UI Semibold" w:eastAsia="Segoe UI Semibold" w:hAnsi="Segoe UI Semibold" w:cs="Segoe UI Semibold"/>
@@ -6536,7 +6536,7 @@
         </w:pBdr>
         <w:spacing w:before="300" w:after="100" w:line="276" w:lineRule="auto"/>
       </w:pPr>
-      <w:bookmarkStart w:id="3" w:name="_Toc236790528"/>
+      <w:bookmarkStart w:id="3" w:name="_Toc239422374"/>
       <w:r>
         <w:rPr>
           <w:rFonts w:ascii="Segoe UI Semibold" w:eastAsia="Segoe UI Semibold" w:hAnsi="Segoe UI Semibold" w:cs="Segoe UI Semibold"/>
@@ -7491,7 +7491,7 @@
               <w:pStyle w:val="Heading1"/>
               <w:spacing w:before="0" w:line="252" w:lineRule="auto"/>
             </w:pPr>
-            <w:bookmarkStart w:id="4" w:name="_Toc236790529"/>
+            <w:bookmarkStart w:id="4" w:name="_Toc239422375"/>
             <w:r>
               <w:rPr>
                 <w:rFonts w:ascii="Segoe UI" w:eastAsia="Segoe UI" w:hAnsi="Segoe UI" w:cs="Segoe UI"/>
@@ -7526,7 +7526,7 @@
         </w:pBdr>
         <w:spacing w:before="300" w:after="100" w:line="276" w:lineRule="auto"/>
       </w:pPr>
-      <w:bookmarkStart w:id="5" w:name="_Toc236790530"/>
+      <w:bookmarkStart w:id="5" w:name="_Toc239422376"/>
       <w:r>
         <w:rPr>
           <w:rFonts w:ascii="Segoe UI Semibold" w:eastAsia="Segoe UI Semibold" w:hAnsi="Segoe UI Semibold" w:cs="Segoe UI Semibold"/>
@@ -8321,7 +8321,7 @@
         </w:pBdr>
         <w:spacing w:before="300" w:after="100" w:line="276" w:lineRule="auto"/>
       </w:pPr>
-      <w:bookmarkStart w:id="6" w:name="_Toc236790531"/>
+      <w:bookmarkStart w:id="6" w:name="_Toc239422377"/>
       <w:r>
         <w:rPr>
           <w:rFonts w:ascii="Segoe UI Semibold" w:eastAsia="Segoe UI Semibold" w:hAnsi="Segoe UI Semibold" w:cs="Segoe UI Semibold"/>
@@ -8716,7 +8716,7 @@
         </w:pBdr>
         <w:spacing w:before="300" w:after="100" w:line="276" w:lineRule="auto"/>
       </w:pPr>
-      <w:bookmarkStart w:id="7" w:name="_Toc236790532"/>
+      <w:bookmarkStart w:id="7" w:name="_Toc239422378"/>
       <w:r>
         <w:rPr>
           <w:rFonts w:ascii="Segoe UI Semibold" w:eastAsia="Segoe UI Semibold" w:hAnsi="Segoe UI Semibold" w:cs="Segoe UI Semibold"/>
@@ -9163,17 +9163,122 @@
                 <w:sz w:val="16"/>
                 <w:shd w:val="clear" w:color="auto" w:fill="F1F5F9"/>
               </w:rPr>
-              <w:t>TEAM_LEFT</w:t>
-            </w:r>
-            <w:r>
-              <w:rPr>
-                <w:rFonts w:ascii="Segoe UI" w:eastAsia="Segoe UI" w:hAnsi="Segoe UI" w:cs="Segoe UI"/>
-                <w:b/>
-                <w:color w:val="0F172A"/>
-                <w:sz w:val="18"/>
-              </w:rPr>
-              <w:t xml:space="preserve"> / </w:t>
-            </w:r>
+              <w:t>DIRECT_TEAM</w:t>
+            </w:r>
+          </w:p>
+        </w:tc>
+        <w:tc>
+          <w:tcPr>
+            <w:tcW w:w="2520" w:type="dxa"/>
+            <w:tcBorders>
+              <w:top w:val="nil"/>
+              <w:left w:val="nil"/>
+              <w:bottom w:val="single" w:sz="4" w:space="0" w:color="E2E8F0"/>
+              <w:right w:val="nil"/>
+            </w:tcBorders>
+            <w:tcMar>
+              <w:top w:w="95" w:type="dxa"/>
+              <w:left w:w="130" w:type="dxa"/>
+              <w:bottom w:w="95" w:type="dxa"/>
+              <w:right w:w="130" w:type="dxa"/>
+            </w:tcMar>
+          </w:tcPr>
+          <w:p>
+            <w:pPr>
+              <w:spacing w:after="0" w:line="307" w:lineRule="auto"/>
+            </w:pPr>
+            <w:r>
+              <w:rPr>
+                <w:rFonts w:cs="Georgia"/>
+                <w:sz w:val="18"/>
+              </w:rPr>
+              <w:t>Buyer's sponsor (whole direct team volume)</w:t>
+            </w:r>
+          </w:p>
+        </w:tc>
+        <w:tc>
+          <w:tcPr>
+            <w:tcW w:w="2160" w:type="dxa"/>
+            <w:tcBorders>
+              <w:top w:val="nil"/>
+              <w:left w:val="nil"/>
+              <w:bottom w:val="single" w:sz="4" w:space="0" w:color="E2E8F0"/>
+              <w:right w:val="nil"/>
+            </w:tcBorders>
+            <w:tcMar>
+              <w:top w:w="95" w:type="dxa"/>
+              <w:left w:w="130" w:type="dxa"/>
+              <w:bottom w:w="95" w:type="dxa"/>
+              <w:right w:w="130" w:type="dxa"/>
+            </w:tcMar>
+          </w:tcPr>
+          <w:p>
+            <w:pPr>
+              <w:spacing w:after="0" w:line="307" w:lineRule="auto"/>
+            </w:pPr>
+            <w:r>
+              <w:rPr>
+                <w:rFonts w:cs="Georgia"/>
+                <w:sz w:val="18"/>
+              </w:rPr>
+              <w:t>0 or 1</w:t>
+            </w:r>
+          </w:p>
+        </w:tc>
+        <w:tc>
+          <w:tcPr>
+            <w:tcW w:w="2664" w:type="dxa"/>
+            <w:tcBorders>
+              <w:top w:val="nil"/>
+              <w:left w:val="nil"/>
+              <w:bottom w:val="single" w:sz="4" w:space="0" w:color="E2E8F0"/>
+              <w:right w:val="nil"/>
+            </w:tcBorders>
+            <w:tcMar>
+              <w:top w:w="95" w:type="dxa"/>
+              <w:left w:w="130" w:type="dxa"/>
+              <w:bottom w:w="95" w:type="dxa"/>
+              <w:right w:w="130" w:type="dxa"/>
+            </w:tcMar>
+          </w:tcPr>
+          <w:p>
+            <w:pPr>
+              <w:spacing w:after="0" w:line="307" w:lineRule="auto"/>
+            </w:pPr>
+            <w:r>
+              <w:rPr>
+                <w:rFonts w:cs="Georgia"/>
+                <w:sz w:val="18"/>
+              </w:rPr>
+              <w:t>Achievers qualification</w:t>
+            </w:r>
+          </w:p>
+        </w:tc>
+      </w:tr>
+      <w:tr>
+        <w:trPr>
+          <w:jc w:val="center"/>
+        </w:trPr>
+        <w:tc>
+          <w:tcPr>
+            <w:tcW w:w="2160" w:type="dxa"/>
+            <w:tcBorders>
+              <w:top w:val="nil"/>
+              <w:left w:val="nil"/>
+              <w:bottom w:val="single" w:sz="4" w:space="0" w:color="E2E8F0"/>
+              <w:right w:val="nil"/>
+            </w:tcBorders>
+            <w:tcMar>
+              <w:top w:w="95" w:type="dxa"/>
+              <w:left w:w="130" w:type="dxa"/>
+              <w:bottom w:w="95" w:type="dxa"/>
+              <w:right w:w="130" w:type="dxa"/>
+            </w:tcMar>
+          </w:tcPr>
+          <w:p>
+            <w:pPr>
+              <w:spacing w:after="0" w:line="307" w:lineRule="auto"/>
+            </w:pPr>
             <w:r>
               <w:rPr>
                 <w:rFonts w:ascii="Consolas" w:eastAsia="Consolas" w:hAnsi="Consolas" w:cs="Consolas"/>
@@ -9181,7 +9286,7 @@
                 <w:sz w:val="16"/>
                 <w:shd w:val="clear" w:color="auto" w:fill="F1F5F9"/>
               </w:rPr>
-              <w:t>TEAM_RIGHT</w:t>
+              <w:t>TEAM_LEFT / TEAM_RIGHT</w:t>
             </w:r>
           </w:p>
         </w:tc>
@@ -9487,7 +9592,7 @@
               <w:pStyle w:val="Heading1"/>
               <w:spacing w:before="0" w:line="252" w:lineRule="auto"/>
             </w:pPr>
-            <w:bookmarkStart w:id="8" w:name="_Toc236790533"/>
+            <w:bookmarkStart w:id="8" w:name="_Toc239422379"/>
             <w:r>
               <w:rPr>
                 <w:rFonts w:ascii="Segoe UI" w:eastAsia="Segoe UI" w:hAnsi="Segoe UI" w:cs="Segoe UI"/>
@@ -9522,7 +9627,7 @@
         </w:pBdr>
         <w:spacing w:before="300" w:after="100" w:line="276" w:lineRule="auto"/>
       </w:pPr>
-      <w:bookmarkStart w:id="9" w:name="_Toc236790534"/>
+      <w:bookmarkStart w:id="9" w:name="_Toc239422380"/>
       <w:r>
         <w:rPr>
           <w:rFonts w:ascii="Segoe UI Semibold" w:eastAsia="Segoe UI Semibold" w:hAnsi="Segoe UI Semibold" w:cs="Segoe UI Semibold"/>
@@ -9543,16 +9648,7 @@
           <w:color w:val="6D28D9"/>
           <w:sz w:val="18"/>
         </w:rPr>
-        <w:t>▪</w:t>
-      </w:r>
-      <w:r>
-        <w:rPr>
-          <w:rFonts w:ascii="Segoe UI" w:eastAsia="Segoe UI" w:hAnsi="Segoe UI" w:cs="Segoe UI"/>
-          <w:b/>
-          <w:color w:val="6D28D9"/>
-          <w:sz w:val="18"/>
-        </w:rPr>
-        <w:t xml:space="preserve">  </w:t>
+        <w:t xml:space="preserve">▪  </w:t>
       </w:r>
       <w:r>
         <w:rPr>
@@ -9612,16 +9708,7 @@
           <w:color w:val="6D28D9"/>
           <w:sz w:val="18"/>
         </w:rPr>
-        <w:t>▪</w:t>
-      </w:r>
-      <w:r>
-        <w:rPr>
-          <w:rFonts w:ascii="Segoe UI" w:eastAsia="Segoe UI" w:hAnsi="Segoe UI" w:cs="Segoe UI"/>
-          <w:b/>
-          <w:color w:val="6D28D9"/>
-          <w:sz w:val="18"/>
-        </w:rPr>
-        <w:t xml:space="preserve">  </w:t>
+        <w:t xml:space="preserve">▪  </w:t>
       </w:r>
       <w:r>
         <w:rPr>
@@ -9702,16 +9789,7 @@
           <w:color w:val="6D28D9"/>
           <w:sz w:val="18"/>
         </w:rPr>
-        <w:t>▪</w:t>
-      </w:r>
-      <w:r>
-        <w:rPr>
-          <w:rFonts w:ascii="Segoe UI" w:eastAsia="Segoe UI" w:hAnsi="Segoe UI" w:cs="Segoe UI"/>
-          <w:b/>
-          <w:color w:val="6D28D9"/>
-          <w:sz w:val="18"/>
-        </w:rPr>
-        <w:t xml:space="preserve">  </w:t>
+        <w:t xml:space="preserve">▪  </w:t>
       </w:r>
       <w:r>
         <w:rPr>
@@ -9755,16 +9833,7 @@
           <w:color w:val="6D28D9"/>
           <w:sz w:val="18"/>
         </w:rPr>
-        <w:t>▪</w:t>
-      </w:r>
-      <w:r>
-        <w:rPr>
-          <w:rFonts w:ascii="Segoe UI" w:eastAsia="Segoe UI" w:hAnsi="Segoe UI" w:cs="Segoe UI"/>
-          <w:b/>
-          <w:color w:val="6D28D9"/>
-          <w:sz w:val="18"/>
-        </w:rPr>
-        <w:t xml:space="preserve">  </w:t>
+        <w:t xml:space="preserve">▪  </w:t>
       </w:r>
       <w:r>
         <w:rPr>
@@ -9830,16 +9899,7 @@
           <w:color w:val="6D28D9"/>
           <w:sz w:val="18"/>
         </w:rPr>
-        <w:t>▪</w:t>
-      </w:r>
-      <w:r>
-        <w:rPr>
-          <w:rFonts w:ascii="Segoe UI" w:eastAsia="Segoe UI" w:hAnsi="Segoe UI" w:cs="Segoe UI"/>
-          <w:b/>
-          <w:color w:val="6D28D9"/>
-          <w:sz w:val="18"/>
-        </w:rPr>
-        <w:t xml:space="preserve">  </w:t>
+        <w:t xml:space="preserve">▪  </w:t>
       </w:r>
       <w:r>
         <w:rPr>
@@ -9860,16 +9920,7 @@
           <w:color w:val="6D28D9"/>
           <w:sz w:val="18"/>
         </w:rPr>
-        <w:t>▪</w:t>
-      </w:r>
-      <w:r>
-        <w:rPr>
-          <w:rFonts w:ascii="Segoe UI" w:eastAsia="Segoe UI" w:hAnsi="Segoe UI" w:cs="Segoe UI"/>
-          <w:b/>
-          <w:color w:val="6D28D9"/>
-          <w:sz w:val="18"/>
-        </w:rPr>
-        <w:t xml:space="preserve">  </w:t>
+        <w:t xml:space="preserve">▪  </w:t>
       </w:r>
       <w:r>
         <w:rPr>
@@ -9914,7 +9965,7 @@
         </w:pBdr>
         <w:spacing w:before="300" w:after="100" w:line="276" w:lineRule="auto"/>
       </w:pPr>
-      <w:bookmarkStart w:id="10" w:name="_Toc236790535"/>
+      <w:bookmarkStart w:id="10" w:name="_Toc239422381"/>
       <w:r>
         <w:rPr>
           <w:rFonts w:ascii="Segoe UI Semibold" w:eastAsia="Segoe UI Semibold" w:hAnsi="Segoe UI Semibold" w:cs="Segoe UI Semibold"/>
@@ -10390,7 +10441,7 @@
         </w:pBdr>
         <w:spacing w:before="300" w:after="100" w:line="276" w:lineRule="auto"/>
       </w:pPr>
-      <w:bookmarkStart w:id="11" w:name="_Toc236790536"/>
+      <w:bookmarkStart w:id="11" w:name="_Toc239422382"/>
       <w:r>
         <w:rPr>
           <w:rFonts w:ascii="Segoe UI Semibold" w:eastAsia="Segoe UI Semibold" w:hAnsi="Segoe UI Semibold" w:cs="Segoe UI Semibold"/>
@@ -11100,7 +11151,7 @@
         </w:pBdr>
         <w:spacing w:before="300" w:after="100" w:line="276" w:lineRule="auto"/>
       </w:pPr>
-      <w:bookmarkStart w:id="12" w:name="_Toc236790537"/>
+      <w:bookmarkStart w:id="12" w:name="_Toc239422383"/>
       <w:r>
         <w:rPr>
           <w:rFonts w:ascii="Segoe UI Semibold" w:eastAsia="Segoe UI Semibold" w:hAnsi="Segoe UI Semibold" w:cs="Segoe UI Semibold"/>
@@ -11784,7 +11835,7 @@
         </w:pBdr>
         <w:spacing w:before="300" w:after="100" w:line="276" w:lineRule="auto"/>
       </w:pPr>
-      <w:bookmarkStart w:id="13" w:name="_Toc236790538"/>
+      <w:bookmarkStart w:id="13" w:name="_Toc239422384"/>
       <w:r>
         <w:rPr>
           <w:rFonts w:ascii="Segoe UI Semibold" w:eastAsia="Segoe UI Semibold" w:hAnsi="Segoe UI Semibold" w:cs="Segoe UI Semibold"/>
@@ -11895,7 +11946,7 @@
                 <w:color w:val="E2E8F0"/>
                 <w:sz w:val="16"/>
               </w:rPr>
-              <w:t xml:space="preserve">  level_code    TEXT NOT NULL,      -- WH | MWH | L1 | L1_SPECIAL | L2 | L3</w:t>
+              <w:t xml:space="preserve">  level_code    TEXT NOT NULL,      -- WH | MWH | L1 | L1 | L2 | L3</w:t>
             </w:r>
           </w:p>
           <w:p>
@@ -11947,7 +11998,7 @@
                 <w:color w:val="E2E8F0"/>
                 <w:sz w:val="16"/>
               </w:rPr>
-              <w:t xml:space="preserve">  minus_limit   BIGINT NOT NULL DEFAULT 0,   -- MWH / L1 / L1_SPECIAL (paise)</w:t>
+              <w:t xml:space="preserve">  minus_limit   BIGINT NOT NULL DEFAULT 0,   -- MWH / L1 / L1 (paise)</w:t>
             </w:r>
           </w:p>
           <w:p>
@@ -11960,7 +12011,7 @@
                 <w:color w:val="E2E8F0"/>
                 <w:sz w:val="16"/>
               </w:rPr>
-              <w:t xml:space="preserve">  stock_limit   BIGINT NOT NULL DEFAULT 0,   -- L2 aur neeche (paise)</w:t>
+              <w:t xml:space="preserve">  stock_limit   BIGINT NOT NULL DEFAULT 0,   -- L2 aur L3 (paise)</w:t>
             </w:r>
           </w:p>
           <w:p>
@@ -11973,7 +12024,7 @@
                 <w:color w:val="E2E8F0"/>
                 <w:sz w:val="16"/>
               </w:rPr>
-              <w:t xml:space="preserve">  can_approve_funds BOOLEAN NOT NULL DEFAULT FALSE,  -- L1, L1_SPECIAL, MWH</w:t>
+              <w:t xml:space="preserve">  can_approve_funds BOOLEAN NOT NULL DEFAULT FALSE,  -- L1, MWH</w:t>
             </w:r>
           </w:p>
           <w:p>
@@ -12268,81 +12319,38 @@
                 <w:sz w:val="16"/>
                 <w:shd w:val="clear" w:color="auto" w:fill="F1F5F9"/>
               </w:rPr>
-              <w:t>MWH</w:t>
-            </w:r>
-            <w:r>
-              <w:rPr>
-                <w:rFonts w:ascii="Segoe UI" w:eastAsia="Segoe UI" w:hAnsi="Segoe UI" w:cs="Segoe UI"/>
+              <w:t>MWH, L1  (POSTPAID)</w:t>
+            </w:r>
+          </w:p>
+        </w:tc>
+        <w:tc>
+          <w:tcPr>
+            <w:tcW w:w="4104" w:type="dxa"/>
+            <w:tcBorders>
+              <w:top w:val="nil"/>
+              <w:left w:val="nil"/>
+              <w:bottom w:val="single" w:sz="4" w:space="0" w:color="E2E8F0"/>
+              <w:right w:val="nil"/>
+            </w:tcBorders>
+            <w:tcMar>
+              <w:top w:w="95" w:type="dxa"/>
+              <w:left w:w="130" w:type="dxa"/>
+              <w:bottom w:w="95" w:type="dxa"/>
+              <w:right w:w="130" w:type="dxa"/>
+            </w:tcMar>
+          </w:tcPr>
+          <w:p>
+            <w:pPr>
+              <w:spacing w:after="0" w:line="307" w:lineRule="auto"/>
+            </w:pPr>
+            <w:r>
+              <w:rPr>
+                <w:rFonts w:cs="Georgia"/>
                 <w:b/>
                 <w:color w:val="0F172A"/>
                 <w:sz w:val="18"/>
               </w:rPr>
-              <w:t xml:space="preserve">, </w:t>
-            </w:r>
-            <w:r>
-              <w:rPr>
-                <w:rFonts w:ascii="Consolas" w:eastAsia="Consolas" w:hAnsi="Consolas" w:cs="Consolas"/>
-                <w:color w:val="6D28D9"/>
-                <w:sz w:val="16"/>
-                <w:shd w:val="clear" w:color="auto" w:fill="F1F5F9"/>
-              </w:rPr>
-              <w:t>L1</w:t>
-            </w:r>
-            <w:r>
-              <w:rPr>
-                <w:rFonts w:ascii="Segoe UI" w:eastAsia="Segoe UI" w:hAnsi="Segoe UI" w:cs="Segoe UI"/>
-                <w:b/>
-                <w:color w:val="0F172A"/>
-                <w:sz w:val="18"/>
-              </w:rPr>
-              <w:t xml:space="preserve">, </w:t>
-            </w:r>
-            <w:r>
-              <w:rPr>
-                <w:rFonts w:ascii="Consolas" w:eastAsia="Consolas" w:hAnsi="Consolas" w:cs="Consolas"/>
-                <w:color w:val="6D28D9"/>
-                <w:sz w:val="16"/>
-                <w:shd w:val="clear" w:color="auto" w:fill="F1F5F9"/>
-              </w:rPr>
-              <w:t>L1_SPECIAL</w:t>
-            </w:r>
-          </w:p>
-        </w:tc>
-        <w:tc>
-          <w:tcPr>
-            <w:tcW w:w="4104" w:type="dxa"/>
-            <w:tcBorders>
-              <w:top w:val="nil"/>
-              <w:left w:val="nil"/>
-              <w:bottom w:val="single" w:sz="4" w:space="0" w:color="E2E8F0"/>
-              <w:right w:val="nil"/>
-            </w:tcBorders>
-            <w:tcMar>
-              <w:top w:w="95" w:type="dxa"/>
-              <w:left w:w="130" w:type="dxa"/>
-              <w:bottom w:w="95" w:type="dxa"/>
-              <w:right w:w="130" w:type="dxa"/>
-            </w:tcMar>
-          </w:tcPr>
-          <w:p>
-            <w:pPr>
-              <w:spacing w:after="0" w:line="307" w:lineRule="auto"/>
-            </w:pPr>
-            <w:r>
-              <w:rPr>
-                <w:rFonts w:cs="Georgia"/>
-                <w:b/>
-                <w:color w:val="0F172A"/>
-                <w:sz w:val="18"/>
-              </w:rPr>
-              <w:t>minus_limit</w:t>
-            </w:r>
-            <w:r>
-              <w:rPr>
-                <w:rFonts w:cs="Georgia"/>
-                <w:sz w:val="18"/>
-              </w:rPr>
-              <w:t xml:space="preserve"> — main wallet itna negative ja sakta</w:t>
+              <w:t>credit_limit / minus_limit — main wallet itna negative ja sakta hai. Per-franchise, Admin set karta hai.</w:t>
             </w:r>
           </w:p>
         </w:tc>
@@ -12408,64 +12416,39 @@
                 <w:sz w:val="16"/>
                 <w:shd w:val="clear" w:color="auto" w:fill="F1F5F9"/>
               </w:rPr>
-              <w:t>L2</w:t>
-            </w:r>
-            <w:r>
-              <w:rPr>
-                <w:rFonts w:ascii="Segoe UI" w:eastAsia="Segoe UI" w:hAnsi="Segoe UI" w:cs="Segoe UI"/>
+              <w:t>L2, L3  (PREPAID)</w:t>
+            </w:r>
+          </w:p>
+        </w:tc>
+        <w:tc>
+          <w:tcPr>
+            <w:tcW w:w="4104" w:type="dxa"/>
+            <w:tcBorders>
+              <w:top w:val="nil"/>
+              <w:left w:val="nil"/>
+              <w:bottom w:val="single" w:sz="4" w:space="0" w:color="E2E8F0"/>
+              <w:right w:val="nil"/>
+            </w:tcBorders>
+            <w:shd w:val="clear" w:color="auto" w:fill="F8FAFC"/>
+            <w:tcMar>
+              <w:top w:w="95" w:type="dxa"/>
+              <w:left w:w="130" w:type="dxa"/>
+              <w:bottom w:w="95" w:type="dxa"/>
+              <w:right w:w="130" w:type="dxa"/>
+            </w:tcMar>
+          </w:tcPr>
+          <w:p>
+            <w:pPr>
+              <w:spacing w:after="0" w:line="307" w:lineRule="auto"/>
+            </w:pPr>
+            <w:r>
+              <w:rPr>
+                <w:rFonts w:cs="Georgia"/>
                 <w:b/>
                 <w:color w:val="0F172A"/>
                 <w:sz w:val="18"/>
               </w:rPr>
-              <w:t xml:space="preserve"> aur neeche</w:t>
-            </w:r>
-          </w:p>
-        </w:tc>
-        <w:tc>
-          <w:tcPr>
-            <w:tcW w:w="4104" w:type="dxa"/>
-            <w:tcBorders>
-              <w:top w:val="nil"/>
-              <w:left w:val="nil"/>
-              <w:bottom w:val="single" w:sz="4" w:space="0" w:color="E2E8F0"/>
-              <w:right w:val="nil"/>
-            </w:tcBorders>
-            <w:shd w:val="clear" w:color="auto" w:fill="F8FAFC"/>
-            <w:tcMar>
-              <w:top w:w="95" w:type="dxa"/>
-              <w:left w:w="130" w:type="dxa"/>
-              <w:bottom w:w="95" w:type="dxa"/>
-              <w:right w:w="130" w:type="dxa"/>
-            </w:tcMar>
-          </w:tcPr>
-          <w:p>
-            <w:pPr>
-              <w:spacing w:after="0" w:line="307" w:lineRule="auto"/>
-            </w:pPr>
-            <w:r>
-              <w:rPr>
-                <w:rFonts w:cs="Georgia"/>
-                <w:b/>
-                <w:color w:val="0F172A"/>
-                <w:sz w:val="18"/>
-              </w:rPr>
-              <w:t>stock_limit</w:t>
-            </w:r>
-            <w:r>
-              <w:rPr>
-                <w:rFonts w:cs="Georgia"/>
-                <w:sz w:val="18"/>
-              </w:rPr>
-              <w:t xml:space="preserve"> — stock is se neeche gaya to </w:t>
-            </w:r>
-            <w:r>
-              <w:rPr>
-                <w:rFonts w:cs="Georgia"/>
-                <w:b/>
-                <w:color w:val="0F172A"/>
-                <w:sz w:val="18"/>
-              </w:rPr>
-              <w:t>billing block</w:t>
+              <w:t>stock_limit — stock is se neeche gaya to billing block. Koi credit limit nahi; pehle wallet recharge.</w:t>
             </w:r>
           </w:p>
         </w:tc>
@@ -12556,7 +12539,7 @@
                 <w:spacing w:val="35"/>
                 <w:sz w:val="15"/>
               </w:rPr>
-              <w:t>L1-SPECIAL — ALAG FLAG, ALAG BEHAVIOUR</w:t>
+              <w:t>POSTPAID vs PREPAID — DO ALAG CAPABILITY SETS</w:t>
             </w:r>
           </w:p>
           <w:p>
@@ -12570,42 +12553,7 @@
                 <w:sz w:val="18"/>
                 <w:shd w:val="clear" w:color="auto" w:fill="F1F5F9"/>
               </w:rPr>
-              <w:t>L1_SPECIAL</w:t>
-            </w:r>
-            <w:r>
-              <w:rPr>
-                <w:rFonts w:cs="Georgia"/>
-              </w:rPr>
-              <w:t xml:space="preserve"> ka </w:t>
-            </w:r>
-            <w:r>
-              <w:rPr>
-                <w:rFonts w:cs="Georgia"/>
-                <w:b/>
-                <w:color w:val="0F172A"/>
-              </w:rPr>
-              <w:t>koi limit nahi</w:t>
-            </w:r>
-            <w:r>
-              <w:rPr>
-                <w:rFonts w:cs="Georgia"/>
-              </w:rPr>
-              <w:t xml:space="preserve"> — L2 jaisa chalta hai (pehle fund, phir stock). Par </w:t>
-            </w:r>
-            <w:r>
-              <w:rPr>
-                <w:rFonts w:ascii="Consolas" w:eastAsia="Consolas" w:hAnsi="Consolas" w:cs="Consolas"/>
-                <w:color w:val="6D28D9"/>
-                <w:sz w:val="18"/>
-                <w:shd w:val="clear" w:color="auto" w:fill="F1F5F9"/>
-              </w:rPr>
-              <w:t>can_approve_funds = TRUE</w:t>
-            </w:r>
-            <w:r>
-              <w:rPr>
-                <w:rFonts w:cs="Georgia"/>
-              </w:rPr>
-              <w:t xml:space="preserve"> — ye doosron ki fund request approve kar sakta hai, L1 aur MWH ki tarah.</w:t>
+              <w:t>L1_SPECIAL level poori tarah hata diya gaya hai. Ab sirf MWH, L1, L2, L3 — koi special variant nahi.</w:t>
             </w:r>
           </w:p>
           <w:p>
@@ -12616,21 +12564,40 @@
               <w:rPr>
                 <w:rFonts w:cs="Georgia"/>
               </w:rPr>
-              <w:t xml:space="preserve">Isliye level ek </w:t>
-            </w:r>
-            <w:r>
-              <w:rPr>
-                <w:rFonts w:cs="Georgia"/>
-                <w:b/>
-                <w:color w:val="0F172A"/>
-              </w:rPr>
-              <w:t>`level_code` + capability flags</w:t>
-            </w:r>
-            <w:r>
-              <w:rPr>
-                <w:rFonts w:cs="Georgia"/>
-              </w:rPr>
-              <w:t xml:space="preserve"> ka combination hai, hardcoded enum branching nahi. Kal naya level (L4) aaya to sirf ek row add hogi.</w:t>
+              <w:t>L1 = POSTPAID: credit_limit tak bina payment ke stock utha sakta hai; main wallet minus/plus hota rehta hai. Limit per-franchise hai, Admin set karta hai.</w:t>
+            </w:r>
+          </w:p>
+          <w:p>
+            <w:pPr>
+              <w:spacing w:after="100"/>
+            </w:pPr>
+            <w:r>
+              <w:rPr>
+                <w:rFonts w:cs="Georgia"/>
+              </w:rPr>
+              <w:t>L2 aur L3 = PREPAID: koi credit limit nahi. Pehle wallet recharge, phir stock. Billing ka paisa wallet me jama hota hai — ye upar ki den-dari (liability) hai, aur commission usi me adjust hota hai.</w:t>
+            </w:r>
+          </w:p>
+          <w:p>
+            <w:pPr>
+              <w:spacing w:after="100"/>
+            </w:pPr>
+            <w:r>
+              <w:rPr>
+                <w:rFonts w:cs="Georgia"/>
+              </w:rPr>
+              <w:t>Fund request approve kar sakte hain: sirf L1 aur MWH (can_approve_funds = TRUE).</w:t>
+            </w:r>
+          </w:p>
+          <w:p>
+            <w:pPr>
+              <w:spacing w:after="100"/>
+            </w:pPr>
+            <w:r>
+              <w:rPr>
+                <w:rFonts w:cs="Georgia"/>
+              </w:rPr>
+              <w:t>Levels ab bhi `level_code` + capability flags ka combination hain, hardcoded enum branching nahi. Kal naya level (L4) aaya to sirf ek row add hogi.</w:t>
             </w:r>
           </w:p>
         </w:tc>
@@ -12759,7 +12726,7 @@
         </w:pBdr>
         <w:spacing w:before="300" w:after="100" w:line="276" w:lineRule="auto"/>
       </w:pPr>
-      <w:bookmarkStart w:id="14" w:name="_Toc236790539"/>
+      <w:bookmarkStart w:id="14" w:name="_Toc239422385"/>
       <w:r>
         <w:rPr>
           <w:rFonts w:ascii="Segoe UI Semibold" w:eastAsia="Segoe UI Semibold" w:hAnsi="Segoe UI Semibold" w:cs="Segoe UI Semibold"/>
@@ -12784,7 +12751,7 @@
       </w:tblPr>
       <w:tblGrid>
         <w:gridCol w:w="2664"/>
-        <w:gridCol w:w="2232"/>
+        <w:gridCol w:w="2247"/>
         <w:gridCol w:w="4608"/>
       </w:tblGrid>
       <w:tr>
@@ -12820,7 +12787,7 @@
                 <w:spacing w:val="25"/>
                 <w:sz w:val="15"/>
               </w:rPr>
-              <w:t>HOP</w:t>
+              <w:t>PATH</w:t>
             </w:r>
           </w:p>
         </w:tc>
@@ -12853,7 +12820,7 @@
                 <w:spacing w:val="25"/>
                 <w:sz w:val="15"/>
               </w:rPr>
-              <w:t>PRICE</w:t>
+              <w:t>HOPS</w:t>
             </w:r>
           </w:p>
         </w:tc>
@@ -12886,7 +12853,7 @@
                 <w:spacing w:val="25"/>
                 <w:sz w:val="15"/>
               </w:rPr>
-              <w:t>MARGIN</w:t>
+              <w:t>NOTE</w:t>
             </w:r>
           </w:p>
         </w:tc>
@@ -12922,7 +12889,7 @@
                 <w:color w:val="0F172A"/>
                 <w:sz w:val="18"/>
               </w:rPr>
-              <w:t>WH → L1</w:t>
+              <w:t>Raasta 1</w:t>
             </w:r>
           </w:p>
         </w:tc>
@@ -12951,14 +12918,7 @@
                 <w:rFonts w:cs="Georgia"/>
                 <w:sz w:val="18"/>
               </w:rPr>
-              <w:t>₹</w:t>
-            </w:r>
-            <w:r>
-              <w:rPr>
-                <w:rFonts w:cs="Georgia"/>
-                <w:sz w:val="18"/>
-              </w:rPr>
-              <w:t>700</w:t>
+              <w:t>WH → (MWH) → L1 → L2 → member</w:t>
             </w:r>
           </w:p>
         </w:tc>
@@ -12987,7 +12947,7 @@
                 <w:rFonts w:cs="Georgia"/>
                 <w:sz w:val="18"/>
               </w:rPr>
-              <w:t>—</w:t>
+              <w:t>L3 is chain me aata hi nahi</w:t>
             </w:r>
           </w:p>
         </w:tc>
@@ -13024,7 +12984,7 @@
                 <w:color w:val="0F172A"/>
                 <w:sz w:val="18"/>
               </w:rPr>
-              <w:t>L1 → L2</w:t>
+              <w:t>Raasta 2</w:t>
             </w:r>
           </w:p>
         </w:tc>
@@ -13054,14 +13014,7 @@
                 <w:rFonts w:cs="Georgia"/>
                 <w:sz w:val="18"/>
               </w:rPr>
-              <w:t>₹</w:t>
-            </w:r>
-            <w:r>
-              <w:rPr>
-                <w:rFonts w:cs="Georgia"/>
-                <w:sz w:val="18"/>
-              </w:rPr>
-              <w:t>725</w:t>
+              <w:t>WH → (MWH) → L1 → L3 → member</w:t>
             </w:r>
           </w:p>
         </w:tc>
@@ -13091,7 +13044,7 @@
                 <w:rFonts w:cs="Georgia"/>
                 <w:sz w:val="18"/>
               </w:rPr>
-              <w:t>L1 = ₹25</w:t>
+              <w:t>L2 is chain me aata hi nahi</w:t>
             </w:r>
           </w:p>
         </w:tc>
@@ -13127,7 +13080,7 @@
                 <w:color w:val="0F172A"/>
                 <w:sz w:val="18"/>
               </w:rPr>
-              <w:t>L2 → L3</w:t>
+              <w:t>Raasta 3</w:t>
             </w:r>
           </w:p>
         </w:tc>
@@ -13156,14 +13109,7 @@
                 <w:rFonts w:cs="Georgia"/>
                 <w:sz w:val="18"/>
               </w:rPr>
-              <w:t>₹</w:t>
-            </w:r>
-            <w:r>
-              <w:rPr>
-                <w:rFonts w:cs="Georgia"/>
-                <w:sz w:val="18"/>
-              </w:rPr>
-              <w:t>750</w:t>
+              <w:t>WH → (MWH) → L1 → member</w:t>
             </w:r>
           </w:p>
         </w:tc>
@@ -13192,7 +13138,7 @@
                 <w:rFonts w:cs="Georgia"/>
                 <w:sz w:val="18"/>
               </w:rPr>
-              <w:t>L2 = ₹25</w:t>
+              <w:t>L1 → customer = 50/50 with WH</w:t>
             </w:r>
           </w:p>
         </w:tc>
@@ -13229,7 +13175,7 @@
                 <w:color w:val="0F172A"/>
                 <w:sz w:val="18"/>
               </w:rPr>
-              <w:t>L3 → member</w:t>
+              <w:t>Rates</w:t>
             </w:r>
           </w:p>
         </w:tc>
@@ -13261,23 +13207,7 @@
                 <w:color w:val="0F172A"/>
                 <w:sz w:val="18"/>
               </w:rPr>
-              <w:t>₹</w:t>
-            </w:r>
-            <w:r>
-              <w:rPr>
-                <w:rFonts w:cs="Georgia"/>
-                <w:b/>
-                <w:color w:val="0F172A"/>
-                <w:sz w:val="18"/>
-              </w:rPr>
-              <w:t>800</w:t>
-            </w:r>
-            <w:r>
-              <w:rPr>
-                <w:rFonts w:cs="Georgia"/>
-                <w:sz w:val="18"/>
-              </w:rPr>
-              <w:t xml:space="preserve"> (MSP)</w:t>
+              <w:t>product_level_prices row per (product, level)</w:t>
             </w:r>
           </w:p>
         </w:tc>
@@ -13307,7 +13237,7 @@
                 <w:rFonts w:cs="Georgia"/>
                 <w:sz w:val="18"/>
               </w:rPr>
-              <w:t>L3 = ₹50</w:t>
+              <w:t>Har product ke apne rates — system me koi fix ladder nahi</w:t>
             </w:r>
           </w:p>
         </w:tc>
@@ -13343,7 +13273,7 @@
                 <w:color w:val="0F172A"/>
                 <w:sz w:val="18"/>
               </w:rPr>
-              <w:t>*(agar MWH ho)* WH → MWH</w:t>
+              <w:t>Commission</w:t>
             </w:r>
           </w:p>
         </w:tc>
@@ -13372,14 +13302,7 @@
                 <w:rFonts w:cs="Georgia"/>
                 <w:sz w:val="18"/>
               </w:rPr>
-              <w:t>₹</w:t>
-            </w:r>
-            <w:r>
-              <w:rPr>
-                <w:rFonts w:cs="Georgia"/>
-                <w:sz w:val="18"/>
-              </w:rPr>
-              <w:t>685</w:t>
+              <w:t>Har level ko apna set commission</w:t>
             </w:r>
           </w:p>
         </w:tc>
@@ -13408,7 +13331,7 @@
                 <w:rFonts w:cs="Georgia"/>
                 <w:sz w:val="18"/>
               </w:rPr>
-              <w:t>MWH = ₹15 (700 − 685)</w:t>
+              <w:t>L2 aur L3 me koi rishta nahi; aapas me kuch bantta nahi</w:t>
             </w:r>
           </w:p>
         </w:tc>
@@ -13469,27 +13392,7 @@
                 <w:spacing w:val="35"/>
                 <w:sz w:val="15"/>
               </w:rPr>
-              <w:t>⚠</w:t>
-            </w:r>
-            <w:r>
-              <w:rPr>
-                <w:rFonts w:ascii="Segoe UI" w:eastAsia="Segoe UI" w:hAnsi="Segoe UI" w:cs="Segoe UI"/>
-                <w:b/>
-                <w:color w:val="DC2626"/>
-                <w:spacing w:val="35"/>
-                <w:sz w:val="15"/>
-              </w:rPr>
-              <w:t>️</w:t>
-            </w:r>
-            <w:r>
-              <w:rPr>
-                <w:rFonts w:ascii="Segoe UI" w:eastAsia="Segoe UI" w:hAnsi="Segoe UI" w:cs="Segoe UI"/>
-                <w:b/>
-                <w:color w:val="DC2626"/>
-                <w:spacing w:val="35"/>
-                <w:sz w:val="15"/>
-              </w:rPr>
-              <w:t xml:space="preserve"> SOURCE CONFLICT — CLIENT SE CONFIRM KARNA HAI</w:t>
+              <w:t>RESOLVED — PRICE AUR COMMISSION DATA HAIN, HARDCODE NAHI</w:t>
             </w:r>
           </w:p>
           <w:p>
@@ -13500,36 +13403,7 @@
               <w:rPr>
                 <w:rFonts w:cs="Georgia"/>
               </w:rPr>
-              <w:t>Module spec (</w:t>
-            </w:r>
-            <w:r>
-              <w:rPr>
-                <w:rFonts w:ascii="Consolas" w:eastAsia="Consolas" w:hAnsi="Consolas" w:cs="Consolas"/>
-                <w:color w:val="6D28D9"/>
-                <w:sz w:val="18"/>
-                <w:shd w:val="clear" w:color="auto" w:fill="F1F5F9"/>
-              </w:rPr>
-              <w:t>01-franchise-module/MODULES.md</w:t>
-            </w:r>
-            <w:r>
-              <w:rPr>
-                <w:rFonts w:cs="Georgia"/>
-              </w:rPr>
-              <w:t xml:space="preserve"> §2.3, §3.2) me: </w:t>
-            </w:r>
-            <w:r>
-              <w:rPr>
-                <w:rFonts w:cs="Georgia"/>
-                <w:b/>
-                <w:color w:val="0F172A"/>
-              </w:rPr>
-              <w:t>L1 700 · L2 725 · L3 750 · member 800</w:t>
-            </w:r>
-            <w:r>
-              <w:rPr>
-                <w:rFonts w:cs="Georgia"/>
-              </w:rPr>
-              <w:t>, aur MWH 685 pe kharidta hai (margin 15).</w:t>
+              <w:t>Client ne confirm kiya: price aur commission system me fix nahi hain. Har product ke apne level-rate hote hain — Admin product master me MWH / L1 / L2 / L3 ka rate set karta hai, aur commission usi product ke rate se nikalta hai.</w:t>
             </w:r>
           </w:p>
           <w:p>
@@ -13540,21 +13414,7 @@
               <w:rPr>
                 <w:rFonts w:cs="Georgia"/>
               </w:rPr>
-              <w:t xml:space="preserve">Client ke handwritten note me: </w:t>
-            </w:r>
-            <w:r>
-              <w:rPr>
-                <w:rFonts w:cs="Georgia"/>
-                <w:b/>
-                <w:color w:val="0F172A"/>
-              </w:rPr>
-              <w:t>670 · 700 · 750 · 800</w:t>
-            </w:r>
-            <w:r>
-              <w:rPr>
-                <w:rFonts w:cs="Georgia"/>
-              </w:rPr>
-              <w:t xml:space="preserve"> — ek level ka shift hai.</w:t>
+              <w:t>Isliye purana "spec 700/725/750/800 vs note 670/700/750/800" wala conflict ab blocker nahi hai — dono sirf seed data ke example hain. product_level_prices date-effective rahegi taaki history reproducible rahe.</w:t>
             </w:r>
           </w:p>
           <w:p>
@@ -13565,50 +13425,7 @@
               <w:rPr>
                 <w:rFonts w:cs="Georgia"/>
               </w:rPr>
-              <w:t xml:space="preserve">Humne </w:t>
-            </w:r>
-            <w:r>
-              <w:rPr>
-                <w:rFonts w:cs="Georgia"/>
-                <w:b/>
-                <w:color w:val="0F172A"/>
-              </w:rPr>
-              <w:t>module spec</w:t>
-            </w:r>
-            <w:r>
-              <w:rPr>
-                <w:rFonts w:cs="Georgia"/>
-              </w:rPr>
-              <w:t xml:space="preserve"> ko liya hai kyunki wo likha hua spec hai. </w:t>
-            </w:r>
-            <w:r>
-              <w:rPr>
-                <w:rFonts w:cs="Georgia"/>
-                <w:b/>
-                <w:color w:val="0F172A"/>
-              </w:rPr>
-              <w:t>Ye client-facing open question hai</w:t>
-            </w:r>
-            <w:r>
-              <w:rPr>
-                <w:rFonts w:cs="Georgia"/>
-              </w:rPr>
-              <w:t xml:space="preserve"> — ladder pe poora commission depend karta hai. Prices </w:t>
-            </w:r>
-            <w:r>
-              <w:rPr>
-                <w:rFonts w:ascii="Consolas" w:eastAsia="Consolas" w:hAnsi="Consolas" w:cs="Consolas"/>
-                <w:color w:val="6D28D9"/>
-                <w:sz w:val="18"/>
-                <w:shd w:val="clear" w:color="auto" w:fill="F1F5F9"/>
-              </w:rPr>
-              <w:t>product_level_prices</w:t>
-            </w:r>
-            <w:r>
-              <w:rPr>
-                <w:rFonts w:cs="Georgia"/>
-              </w:rPr>
-              <w:t xml:space="preserve"> table me hain, isliye correction sirf data change hai, code change nahi.</w:t>
+              <w:t>Billing ke waqt cost price customize ho sakti hai — bill line pe us waqt ki cost snapshot karo (bill_lines.cost_price_paise). Product master ka cost sirf default hai; purane bill baad me master badalne se nahi badalne chahiye.</w:t>
             </w:r>
           </w:p>
         </w:tc>
@@ -13669,7 +13486,7 @@
                 <w:spacing w:val="35"/>
                 <w:sz w:val="15"/>
               </w:rPr>
-              <w:t>MISSING-LEVEL ROLL-UP</w:t>
+              <w:t>MISSING-LEVEL ROLL-UP — RULE HATA DIYA GAYA</w:t>
             </w:r>
           </w:p>
           <w:p>
@@ -13680,21 +13497,7 @@
               <w:rPr>
                 <w:rFonts w:cs="Georgia"/>
               </w:rPr>
-              <w:t xml:space="preserve">Agar chain me koi level nahi hai, uska margin </w:t>
-            </w:r>
-            <w:r>
-              <w:rPr>
-                <w:rFonts w:cs="Georgia"/>
-                <w:b/>
-                <w:color w:val="0F172A"/>
-              </w:rPr>
-              <w:t>upar wale existing level</w:t>
-            </w:r>
-            <w:r>
-              <w:rPr>
-                <w:rFonts w:cs="Georgia"/>
-              </w:rPr>
-              <w:t xml:space="preserve"> me jud jaata hai. Total distributed margin hamesha ₹100 rehta hai.</w:t>
+              <w:t>Structure badal gaya: L2 aur L3 dono seedha L1 ke child hain (siblings), ek doosre ke neeche nahi. Isliye ek hi chain me L1+L2+L3 teeno kabhi nahi aate — har sale me sirf do level.</w:t>
             </w:r>
           </w:p>
           <w:p>
@@ -13705,36 +13508,18 @@
               <w:rPr>
                 <w:rFonts w:cs="Georgia"/>
               </w:rPr>
-              <w:t xml:space="preserve">Implementation: bill ke time chain ko upar walk karo, jo levels </w:t>
-            </w:r>
-            <w:r>
-              <w:rPr>
-                <w:rFonts w:cs="Georgia"/>
-                <w:b/>
-                <w:color w:val="0F172A"/>
-              </w:rPr>
-              <w:t>exist</w:t>
-            </w:r>
-            <w:r>
-              <w:rPr>
-                <w:rFonts w:cs="Georgia"/>
-              </w:rPr>
-              <w:t xml:space="preserve"> karte hain unhe collect karo, aur missing levels ka margin next-existing-ancestor ko de do. Ye pure function hai → </w:t>
-            </w:r>
-            <w:r>
-              <w:rPr>
-                <w:rFonts w:ascii="Consolas" w:eastAsia="Consolas" w:hAnsi="Consolas" w:cs="Consolas"/>
-                <w:color w:val="6D28D9"/>
-                <w:sz w:val="18"/>
-                <w:shd w:val="clear" w:color="auto" w:fill="F1F5F9"/>
-              </w:rPr>
-              <w:t>packages/core</w:t>
-            </w:r>
-            <w:r>
-              <w:rPr>
-                <w:rFonts w:cs="Georgia"/>
-              </w:rPr>
-              <w:t xml:space="preserve"> me, taaki test ho sake.</w:t>
+              <w:t>Nateeja: beech me koi "missing level" ka gap ban hi nahi sakta, aur purana roll-up rule apne aap khatam ho gaya hai. Ise implement mat karo.</w:t>
+            </w:r>
+          </w:p>
+          <w:p>
+            <w:pPr>
+              <w:spacing w:after="100"/>
+            </w:pPr>
+            <w:r>
+              <w:rPr>
+                <w:rFonts w:cs="Georgia"/>
+              </w:rPr>
+              <w:t>Location tree me L2 aur L3 dono ka parent_id = L1 ki id hoti hai. Pincode rollup bhi dono branches se seedha L1 me jaata hai — L2 ko L3 ke pincode nahi milte.</w:t>
             </w:r>
           </w:p>
         </w:tc>
@@ -13753,7 +13538,7 @@
         </w:pBdr>
         <w:spacing w:before="300" w:after="100" w:line="276" w:lineRule="auto"/>
       </w:pPr>
-      <w:bookmarkStart w:id="15" w:name="_Toc236790540"/>
+      <w:bookmarkStart w:id="15" w:name="_Toc239422386"/>
       <w:r>
         <w:rPr>
           <w:rFonts w:ascii="Segoe UI Semibold" w:eastAsia="Segoe UI Semibold" w:hAnsi="Segoe UI Semibold" w:cs="Segoe UI Semibold"/>
@@ -14238,7 +14023,7 @@
         </w:pBdr>
         <w:spacing w:before="300" w:after="100" w:line="276" w:lineRule="auto"/>
       </w:pPr>
-      <w:bookmarkStart w:id="16" w:name="_Toc236790541"/>
+      <w:bookmarkStart w:id="16" w:name="_Toc239422387"/>
       <w:r>
         <w:rPr>
           <w:rFonts w:ascii="Segoe UI Semibold" w:eastAsia="Segoe UI Semibold" w:hAnsi="Segoe UI Semibold" w:cs="Segoe UI Semibold"/>
@@ -14794,7 +14579,7 @@
         </w:pBdr>
         <w:spacing w:before="300" w:after="100" w:line="276" w:lineRule="auto"/>
       </w:pPr>
-      <w:bookmarkStart w:id="17" w:name="_Toc236790542"/>
+      <w:bookmarkStart w:id="17" w:name="_Toc239422388"/>
       <w:r>
         <w:rPr>
           <w:rFonts w:ascii="Segoe UI Semibold" w:eastAsia="Segoe UI Semibold" w:hAnsi="Segoe UI Semibold" w:cs="Segoe UI Semibold"/>
@@ -15814,16 +15599,7 @@
           <w:color w:val="6D28D9"/>
           <w:sz w:val="18"/>
         </w:rPr>
-        <w:t>▪</w:t>
-      </w:r>
-      <w:r>
-        <w:rPr>
-          <w:rFonts w:ascii="Segoe UI" w:eastAsia="Segoe UI" w:hAnsi="Segoe UI" w:cs="Segoe UI"/>
-          <w:b/>
-          <w:color w:val="6D28D9"/>
-          <w:sz w:val="18"/>
-        </w:rPr>
-        <w:t xml:space="preserve">  </w:t>
+        <w:t xml:space="preserve">▪  </w:t>
       </w:r>
       <w:r>
         <w:rPr>
@@ -15882,16 +15658,7 @@
           <w:color w:val="6D28D9"/>
           <w:sz w:val="18"/>
         </w:rPr>
-        <w:t>▪</w:t>
-      </w:r>
-      <w:r>
-        <w:rPr>
-          <w:rFonts w:ascii="Segoe UI" w:eastAsia="Segoe UI" w:hAnsi="Segoe UI" w:cs="Segoe UI"/>
-          <w:b/>
-          <w:color w:val="6D28D9"/>
-          <w:sz w:val="18"/>
-        </w:rPr>
-        <w:t xml:space="preserve">  </w:t>
+        <w:t xml:space="preserve">▪  </w:t>
       </w:r>
       <w:r>
         <w:rPr>
@@ -15920,16 +15687,7 @@
           <w:color w:val="6D28D9"/>
           <w:sz w:val="18"/>
         </w:rPr>
-        <w:t>▪</w:t>
-      </w:r>
-      <w:r>
-        <w:rPr>
-          <w:rFonts w:ascii="Segoe UI" w:eastAsia="Segoe UI" w:hAnsi="Segoe UI" w:cs="Segoe UI"/>
-          <w:b/>
-          <w:color w:val="6D28D9"/>
-          <w:sz w:val="18"/>
-        </w:rPr>
-        <w:t xml:space="preserve">  </w:t>
+        <w:t xml:space="preserve">▪  </w:t>
       </w:r>
       <w:r>
         <w:rPr>
@@ -15973,16 +15731,7 @@
           <w:color w:val="6D28D9"/>
           <w:sz w:val="18"/>
         </w:rPr>
-        <w:t>▪</w:t>
-      </w:r>
-      <w:r>
-        <w:rPr>
-          <w:rFonts w:ascii="Segoe UI" w:eastAsia="Segoe UI" w:hAnsi="Segoe UI" w:cs="Segoe UI"/>
-          <w:b/>
-          <w:color w:val="6D28D9"/>
-          <w:sz w:val="18"/>
-        </w:rPr>
-        <w:t xml:space="preserve">  </w:t>
+        <w:t xml:space="preserve">▪  </w:t>
       </w:r>
       <w:r>
         <w:rPr>
@@ -16056,7 +15805,7 @@
               <w:pStyle w:val="Heading1"/>
               <w:spacing w:before="0" w:line="252" w:lineRule="auto"/>
             </w:pPr>
-            <w:bookmarkStart w:id="18" w:name="_Toc236790543"/>
+            <w:bookmarkStart w:id="18" w:name="_Toc239422389"/>
             <w:r>
               <w:rPr>
                 <w:rFonts w:ascii="Segoe UI" w:eastAsia="Segoe UI" w:hAnsi="Segoe UI" w:cs="Segoe UI"/>
@@ -16091,7 +15840,7 @@
         </w:pBdr>
         <w:spacing w:before="300" w:after="100" w:line="276" w:lineRule="auto"/>
       </w:pPr>
-      <w:bookmarkStart w:id="19" w:name="_Toc236790544"/>
+      <w:bookmarkStart w:id="19" w:name="_Toc239422390"/>
       <w:r>
         <w:rPr>
           <w:rFonts w:ascii="Segoe UI Semibold" w:eastAsia="Segoe UI Semibold" w:hAnsi="Segoe UI Semibold" w:cs="Segoe UI Semibold"/>
@@ -16666,7 +16415,7 @@
         </w:pBdr>
         <w:spacing w:before="300" w:after="100" w:line="276" w:lineRule="auto"/>
       </w:pPr>
-      <w:bookmarkStart w:id="20" w:name="_Toc236790545"/>
+      <w:bookmarkStart w:id="20" w:name="_Toc239422391"/>
       <w:r>
         <w:rPr>
           <w:rFonts w:ascii="Segoe UI Semibold" w:eastAsia="Segoe UI Semibold" w:hAnsi="Segoe UI Semibold" w:cs="Segoe UI Semibold"/>
@@ -17238,7 +16987,7 @@
         </w:pBdr>
         <w:spacing w:before="300" w:after="100" w:line="276" w:lineRule="auto"/>
       </w:pPr>
-      <w:bookmarkStart w:id="21" w:name="_Toc236790546"/>
+      <w:bookmarkStart w:id="21" w:name="_Toc239422392"/>
       <w:r>
         <w:rPr>
           <w:rFonts w:ascii="Segoe UI Semibold" w:eastAsia="Segoe UI Semibold" w:hAnsi="Segoe UI Semibold" w:cs="Segoe UI Semibold"/>
@@ -18478,7 +18227,7 @@
         </w:pBdr>
         <w:spacing w:before="300" w:after="100" w:line="276" w:lineRule="auto"/>
       </w:pPr>
-      <w:bookmarkStart w:id="22" w:name="_Toc236790547"/>
+      <w:bookmarkStart w:id="22" w:name="_Toc239422393"/>
       <w:r>
         <w:rPr>
           <w:rFonts w:ascii="Segoe UI Semibold" w:eastAsia="Segoe UI Semibold" w:hAnsi="Segoe UI Semibold" w:cs="Segoe UI Semibold"/>
@@ -19133,7 +18882,7 @@
                 <w:spacing w:val="35"/>
                 <w:sz w:val="15"/>
               </w:rPr>
-              <w:t>OPEN — CLIENT SE DECISION CHAHIYE</w:t>
+              <w:t>RESOLVED — BILL CANCEL / STOCK RETURN = FULL REVERSE</w:t>
             </w:r>
           </w:p>
           <w:p>
@@ -19144,21 +18893,29 @@
               <w:rPr>
                 <w:rFonts w:cs="Georgia"/>
               </w:rPr>
-              <w:t xml:space="preserve">Bill cancellation / stock return: the client has not yet defined whether already-paid incentives are clawed back. The schema supports compensating entries either way, but the </w:t>
-            </w:r>
-            <w:r>
-              <w:rPr>
-                <w:rFonts w:cs="Georgia"/>
-                <w:b/>
-                <w:color w:val="0F172A"/>
-              </w:rPr>
-              <w:t>policy</w:t>
-            </w:r>
-            <w:r>
-              <w:rPr>
-                <w:rFonts w:cs="Georgia"/>
-              </w:rPr>
-              <w:t xml:space="preserve"> must be decided before Phase 5 goes live. See §9 of the client document.</w:t>
+              <w:t>Client ne confirm kiya: poora flow reverse hota hai. Jo stock gaya tha wo wapas, jo commission bana tha wo wapas, wallet bhi pehle wali position pe.</w:t>
+            </w:r>
+          </w:p>
+          <w:p>
+            <w:pPr>
+              <w:spacing w:after="100"/>
+            </w:pPr>
+            <w:r>
+              <w:rPr>
+                <w:rFonts w:cs="Georgia"/>
+              </w:rPr>
+              <w:t>Implementation: compensating entries — kabhi bhi ledger row update ya delete mat karo. Har reversal apni row banaye with reversal_of_id -&gt; original row, taaki audit trail poora rahe aur balance dobara derive ho sake.</w:t>
+            </w:r>
+          </w:p>
+          <w:p>
+            <w:pPr>
+              <w:spacing w:after="100"/>
+            </w:pPr>
+            <w:r>
+              <w:rPr>
+                <w:rFonts w:cs="Georgia"/>
+              </w:rPr>
+              <w:t>Point ledger, commission wallet aur stock movement — teeno ke liye same compensating pattern. Reversal ek hi transaction me, idempotency key = bill_id + "REVERSAL".</w:t>
             </w:r>
           </w:p>
         </w:tc>
@@ -19211,7 +18968,7 @@
               <w:pStyle w:val="Heading1"/>
               <w:spacing w:before="0" w:line="252" w:lineRule="auto"/>
             </w:pPr>
-            <w:bookmarkStart w:id="23" w:name="_Toc236790548"/>
+            <w:bookmarkStart w:id="23" w:name="_Toc239422394"/>
             <w:r>
               <w:rPr>
                 <w:rFonts w:ascii="Segoe UI" w:eastAsia="Segoe UI" w:hAnsi="Segoe UI" w:cs="Segoe UI"/>
@@ -19246,7 +19003,7 @@
         </w:pBdr>
         <w:spacing w:before="300" w:after="100" w:line="276" w:lineRule="auto"/>
       </w:pPr>
-      <w:bookmarkStart w:id="24" w:name="_Toc236790549"/>
+      <w:bookmarkStart w:id="24" w:name="_Toc239422395"/>
       <w:r>
         <w:rPr>
           <w:rFonts w:ascii="Segoe UI Semibold" w:eastAsia="Segoe UI Semibold" w:hAnsi="Segoe UI Semibold" w:cs="Segoe UI Semibold"/>
@@ -19346,13 +19103,18 @@
             <w:pPr>
               <w:spacing w:after="0" w:line="278" w:lineRule="auto"/>
             </w:pPr>
+          </w:p>
+          <w:p>
+            <w:pPr>
+              <w:spacing w:after="0" w:line="278" w:lineRule="auto"/>
+            </w:pPr>
             <w:r>
               <w:rPr>
                 <w:rFonts w:ascii="Consolas" w:eastAsia="Consolas" w:hAnsi="Consolas" w:cs="Consolas"/>
                 <w:color w:val="E2E8F0"/>
                 <w:sz w:val="16"/>
               </w:rPr>
-              <w:t xml:space="preserve"> </w:t>
+              <w:t xml:space="preserve">  const availL = m.carry_left  + m.today_left;</w:t>
             </w:r>
           </w:p>
           <w:p>
@@ -19365,8 +19127,13 @@
                 <w:color w:val="E2E8F0"/>
                 <w:sz w:val="16"/>
               </w:rPr>
-              <w:t xml:space="preserve">  const availL = m.carry_left  + m.today_left;</w:t>
-            </w:r>
+              <w:t xml:space="preserve">  const availR = m.carry_right + m.today_right;</w:t>
+            </w:r>
+          </w:p>
+          <w:p>
+            <w:pPr>
+              <w:spacing w:after="0" w:line="278" w:lineRule="auto"/>
+            </w:pPr>
           </w:p>
           <w:p>
             <w:pPr>
@@ -19378,7 +19145,7 @@
                 <w:color w:val="E2E8F0"/>
                 <w:sz w:val="16"/>
               </w:rPr>
-              <w:t xml:space="preserve">  const availR = m.carry_right + m.today_right;</w:t>
+              <w:t xml:space="preserve">  // Match = min of the two sides, floored to a 1000 multiple, then capped.</w:t>
             </w:r>
           </w:p>
           <w:p>
@@ -19391,7 +19158,7 @@
                 <w:color w:val="E2E8F0"/>
                 <w:sz w:val="16"/>
               </w:rPr>
-              <w:t xml:space="preserve"> </w:t>
+              <w:t xml:space="preserve">  const rawMatch = Math.floor(Math.min(availL, availR) / 1000) * 1000;</w:t>
             </w:r>
           </w:p>
           <w:p>
@@ -19404,7 +19171,7 @@
                 <w:color w:val="E2E8F0"/>
                 <w:sz w:val="16"/>
               </w:rPr>
-              <w:t xml:space="preserve">  // Match = min of the two sides, floored to a 1000 multiple, then capped.</w:t>
+              <w:t xml:space="preserve">  const matched  = Math.min(rawMatch, cap);</w:t>
             </w:r>
           </w:p>
           <w:p>
@@ -19417,8 +19184,13 @@
                 <w:color w:val="E2E8F0"/>
                 <w:sz w:val="16"/>
               </w:rPr>
-              <w:t xml:space="preserve">  const rawMatch = Math.floor(Math.min(availL, availR) / 1000) * 1000;</w:t>
-            </w:r>
+              <w:t xml:space="preserve">  const payout   = matched * 0.80;</w:t>
+            </w:r>
+          </w:p>
+          <w:p>
+            <w:pPr>
+              <w:spacing w:after="0" w:line="278" w:lineRule="auto"/>
+            </w:pPr>
           </w:p>
           <w:p>
             <w:pPr>
@@ -19430,7 +19202,7 @@
                 <w:color w:val="E2E8F0"/>
                 <w:sz w:val="16"/>
               </w:rPr>
-              <w:t xml:space="preserve">  const matched  = Math.min(rawMatch, cap);</w:t>
+              <w:t xml:space="preserve">  // CONSUMPTION ORDER - today's business is spent FIRST, then old carry.</w:t>
             </w:r>
           </w:p>
           <w:p>
@@ -19443,7 +19215,7 @@
                 <w:color w:val="E2E8F0"/>
                 <w:sz w:val="16"/>
               </w:rPr>
-              <w:t xml:space="preserve">  const payout   = matched * 0.80;</w:t>
+              <w:t xml:space="preserve">  // This order is what reproduces the client's own sheet.</w:t>
             </w:r>
           </w:p>
           <w:p>
@@ -19456,7 +19228,7 @@
                 <w:color w:val="E2E8F0"/>
                 <w:sz w:val="16"/>
               </w:rPr>
-              <w:t xml:space="preserve"> </w:t>
+              <w:t xml:space="preserve">  const side = (carry, today) =&gt; {</w:t>
             </w:r>
           </w:p>
           <w:p>
@@ -19469,7 +19241,7 @@
                 <w:color w:val="E2E8F0"/>
                 <w:sz w:val="16"/>
               </w:rPr>
-              <w:t xml:space="preserve">  const remL = availL - matched;</w:t>
+              <w:t xml:space="preserve">    const todayUsed = Math.min(today, matched);</w:t>
             </w:r>
           </w:p>
           <w:p>
@@ -19482,7 +19254,7 @@
                 <w:color w:val="E2E8F0"/>
                 <w:sz w:val="16"/>
               </w:rPr>
-              <w:t xml:space="preserve">  const remR = availR - matched;</w:t>
+              <w:t xml:space="preserve">    const carryUsed = Math.min(carry, matched - todayUsed);</w:t>
             </w:r>
           </w:p>
           <w:p>
@@ -19495,7 +19267,7 @@
                 <w:color w:val="E2E8F0"/>
                 <w:sz w:val="16"/>
               </w:rPr>
-              <w:t xml:space="preserve"> </w:t>
+              <w:t xml:space="preserve">    return { todayLeft: today - todayUsed, carryLeft: carry - carryUsed };</w:t>
             </w:r>
           </w:p>
           <w:p>
@@ -19508,7 +19280,7 @@
                 <w:color w:val="E2E8F0"/>
                 <w:sz w:val="16"/>
               </w:rPr>
-              <w:t xml:space="preserve">  // WASHOUT — decided by comparing OLD CARRY, not the totals.</w:t>
+              <w:t xml:space="preserve">  };</w:t>
             </w:r>
           </w:p>
           <w:p>
@@ -19521,7 +19293,7 @@
                 <w:color w:val="E2E8F0"/>
                 <w:sz w:val="16"/>
               </w:rPr>
-              <w:t xml:space="preserve">  //   bigger old carry  -&gt; nothing washes (its today business carries too)</w:t>
+              <w:t xml:space="preserve">  const L = side(m.carry_left,  m.today_left);</w:t>
             </w:r>
           </w:p>
           <w:p>
@@ -19534,8 +19306,13 @@
                 <w:color w:val="E2E8F0"/>
                 <w:sz w:val="16"/>
               </w:rPr>
-              <w:t xml:space="preserve">  //   smaller old carry -&gt; everything remaining on that side washes,</w:t>
-            </w:r>
+              <w:t xml:space="preserve">  const R = side(m.carry_right, m.today_right);</w:t>
+            </w:r>
+          </w:p>
+          <w:p>
+            <w:pPr>
+              <w:spacing w:after="0" w:line="278" w:lineRule="auto"/>
+            </w:pPr>
           </w:p>
           <w:p>
             <w:pPr>
@@ -19547,7 +19324,7 @@
                 <w:color w:val="E2E8F0"/>
                 <w:sz w:val="16"/>
               </w:rPr>
-              <w:t xml:space="preserve">  //                        but ONLY if that side received business today</w:t>
+              <w:t xml:space="preserve">  // WASHOUT</w:t>
             </w:r>
           </w:p>
           <w:p>
@@ -19560,7 +19337,7 @@
                 <w:color w:val="E2E8F0"/>
                 <w:sz w:val="16"/>
               </w:rPr>
-              <w:t xml:space="preserve">  //   no payout         -&gt; nothing washes at all</w:t>
+              <w:t xml:space="preserve">  //   old carry NEVER washes - whatever survives is carried forward</w:t>
             </w:r>
           </w:p>
           <w:p>
@@ -19573,7 +19350,7 @@
                 <w:color w:val="E2E8F0"/>
                 <w:sz w:val="16"/>
               </w:rPr>
-              <w:t xml:space="preserve">  let washL = 0, washR = 0;</w:t>
+              <w:t xml:space="preserve">  //   only today's unmatched business washes</w:t>
             </w:r>
           </w:p>
           <w:p>
@@ -19586,7 +19363,7 @@
                 <w:color w:val="E2E8F0"/>
                 <w:sz w:val="16"/>
               </w:rPr>
-              <w:t xml:space="preserve">  if (matched &gt; 0) {</w:t>
+              <w:t xml:space="preserve">  //   strong/weak decided on TOTALS (carry + today), not on carry alone</w:t>
             </w:r>
           </w:p>
           <w:p>
@@ -19599,7 +19376,7 @@
                 <w:color w:val="E2E8F0"/>
                 <w:sz w:val="16"/>
               </w:rPr>
-              <w:t xml:space="preserve">    if (m.carry_left  &lt; m.carry_right &amp;&amp; m.today_left  &gt; 0) washL = remL;</w:t>
+              <w:t xml:space="preserve">  //   if the weak side did not wash, the strong side does not wash either</w:t>
             </w:r>
           </w:p>
           <w:p>
@@ -19612,7 +19389,7 @@
                 <w:color w:val="E2E8F0"/>
                 <w:sz w:val="16"/>
               </w:rPr>
-              <w:t xml:space="preserve">    if (m.carry_right &lt; m.carry_left  &amp;&amp; m.today_right &gt; 0) washR = remR;</w:t>
+              <w:t xml:space="preserve">  //   no match at all -&gt; nothing washes</w:t>
             </w:r>
           </w:p>
           <w:p>
@@ -19625,7 +19402,7 @@
                 <w:color w:val="E2E8F0"/>
                 <w:sz w:val="16"/>
               </w:rPr>
-              <w:t xml:space="preserve">  }</w:t>
+              <w:t xml:space="preserve">  let washL = L.todayLeft, washR = R.todayLeft;</w:t>
             </w:r>
           </w:p>
           <w:p>
@@ -19638,7 +19415,7 @@
                 <w:color w:val="E2E8F0"/>
                 <w:sz w:val="16"/>
               </w:rPr>
-              <w:t xml:space="preserve"> </w:t>
+              <w:t xml:space="preserve">  const strongIsL = availL &gt; availR;</w:t>
             </w:r>
           </w:p>
           <w:p>
@@ -19651,8 +19428,13 @@
                 <w:color w:val="E2E8F0"/>
                 <w:sz w:val="16"/>
               </w:rPr>
-              <w:t xml:space="preserve">  return {</w:t>
-            </w:r>
+              <w:t xml:space="preserve">  const strongIsR = availR &gt; availL;</w:t>
+            </w:r>
+          </w:p>
+          <w:p>
+            <w:pPr>
+              <w:spacing w:after="0" w:line="278" w:lineRule="auto"/>
+            </w:pPr>
           </w:p>
           <w:p>
             <w:pPr>
@@ -19664,7 +19446,7 @@
                 <w:color w:val="E2E8F0"/>
                 <w:sz w:val="16"/>
               </w:rPr>
-              <w:t xml:space="preserve">    matched, payout,</w:t>
+              <w:t xml:space="preserve">  if (matched === 0) {</w:t>
             </w:r>
           </w:p>
           <w:p>
@@ -19677,7 +19459,7 @@
                 <w:color w:val="E2E8F0"/>
                 <w:sz w:val="16"/>
               </w:rPr>
-              <w:t xml:space="preserve">    washL, washR,</w:t>
+              <w:t xml:space="preserve">    washL = 0; washR = 0;</w:t>
             </w:r>
           </w:p>
           <w:p>
@@ -19690,7 +19472,7 @@
                 <w:color w:val="E2E8F0"/>
                 <w:sz w:val="16"/>
               </w:rPr>
-              <w:t xml:space="preserve">    carryLeft:  remL - washL,</w:t>
+              <w:t xml:space="preserve">  } else {</w:t>
             </w:r>
           </w:p>
           <w:p>
@@ -19703,7 +19485,168 @@
                 <w:color w:val="E2E8F0"/>
                 <w:sz w:val="16"/>
               </w:rPr>
-              <w:t xml:space="preserve">    carryRight: remR - washR,</w:t>
+              <w:t xml:space="preserve">    const weakWash = strongIsL ? washR</w:t>
+            </w:r>
+          </w:p>
+          <w:p>
+            <w:pPr>
+              <w:spacing w:after="0" w:line="278" w:lineRule="auto"/>
+            </w:pPr>
+            <w:r>
+              <w:rPr>
+                <w:rFonts w:ascii="Consolas" w:eastAsia="Consolas" w:hAnsi="Consolas" w:cs="Consolas"/>
+                <w:color w:val="E2E8F0"/>
+                <w:sz w:val="16"/>
+              </w:rPr>
+              <w:t xml:space="preserve">                   : strongIsR ? washL</w:t>
+            </w:r>
+          </w:p>
+          <w:p>
+            <w:pPr>
+              <w:spacing w:after="0" w:line="278" w:lineRule="auto"/>
+            </w:pPr>
+            <w:r>
+              <w:rPr>
+                <w:rFonts w:ascii="Consolas" w:eastAsia="Consolas" w:hAnsi="Consolas" w:cs="Consolas"/>
+                <w:color w:val="E2E8F0"/>
+                <w:sz w:val="16"/>
+              </w:rPr>
+              <w:t xml:space="preserve">                   : Math.min(washL, washR);</w:t>
+            </w:r>
+          </w:p>
+          <w:p>
+            <w:pPr>
+              <w:spacing w:after="0" w:line="278" w:lineRule="auto"/>
+            </w:pPr>
+            <w:r>
+              <w:rPr>
+                <w:rFonts w:ascii="Consolas" w:eastAsia="Consolas" w:hAnsi="Consolas" w:cs="Consolas"/>
+                <w:color w:val="E2E8F0"/>
+                <w:sz w:val="16"/>
+              </w:rPr>
+              <w:t xml:space="preserve">    if (weakWash === 0) {</w:t>
+            </w:r>
+          </w:p>
+          <w:p>
+            <w:pPr>
+              <w:spacing w:after="0" w:line="278" w:lineRule="auto"/>
+            </w:pPr>
+            <w:r>
+              <w:rPr>
+                <w:rFonts w:ascii="Consolas" w:eastAsia="Consolas" w:hAnsi="Consolas" w:cs="Consolas"/>
+                <w:color w:val="E2E8F0"/>
+                <w:sz w:val="16"/>
+              </w:rPr>
+              <w:t xml:space="preserve">      if (strongIsL)      washL = 0;</w:t>
+            </w:r>
+          </w:p>
+          <w:p>
+            <w:pPr>
+              <w:spacing w:after="0" w:line="278" w:lineRule="auto"/>
+            </w:pPr>
+            <w:r>
+              <w:rPr>
+                <w:rFonts w:ascii="Consolas" w:eastAsia="Consolas" w:hAnsi="Consolas" w:cs="Consolas"/>
+                <w:color w:val="E2E8F0"/>
+                <w:sz w:val="16"/>
+              </w:rPr>
+              <w:t xml:space="preserve">      else if (strongIsR) washR = 0;</w:t>
+            </w:r>
+          </w:p>
+          <w:p>
+            <w:pPr>
+              <w:spacing w:after="0" w:line="278" w:lineRule="auto"/>
+            </w:pPr>
+            <w:r>
+              <w:rPr>
+                <w:rFonts w:ascii="Consolas" w:eastAsia="Consolas" w:hAnsi="Consolas" w:cs="Consolas"/>
+                <w:color w:val="E2E8F0"/>
+                <w:sz w:val="16"/>
+              </w:rPr>
+              <w:t xml:space="preserve">      else              { washL = 0; washR = 0; }</w:t>
+            </w:r>
+          </w:p>
+          <w:p>
+            <w:pPr>
+              <w:spacing w:after="0" w:line="278" w:lineRule="auto"/>
+            </w:pPr>
+            <w:r>
+              <w:rPr>
+                <w:rFonts w:ascii="Consolas" w:eastAsia="Consolas" w:hAnsi="Consolas" w:cs="Consolas"/>
+                <w:color w:val="E2E8F0"/>
+                <w:sz w:val="16"/>
+              </w:rPr>
+              <w:t xml:space="preserve">    }</w:t>
+            </w:r>
+          </w:p>
+          <w:p>
+            <w:pPr>
+              <w:spacing w:after="0" w:line="278" w:lineRule="auto"/>
+            </w:pPr>
+            <w:r>
+              <w:rPr>
+                <w:rFonts w:ascii="Consolas" w:eastAsia="Consolas" w:hAnsi="Consolas" w:cs="Consolas"/>
+                <w:color w:val="E2E8F0"/>
+                <w:sz w:val="16"/>
+              </w:rPr>
+              <w:t xml:space="preserve">  }</w:t>
+            </w:r>
+          </w:p>
+          <w:p>
+            <w:pPr>
+              <w:spacing w:after="0" w:line="278" w:lineRule="auto"/>
+            </w:pPr>
+          </w:p>
+          <w:p>
+            <w:pPr>
+              <w:spacing w:after="0" w:line="278" w:lineRule="auto"/>
+            </w:pPr>
+            <w:r>
+              <w:rPr>
+                <w:rFonts w:ascii="Consolas" w:eastAsia="Consolas" w:hAnsi="Consolas" w:cs="Consolas"/>
+                <w:color w:val="E2E8F0"/>
+                <w:sz w:val="16"/>
+              </w:rPr>
+              <w:t xml:space="preserve">  return {</w:t>
+            </w:r>
+          </w:p>
+          <w:p>
+            <w:pPr>
+              <w:spacing w:after="0" w:line="278" w:lineRule="auto"/>
+            </w:pPr>
+            <w:r>
+              <w:rPr>
+                <w:rFonts w:ascii="Consolas" w:eastAsia="Consolas" w:hAnsi="Consolas" w:cs="Consolas"/>
+                <w:color w:val="E2E8F0"/>
+                <w:sz w:val="16"/>
+              </w:rPr>
+              <w:t xml:space="preserve">    matched, payout, washL, washR,</w:t>
+            </w:r>
+          </w:p>
+          <w:p>
+            <w:pPr>
+              <w:spacing w:after="0" w:line="278" w:lineRule="auto"/>
+            </w:pPr>
+            <w:r>
+              <w:rPr>
+                <w:rFonts w:ascii="Consolas" w:eastAsia="Consolas" w:hAnsi="Consolas" w:cs="Consolas"/>
+                <w:color w:val="E2E8F0"/>
+                <w:sz w:val="16"/>
+              </w:rPr>
+              <w:t xml:space="preserve">    carryLeft:  L.carryLeft + (L.todayLeft - washL),</w:t>
+            </w:r>
+          </w:p>
+          <w:p>
+            <w:pPr>
+              <w:spacing w:after="0" w:line="278" w:lineRule="auto"/>
+            </w:pPr>
+            <w:r>
+              <w:rPr>
+                <w:rFonts w:ascii="Consolas" w:eastAsia="Consolas" w:hAnsi="Consolas" w:cs="Consolas"/>
+                <w:color w:val="E2E8F0"/>
+                <w:sz w:val="16"/>
+              </w:rPr>
+              <w:t xml:space="preserve">    carryRight: R.carryLeft + (R.todayLeft - washR),</w:t>
             </w:r>
           </w:p>
           <w:p>
@@ -19790,7 +19733,7 @@
                 <w:spacing w:val="35"/>
                 <w:sz w:val="15"/>
               </w:rPr>
-              <w:t>CLIENT KE APNE EXAMPLE SE VERIFY KIYA</w:t>
+              <w:t>CLIENT KE APNE EXAMPLE SE VERIFY KIYA — CHAARO CASE + PURANI SHEET</w:t>
             </w:r>
           </w:p>
           <w:p>
@@ -19803,27 +19746,20 @@
                 <w:b/>
                 <w:color w:val="0F172A"/>
               </w:rPr>
-              <w:t>Day 1</w:t>
-            </w:r>
-            <w:r>
-              <w:rPr>
-                <w:rFonts w:cs="Georgia"/>
-              </w:rPr>
-              <w:t xml:space="preserve"> — carry L 1,59,400 / R 2,047; no new business; cap 2,000 → matched 2,000, payout 1,600, </w:t>
-            </w:r>
+              <w:t>Case 1 — L carry 0 + today 500; R carry 0 + today 300 → matched 0 (1000 se kam) → kuch wash nahi; carry L 500 / R 300.</w:t>
+            </w:r>
+          </w:p>
+          <w:p>
+            <w:pPr>
+              <w:spacing w:after="100"/>
+            </w:pPr>
             <w:r>
               <w:rPr>
                 <w:rFonts w:cs="Georgia"/>
                 <w:b/>
                 <w:color w:val="0F172A"/>
               </w:rPr>
-              <w:t>carry L 1,57,400 · carry R 47</w:t>
-            </w:r>
-            <w:r>
-              <w:rPr>
-                <w:rFonts w:cs="Georgia"/>
-              </w:rPr>
-              <w:t>.</w:t>
+              <w:t>Case 2 — L 300+800 = 1,100; R 500+1,000 = 1,500 → matched 1,000. Dono sides ka today pura khap gaya → wash 0; carry L 100 / R 500.</w:t>
             </w:r>
           </w:p>
           <w:p>
@@ -19833,30 +19769,8 @@
             <w:r>
               <w:rPr>
                 <w:rFonts w:cs="Georgia"/>
-                <w:b/>
-                <w:color w:val="0F172A"/>
-              </w:rPr>
-              <w:t>Day 2</w:t>
-            </w:r>
-            <w:r>
-              <w:rPr>
-                <w:rFonts w:cs="Georgia"/>
-              </w:rPr>
-              <w:t xml:space="preserve"> — today R 2,394 → matched 2,000, payout 1,600, Right side washes, </w:t>
-            </w:r>
-            <w:r>
-              <w:rPr>
-                <w:rFonts w:cs="Georgia"/>
-                <w:b/>
-                <w:color w:val="0F172A"/>
-              </w:rPr>
-              <w:t>carry L 1,55,400 · carry R 0</w:t>
-            </w:r>
-            <w:r>
-              <w:rPr>
-                <w:rFonts w:cs="Georgia"/>
-              </w:rPr>
-              <w:t>.</w:t>
+              </w:rPr>
+              <w:t>Case 3 — L 2,000+0; R 900+100 → matched 1,000 → wash 0; carry L 1,000 / R 0.</w:t>
             </w:r>
           </w:p>
           <w:p>
@@ -19867,36 +19781,40 @@
               <w:rPr>
                 <w:rFonts w:cs="Georgia"/>
               </w:rPr>
-              <w:t xml:space="preserve">Both days reproduce the client's handwritten figures exactly. The </w:t>
-            </w:r>
-            <w:r>
-              <w:rPr>
-                <w:rFonts w:ascii="Consolas" w:eastAsia="Consolas" w:hAnsi="Consolas" w:cs="Consolas"/>
-                <w:color w:val="6D28D9"/>
-                <w:sz w:val="18"/>
-                <w:shd w:val="clear" w:color="auto" w:fill="F1F5F9"/>
-              </w:rPr>
-              <w:t>today_* &gt; 0</w:t>
-            </w:r>
-            <w:r>
-              <w:rPr>
-                <w:rFonts w:cs="Georgia"/>
-              </w:rPr>
-              <w:t xml:space="preserve"> guard is the </w:t>
-            </w:r>
-            <w:r>
-              <w:rPr>
-                <w:rFonts w:cs="Georgia"/>
-                <w:b/>
-                <w:color w:val="0F172A"/>
-              </w:rPr>
-              <w:t>assumption</w:t>
-            </w:r>
-            <w:r>
-              <w:rPr>
-                <w:rFonts w:cs="Georgia"/>
-              </w:rPr>
-              <w:t xml:space="preserve"> that makes Day 1's 47 survive — flagged for client confirmation.</w:t>
+              <w:t>Case 4 — L 2,000+800 = 2,800 (strong); R 0+1,200 = 1,200 (weak) → matched 1,000. L ka today 800 pura khap gaya → carry 1,800. R ka today bacha 200 → wash 200.</w:t>
+            </w:r>
+          </w:p>
+          <w:p>
+            <w:pPr>
+              <w:spacing w:after="100"/>
+            </w:pPr>
+            <w:r>
+              <w:rPr>
+                <w:rFonts w:cs="Georgia"/>
+              </w:rPr>
+              <w:t>Purani sheet — Day 1: carry L 1,59,400 / R 2,047, koi naya business nahi, cap 2,000 → matched 2,000, payout 1,600, carry L 1,57,400 / R 47.</w:t>
+            </w:r>
+          </w:p>
+          <w:p>
+            <w:pPr>
+              <w:spacing w:after="100"/>
+            </w:pPr>
+            <w:r>
+              <w:rPr>
+                <w:rFonts w:cs="Georgia"/>
+              </w:rPr>
+              <w:t>Purani sheet — Day 2: today R 2,394 → matched 2,000 (pehle today ka 2,000 khapa) → wash R 394, carry L 1,55,400 / R 47.</w:t>
+            </w:r>
+          </w:p>
+          <w:p>
+            <w:pPr>
+              <w:spacing w:after="100"/>
+            </w:pPr>
+            <w:r>
+              <w:rPr>
+                <w:rFonts w:cs="Georgia"/>
+              </w:rPr>
+              <w:t>Day-2 ka 394 exactly client ki handwritten sheet se match karta hai. Purana 441 wala figure galat tha — wo carry-first consumption maan ke nikla tha. Ab order theek hai: today first, phir carry.</w:t>
             </w:r>
           </w:p>
         </w:tc>
@@ -19915,7 +19833,7 @@
         </w:pBdr>
         <w:spacing w:before="300" w:after="100" w:line="276" w:lineRule="auto"/>
       </w:pPr>
-      <w:bookmarkStart w:id="25" w:name="_Toc236790550"/>
+      <w:bookmarkStart w:id="25" w:name="_Toc239422396"/>
       <w:r>
         <w:rPr>
           <w:rFonts w:ascii="Segoe UI Semibold" w:eastAsia="Segoe UI Semibold" w:hAnsi="Segoe UI Semibold" w:cs="Segoe UI Semibold"/>
@@ -21779,16 +21697,7 @@
                 <w:color w:val="0F172A"/>
                 <w:sz w:val="18"/>
               </w:rPr>
-              <w:t>Registration free · KYC</w:t>
-            </w:r>
-            <w:r>
-              <w:rPr>
-                <w:rFonts w:ascii="Segoe UI" w:eastAsia="Segoe UI" w:hAnsi="Segoe UI" w:cs="Segoe UI"/>
-                <w:b/>
-                <w:color w:val="0F172A"/>
-                <w:sz w:val="18"/>
-              </w:rPr>
-              <w:t xml:space="preserve"> zaroori · min age 18</w:t>
+              <w:t>Registration free · KYC zaroori · min age 18</w:t>
             </w:r>
           </w:p>
         </w:tc>
@@ -22158,7 +22067,7 @@
         </w:pBdr>
         <w:spacing w:before="300" w:after="100" w:line="276" w:lineRule="auto"/>
       </w:pPr>
-      <w:bookmarkStart w:id="26" w:name="_Toc236790551"/>
+      <w:bookmarkStart w:id="26" w:name="_Toc239422397"/>
       <w:r>
         <w:rPr>
           <w:rFonts w:ascii="Segoe UI Semibold" w:eastAsia="Segoe UI Semibold" w:hAnsi="Segoe UI Semibold" w:cs="Segoe UI Semibold"/>
@@ -23479,7 +23388,7 @@
         </w:pBdr>
         <w:spacing w:before="300" w:after="100" w:line="276" w:lineRule="auto"/>
       </w:pPr>
-      <w:bookmarkStart w:id="27" w:name="_Toc236790552"/>
+      <w:bookmarkStart w:id="27" w:name="_Toc239422398"/>
       <w:r>
         <w:rPr>
           <w:rFonts w:ascii="Segoe UI Semibold" w:eastAsia="Segoe UI Semibold" w:hAnsi="Segoe UI Semibold" w:cs="Segoe UI Semibold"/>
@@ -24027,7 +23936,7 @@
               <w:pStyle w:val="Heading1"/>
               <w:spacing w:before="0" w:line="252" w:lineRule="auto"/>
             </w:pPr>
-            <w:bookmarkStart w:id="28" w:name="_Toc236790553"/>
+            <w:bookmarkStart w:id="28" w:name="_Toc239422399"/>
             <w:r>
               <w:rPr>
                 <w:rFonts w:ascii="Segoe UI" w:eastAsia="Segoe UI" w:hAnsi="Segoe UI" w:cs="Segoe UI"/>
@@ -24062,7 +23971,7 @@
         </w:pBdr>
         <w:spacing w:before="300" w:after="100" w:line="276" w:lineRule="auto"/>
       </w:pPr>
-      <w:bookmarkStart w:id="29" w:name="_Toc236790554"/>
+      <w:bookmarkStart w:id="29" w:name="_Toc239422400"/>
       <w:r>
         <w:rPr>
           <w:rFonts w:ascii="Segoe UI Semibold" w:eastAsia="Segoe UI Semibold" w:hAnsi="Segoe UI Semibold" w:cs="Segoe UI Semibold"/>
@@ -24528,7 +24437,7 @@
         </w:pBdr>
         <w:spacing w:before="300" w:after="100" w:line="276" w:lineRule="auto"/>
       </w:pPr>
-      <w:bookmarkStart w:id="30" w:name="_Toc236790555"/>
+      <w:bookmarkStart w:id="30" w:name="_Toc239422401"/>
       <w:r>
         <w:rPr>
           <w:rFonts w:ascii="Segoe UI Semibold" w:eastAsia="Segoe UI Semibold" w:hAnsi="Segoe UI Semibold" w:cs="Segoe UI Semibold"/>
@@ -24748,7 +24657,7 @@
         </w:pBdr>
         <w:spacing w:before="300" w:after="100" w:line="276" w:lineRule="auto"/>
       </w:pPr>
-      <w:bookmarkStart w:id="31" w:name="_Toc236790556"/>
+      <w:bookmarkStart w:id="31" w:name="_Toc239422402"/>
       <w:r>
         <w:rPr>
           <w:rFonts w:ascii="Segoe UI Semibold" w:eastAsia="Segoe UI Semibold" w:hAnsi="Segoe UI Semibold" w:cs="Segoe UI Semibold"/>
@@ -25841,7 +25750,7 @@
               <w:pStyle w:val="Heading1"/>
               <w:spacing w:before="0" w:line="252" w:lineRule="auto"/>
             </w:pPr>
-            <w:bookmarkStart w:id="32" w:name="_Toc236790557"/>
+            <w:bookmarkStart w:id="32" w:name="_Toc239422403"/>
             <w:r>
               <w:rPr>
                 <w:rFonts w:ascii="Segoe UI" w:eastAsia="Segoe UI" w:hAnsi="Segoe UI" w:cs="Segoe UI"/>
@@ -25876,7 +25785,7 @@
         </w:pBdr>
         <w:spacing w:before="300" w:after="100" w:line="276" w:lineRule="auto"/>
       </w:pPr>
-      <w:bookmarkStart w:id="33" w:name="_Toc236790558"/>
+      <w:bookmarkStart w:id="33" w:name="_Toc239422404"/>
       <w:r>
         <w:rPr>
           <w:rFonts w:ascii="Segoe UI Semibold" w:eastAsia="Segoe UI Semibold" w:hAnsi="Segoe UI Semibold" w:cs="Segoe UI Semibold"/>
@@ -25897,16 +25806,7 @@
           <w:color w:val="6D28D9"/>
           <w:sz w:val="18"/>
         </w:rPr>
-        <w:t>▪</w:t>
-      </w:r>
-      <w:r>
-        <w:rPr>
-          <w:rFonts w:ascii="Segoe UI" w:eastAsia="Segoe UI" w:hAnsi="Segoe UI" w:cs="Segoe UI"/>
-          <w:b/>
-          <w:color w:val="6D28D9"/>
-          <w:sz w:val="18"/>
-        </w:rPr>
-        <w:t xml:space="preserve">  </w:t>
+        <w:t xml:space="preserve">▪  </w:t>
       </w:r>
       <w:r>
         <w:rPr>
@@ -25980,16 +25880,7 @@
           <w:color w:val="6D28D9"/>
           <w:sz w:val="18"/>
         </w:rPr>
-        <w:t>▪</w:t>
-      </w:r>
-      <w:r>
-        <w:rPr>
-          <w:rFonts w:ascii="Segoe UI" w:eastAsia="Segoe UI" w:hAnsi="Segoe UI" w:cs="Segoe UI"/>
-          <w:b/>
-          <w:color w:val="6D28D9"/>
-          <w:sz w:val="18"/>
-        </w:rPr>
-        <w:t xml:space="preserve">  </w:t>
+        <w:t xml:space="preserve">▪  </w:t>
       </w:r>
       <w:r>
         <w:rPr>
@@ -26033,16 +25924,7 @@
           <w:color w:val="6D28D9"/>
           <w:sz w:val="18"/>
         </w:rPr>
-        <w:t>▪</w:t>
-      </w:r>
-      <w:r>
-        <w:rPr>
-          <w:rFonts w:ascii="Segoe UI" w:eastAsia="Segoe UI" w:hAnsi="Segoe UI" w:cs="Segoe UI"/>
-          <w:b/>
-          <w:color w:val="6D28D9"/>
-          <w:sz w:val="18"/>
-        </w:rPr>
-        <w:t xml:space="preserve">  </w:t>
+        <w:t xml:space="preserve">▪  </w:t>
       </w:r>
       <w:r>
         <w:rPr>
@@ -26086,16 +25968,7 @@
           <w:color w:val="6D28D9"/>
           <w:sz w:val="18"/>
         </w:rPr>
-        <w:t>▪</w:t>
-      </w:r>
-      <w:r>
-        <w:rPr>
-          <w:rFonts w:ascii="Segoe UI" w:eastAsia="Segoe UI" w:hAnsi="Segoe UI" w:cs="Segoe UI"/>
-          <w:b/>
-          <w:color w:val="6D28D9"/>
-          <w:sz w:val="18"/>
-        </w:rPr>
-        <w:t xml:space="preserve">  </w:t>
+        <w:t xml:space="preserve">▪  </w:t>
       </w:r>
       <w:r>
         <w:rPr>
@@ -26124,16 +25997,7 @@
           <w:color w:val="6D28D9"/>
           <w:sz w:val="18"/>
         </w:rPr>
-        <w:t>▪</w:t>
-      </w:r>
-      <w:r>
-        <w:rPr>
-          <w:rFonts w:ascii="Segoe UI" w:eastAsia="Segoe UI" w:hAnsi="Segoe UI" w:cs="Segoe UI"/>
-          <w:b/>
-          <w:color w:val="6D28D9"/>
-          <w:sz w:val="18"/>
-        </w:rPr>
-        <w:t xml:space="preserve">  </w:t>
+        <w:t xml:space="preserve">▪  </w:t>
       </w:r>
       <w:r>
         <w:rPr>
@@ -26188,7 +26052,7 @@
         </w:pBdr>
         <w:spacing w:before="300" w:after="100" w:line="276" w:lineRule="auto"/>
       </w:pPr>
-      <w:bookmarkStart w:id="34" w:name="_Toc236790559"/>
+      <w:bookmarkStart w:id="34" w:name="_Toc239422405"/>
       <w:r>
         <w:rPr>
           <w:rFonts w:ascii="Segoe UI Semibold" w:eastAsia="Segoe UI Semibold" w:hAnsi="Segoe UI Semibold" w:cs="Segoe UI Semibold"/>
@@ -26941,7 +26805,7 @@
         </w:pBdr>
         <w:spacing w:before="300" w:after="100" w:line="276" w:lineRule="auto"/>
       </w:pPr>
-      <w:bookmarkStart w:id="35" w:name="_Toc236790560"/>
+      <w:bookmarkStart w:id="35" w:name="_Toc239422406"/>
       <w:r>
         <w:rPr>
           <w:rFonts w:ascii="Segoe UI Semibold" w:eastAsia="Segoe UI Semibold" w:hAnsi="Segoe UI Semibold" w:cs="Segoe UI Semibold"/>
@@ -26962,16 +26826,7 @@
           <w:color w:val="6D28D9"/>
           <w:sz w:val="18"/>
         </w:rPr>
-        <w:t>▪</w:t>
-      </w:r>
-      <w:r>
-        <w:rPr>
-          <w:rFonts w:ascii="Segoe UI" w:eastAsia="Segoe UI" w:hAnsi="Segoe UI" w:cs="Segoe UI"/>
-          <w:b/>
-          <w:color w:val="6D28D9"/>
-          <w:sz w:val="18"/>
-        </w:rPr>
-        <w:t xml:space="preserve">  </w:t>
+        <w:t xml:space="preserve">▪  </w:t>
       </w:r>
       <w:r>
         <w:rPr>
@@ -27015,16 +26870,7 @@
           <w:color w:val="6D28D9"/>
           <w:sz w:val="18"/>
         </w:rPr>
-        <w:t>▪</w:t>
-      </w:r>
-      <w:r>
-        <w:rPr>
-          <w:rFonts w:ascii="Segoe UI" w:eastAsia="Segoe UI" w:hAnsi="Segoe UI" w:cs="Segoe UI"/>
-          <w:b/>
-          <w:color w:val="6D28D9"/>
-          <w:sz w:val="18"/>
-        </w:rPr>
-        <w:t xml:space="preserve">  </w:t>
+        <w:t xml:space="preserve">▪  </w:t>
       </w:r>
       <w:r>
         <w:rPr>
@@ -27053,16 +26899,7 @@
           <w:color w:val="6D28D9"/>
           <w:sz w:val="18"/>
         </w:rPr>
-        <w:t>▪</w:t>
-      </w:r>
-      <w:r>
-        <w:rPr>
-          <w:rFonts w:ascii="Segoe UI" w:eastAsia="Segoe UI" w:hAnsi="Segoe UI" w:cs="Segoe UI"/>
-          <w:b/>
-          <w:color w:val="6D28D9"/>
-          <w:sz w:val="18"/>
-        </w:rPr>
-        <w:t xml:space="preserve">  </w:t>
+        <w:t xml:space="preserve">▪  </w:t>
       </w:r>
       <w:r>
         <w:rPr>
@@ -27106,16 +26943,7 @@
           <w:color w:val="6D28D9"/>
           <w:sz w:val="18"/>
         </w:rPr>
-        <w:t>▪</w:t>
-      </w:r>
-      <w:r>
-        <w:rPr>
-          <w:rFonts w:ascii="Segoe UI" w:eastAsia="Segoe UI" w:hAnsi="Segoe UI" w:cs="Segoe UI"/>
-          <w:b/>
-          <w:color w:val="6D28D9"/>
-          <w:sz w:val="18"/>
-        </w:rPr>
-        <w:t xml:space="preserve">  </w:t>
+        <w:t xml:space="preserve">▪  </w:t>
       </w:r>
       <w:r>
         <w:rPr>
@@ -27159,16 +26987,7 @@
           <w:color w:val="6D28D9"/>
           <w:sz w:val="18"/>
         </w:rPr>
-        <w:t>▪</w:t>
-      </w:r>
-      <w:r>
-        <w:rPr>
-          <w:rFonts w:ascii="Segoe UI" w:eastAsia="Segoe UI" w:hAnsi="Segoe UI" w:cs="Segoe UI"/>
-          <w:b/>
-          <w:color w:val="6D28D9"/>
-          <w:sz w:val="18"/>
-        </w:rPr>
-        <w:t xml:space="preserve">  </w:t>
+        <w:t xml:space="preserve">▪  </w:t>
       </w:r>
       <w:r>
         <w:rPr>
@@ -27197,16 +27016,7 @@
           <w:color w:val="6D28D9"/>
           <w:sz w:val="18"/>
         </w:rPr>
-        <w:t>▪</w:t>
-      </w:r>
-      <w:r>
-        <w:rPr>
-          <w:rFonts w:ascii="Segoe UI" w:eastAsia="Segoe UI" w:hAnsi="Segoe UI" w:cs="Segoe UI"/>
-          <w:b/>
-          <w:color w:val="6D28D9"/>
-          <w:sz w:val="18"/>
-        </w:rPr>
-        <w:t xml:space="preserve">  </w:t>
+        <w:t xml:space="preserve">▪  </w:t>
       </w:r>
       <w:r>
         <w:rPr>
@@ -27235,16 +27045,7 @@
           <w:color w:val="6D28D9"/>
           <w:sz w:val="18"/>
         </w:rPr>
-        <w:t>▪</w:t>
-      </w:r>
-      <w:r>
-        <w:rPr>
-          <w:rFonts w:ascii="Segoe UI" w:eastAsia="Segoe UI" w:hAnsi="Segoe UI" w:cs="Segoe UI"/>
-          <w:b/>
-          <w:color w:val="6D28D9"/>
-          <w:sz w:val="18"/>
-        </w:rPr>
-        <w:t xml:space="preserve">  </w:t>
+        <w:t xml:space="preserve">▪  </w:t>
       </w:r>
       <w:r>
         <w:rPr>
@@ -27269,7 +27070,7 @@
         </w:pBdr>
         <w:spacing w:before="300" w:after="100" w:line="276" w:lineRule="auto"/>
       </w:pPr>
-      <w:bookmarkStart w:id="36" w:name="_Toc236790561"/>
+      <w:bookmarkStart w:id="36" w:name="_Toc239422407"/>
       <w:r>
         <w:rPr>
           <w:rFonts w:ascii="Segoe UI Semibold" w:eastAsia="Segoe UI Semibold" w:hAnsi="Segoe UI Semibold" w:cs="Segoe UI Semibold"/>
@@ -28380,7 +28181,7 @@
         </w:pBdr>
         <w:spacing w:before="300" w:after="100" w:line="276" w:lineRule="auto"/>
       </w:pPr>
-      <w:bookmarkStart w:id="37" w:name="_Toc236790562"/>
+      <w:bookmarkStart w:id="37" w:name="_Toc239422408"/>
       <w:r>
         <w:rPr>
           <w:rFonts w:ascii="Segoe UI Semibold" w:eastAsia="Segoe UI Semibold" w:hAnsi="Segoe UI Semibold" w:cs="Segoe UI Semibold"/>
@@ -28401,16 +28202,7 @@
           <w:color w:val="6D28D9"/>
           <w:sz w:val="18"/>
         </w:rPr>
-        <w:t>▪</w:t>
-      </w:r>
-      <w:r>
-        <w:rPr>
-          <w:rFonts w:ascii="Segoe UI" w:eastAsia="Segoe UI" w:hAnsi="Segoe UI" w:cs="Segoe UI"/>
-          <w:b/>
-          <w:color w:val="6D28D9"/>
-          <w:sz w:val="18"/>
-        </w:rPr>
-        <w:t xml:space="preserve">  </w:t>
+        <w:t xml:space="preserve">▪  </w:t>
       </w:r>
       <w:r>
         <w:rPr>
@@ -28431,16 +28223,7 @@
           <w:color w:val="6D28D9"/>
           <w:sz w:val="18"/>
         </w:rPr>
-        <w:t>▪</w:t>
-      </w:r>
-      <w:r>
-        <w:rPr>
-          <w:rFonts w:ascii="Segoe UI" w:eastAsia="Segoe UI" w:hAnsi="Segoe UI" w:cs="Segoe UI"/>
-          <w:b/>
-          <w:color w:val="6D28D9"/>
-          <w:sz w:val="18"/>
-        </w:rPr>
-        <w:t xml:space="preserve">  </w:t>
+        <w:t xml:space="preserve">▪  </w:t>
       </w:r>
       <w:r>
         <w:rPr>
@@ -28485,16 +28268,7 @@
           <w:color w:val="6D28D9"/>
           <w:sz w:val="18"/>
         </w:rPr>
-        <w:t>▪</w:t>
-      </w:r>
-      <w:r>
-        <w:rPr>
-          <w:rFonts w:ascii="Segoe UI" w:eastAsia="Segoe UI" w:hAnsi="Segoe UI" w:cs="Segoe UI"/>
-          <w:b/>
-          <w:color w:val="6D28D9"/>
-          <w:sz w:val="18"/>
-        </w:rPr>
-        <w:t xml:space="preserve">  </w:t>
+        <w:t xml:space="preserve">▪  </w:t>
       </w:r>
       <w:r>
         <w:rPr>
@@ -28588,16 +28362,7 @@
           <w:color w:val="6D28D9"/>
           <w:sz w:val="18"/>
         </w:rPr>
-        <w:t>▪</w:t>
-      </w:r>
-      <w:r>
-        <w:rPr>
-          <w:rFonts w:ascii="Segoe UI" w:eastAsia="Segoe UI" w:hAnsi="Segoe UI" w:cs="Segoe UI"/>
-          <w:b/>
-          <w:color w:val="6D28D9"/>
-          <w:sz w:val="18"/>
-        </w:rPr>
-        <w:t xml:space="preserve">  </w:t>
+        <w:t xml:space="preserve">▪  </w:t>
       </w:r>
       <w:r>
         <w:rPr>
@@ -28622,7 +28387,7 @@
         </w:pBdr>
         <w:spacing w:before="300" w:after="100" w:line="276" w:lineRule="auto"/>
       </w:pPr>
-      <w:bookmarkStart w:id="38" w:name="_Toc236790563"/>
+      <w:bookmarkStart w:id="38" w:name="_Toc239422409"/>
       <w:r>
         <w:rPr>
           <w:rFonts w:ascii="Segoe UI Semibold" w:eastAsia="Segoe UI Semibold" w:hAnsi="Segoe UI Semibold" w:cs="Segoe UI Semibold"/>
@@ -29636,7 +29401,7 @@
               <w:pStyle w:val="Heading1"/>
               <w:spacing w:before="0" w:line="252" w:lineRule="auto"/>
             </w:pPr>
-            <w:bookmarkStart w:id="39" w:name="_Toc236790564"/>
+            <w:bookmarkStart w:id="39" w:name="_Toc239422410"/>
             <w:r>
               <w:rPr>
                 <w:rFonts w:ascii="Segoe UI" w:eastAsia="Segoe UI" w:hAnsi="Segoe UI" w:cs="Segoe UI"/>
@@ -29679,7 +29444,7 @@
         </w:pBdr>
         <w:spacing w:before="300" w:after="100" w:line="276" w:lineRule="auto"/>
       </w:pPr>
-      <w:bookmarkStart w:id="40" w:name="_Toc236790565"/>
+      <w:bookmarkStart w:id="40" w:name="_Toc239422411"/>
       <w:r>
         <w:rPr>
           <w:rFonts w:ascii="Segoe UI Semibold" w:eastAsia="Segoe UI Semibold" w:hAnsi="Segoe UI Semibold" w:cs="Segoe UI Semibold"/>
@@ -30400,7 +30165,7 @@
         </w:pBdr>
         <w:spacing w:before="300" w:after="100" w:line="276" w:lineRule="auto"/>
       </w:pPr>
-      <w:bookmarkStart w:id="41" w:name="_Toc236790566"/>
+      <w:bookmarkStart w:id="41" w:name="_Toc239422412"/>
       <w:r>
         <w:rPr>
           <w:rFonts w:ascii="Segoe UI Semibold" w:eastAsia="Segoe UI Semibold" w:hAnsi="Segoe UI Semibold" w:cs="Segoe UI Semibold"/>
@@ -30421,16 +30186,7 @@
           <w:color w:val="6D28D9"/>
           <w:sz w:val="18"/>
         </w:rPr>
-        <w:t>▪</w:t>
-      </w:r>
-      <w:r>
-        <w:rPr>
-          <w:rFonts w:ascii="Segoe UI" w:eastAsia="Segoe UI" w:hAnsi="Segoe UI" w:cs="Segoe UI"/>
-          <w:b/>
-          <w:color w:val="6D28D9"/>
-          <w:sz w:val="18"/>
-        </w:rPr>
-        <w:t xml:space="preserve">  </w:t>
+        <w:t xml:space="preserve">▪  </w:t>
       </w:r>
       <w:r>
         <w:rPr>
@@ -30465,16 +30221,7 @@
           <w:color w:val="6D28D9"/>
           <w:sz w:val="18"/>
         </w:rPr>
-        <w:t>▪</w:t>
-      </w:r>
-      <w:r>
-        <w:rPr>
-          <w:rFonts w:ascii="Segoe UI" w:eastAsia="Segoe UI" w:hAnsi="Segoe UI" w:cs="Segoe UI"/>
-          <w:b/>
-          <w:color w:val="6D28D9"/>
-          <w:sz w:val="18"/>
-        </w:rPr>
-        <w:t xml:space="preserve">  </w:t>
+        <w:t xml:space="preserve">▪  </w:t>
       </w:r>
       <w:r>
         <w:rPr>
@@ -30495,16 +30242,7 @@
           <w:color w:val="6D28D9"/>
           <w:sz w:val="18"/>
         </w:rPr>
-        <w:t>▪</w:t>
-      </w:r>
-      <w:r>
-        <w:rPr>
-          <w:rFonts w:ascii="Segoe UI" w:eastAsia="Segoe UI" w:hAnsi="Segoe UI" w:cs="Segoe UI"/>
-          <w:b/>
-          <w:color w:val="6D28D9"/>
-          <w:sz w:val="18"/>
-        </w:rPr>
-        <w:t xml:space="preserve">  </w:t>
+        <w:t xml:space="preserve">▪  </w:t>
       </w:r>
       <w:r>
         <w:rPr>
@@ -30555,16 +30293,7 @@
           <w:color w:val="6D28D9"/>
           <w:sz w:val="18"/>
         </w:rPr>
-        <w:t>▪</w:t>
-      </w:r>
-      <w:r>
-        <w:rPr>
-          <w:rFonts w:ascii="Segoe UI" w:eastAsia="Segoe UI" w:hAnsi="Segoe UI" w:cs="Segoe UI"/>
-          <w:b/>
-          <w:color w:val="6D28D9"/>
-          <w:sz w:val="18"/>
-        </w:rPr>
-        <w:t xml:space="preserve">  </w:t>
+        <w:t xml:space="preserve">▪  </w:t>
       </w:r>
       <w:r>
         <w:rPr>
@@ -30740,7 +30469,7 @@
               <w:pStyle w:val="Heading1"/>
               <w:spacing w:before="0" w:line="252" w:lineRule="auto"/>
             </w:pPr>
-            <w:bookmarkStart w:id="42" w:name="_Toc236790567"/>
+            <w:bookmarkStart w:id="42" w:name="_Toc239422413"/>
             <w:r>
               <w:rPr>
                 <w:rFonts w:ascii="Segoe UI" w:eastAsia="Segoe UI" w:hAnsi="Segoe UI" w:cs="Segoe UI"/>
@@ -30984,23 +30713,7 @@
                 <w:rFonts w:cs="Georgia"/>
                 <w:sz w:val="18"/>
               </w:rPr>
-              <w:t xml:space="preserve">Washout trigger — confirm the </w:t>
-            </w:r>
-            <w:r>
-              <w:rPr>
-                <w:rFonts w:ascii="Consolas" w:eastAsia="Consolas" w:hAnsi="Consolas" w:cs="Consolas"/>
-                <w:color w:val="6D28D9"/>
-                <w:sz w:val="16"/>
-                <w:shd w:val="clear" w:color="auto" w:fill="F1F5F9"/>
-              </w:rPr>
-              <w:t>today_* &gt; 0</w:t>
-            </w:r>
-            <w:r>
-              <w:rPr>
-                <w:rFonts w:cs="Georgia"/>
-                <w:sz w:val="18"/>
-              </w:rPr>
-              <w:t xml:space="preserve"> guard is the intended rule.</w:t>
+              <w:t>RESOLVED — Washout rule confirmed: today-first consumption; old carry never washes; only today’s unmatched business washes; strong/weak on totals; weak-no-wash → strong-no-wash. Implemented in §5.1.</w:t>
             </w:r>
           </w:p>
         </w:tc>
@@ -31029,7 +30742,7 @@
                 <w:rFonts w:cs="Georgia"/>
                 <w:sz w:val="18"/>
               </w:rPr>
-              <w:t>BPI engine sign-off</w:t>
+              <w:t>—</w:t>
             </w:r>
           </w:p>
         </w:tc>
@@ -31058,7 +30771,7 @@
                 <w:rFonts w:cs="Georgia"/>
                 <w:sz w:val="18"/>
               </w:rPr>
-              <w:t>Client</w:t>
+              <w:t>Closed</w:t>
             </w:r>
           </w:p>
         </w:tc>
@@ -31125,7 +30838,7 @@
                 <w:rFonts w:cs="Georgia"/>
                 <w:sz w:val="18"/>
               </w:rPr>
-              <w:t>Sponsor not in the placement upline — does a team point still accrue, and on which side?</w:t>
+              <w:t>Sponsor not in the placement upline — does a team point still accrue, and on which side? (Chain-drill se ye case banna nahi chahiye; defensive handling chahiye.)</w:t>
             </w:r>
           </w:p>
         </w:tc>
@@ -31250,7 +30963,7 @@
                 <w:rFonts w:cs="Georgia"/>
                 <w:sz w:val="18"/>
               </w:rPr>
-              <w:t>Washout figure reported: 394 (client sheet) vs 441 (arithmetic).</w:t>
+              <w:t>RESOLVED — Washout figure is 394. Client sheet aur naya algorithm dono match karte hain; purana 441 galat consumption order se aaya tha.</w:t>
             </w:r>
           </w:p>
         </w:tc>
@@ -31279,7 +30992,7 @@
                 <w:rFonts w:cs="Georgia"/>
                 <w:sz w:val="18"/>
               </w:rPr>
-              <w:t>Report wording only — no state impact</w:t>
+              <w:t>—</w:t>
             </w:r>
           </w:p>
         </w:tc>
@@ -31308,7 +31021,7 @@
                 <w:rFonts w:cs="Georgia"/>
                 <w:sz w:val="18"/>
               </w:rPr>
-              <w:t>Client</w:t>
+              <w:t>Closed</w:t>
             </w:r>
           </w:p>
         </w:tc>
@@ -31375,7 +31088,7 @@
                 <w:rFonts w:cs="Georgia"/>
                 <w:sz w:val="18"/>
               </w:rPr>
-              <w:t>Cap-out vs washout — are these two distinct ledgers?</w:t>
+              <w:t>Cap-out vs washout — are these two distinct ledgers? Detail flow abhi aana hai.</w:t>
             </w:r>
           </w:p>
         </w:tc>
@@ -31500,7 +31213,7 @@
                 <w:rFonts w:cs="Georgia"/>
                 <w:sz w:val="18"/>
               </w:rPr>
-              <w:t>Bill cancellation / stock return — clawback policy for already-paid incentives.</w:t>
+              <w:t>RESOLVED — Bill cancel / stock return: poora flow reverse, compensating entries se. Dekho §4.4.</w:t>
             </w:r>
           </w:p>
         </w:tc>
@@ -31529,7 +31242,7 @@
                 <w:rFonts w:cs="Georgia"/>
                 <w:sz w:val="18"/>
               </w:rPr>
-              <w:t>Compensating-entry design</w:t>
+              <w:t>—</w:t>
             </w:r>
           </w:p>
         </w:tc>
@@ -31558,7 +31271,7 @@
                 <w:rFonts w:cs="Georgia"/>
                 <w:sz w:val="18"/>
               </w:rPr>
-              <w:t>Client</w:t>
+              <w:t>Closed</w:t>
             </w:r>
           </w:p>
         </w:tc>
@@ -31625,7 +31338,7 @@
                 <w:rFonts w:cs="Georgia"/>
                 <w:sz w:val="18"/>
               </w:rPr>
-              <w:t>Payout disbursement — gateway, frequency, TDS/admin deduction, minimum withdrawal.</w:t>
+              <w:t>RESOLVED — Payout: mahine me ek baar, closing ke 10 din ke andar, TDS 2%. Gateway abhi choose karna hai.</w:t>
             </w:r>
           </w:p>
         </w:tc>
@@ -31655,7 +31368,7 @@
                 <w:rFonts w:cs="Georgia"/>
                 <w:sz w:val="18"/>
               </w:rPr>
-              <w:t>Payout module</w:t>
+              <w:t>Payout module (gateway only)</w:t>
             </w:r>
           </w:p>
         </w:tc>
@@ -31685,7 +31398,7 @@
                 <w:rFonts w:cs="Georgia"/>
                 <w:sz w:val="18"/>
               </w:rPr>
-              <w:t>Client</w:t>
+              <w:t>Engineering</w:t>
             </w:r>
           </w:p>
         </w:tc>
@@ -31750,7 +31463,7 @@
                 <w:rFonts w:cs="Georgia"/>
                 <w:sz w:val="18"/>
               </w:rPr>
-              <w:t>GV and CV semantics — PV rules are precise; GV/CV need the same definition.</w:t>
+              <w:t>GV aur CV semantics — PV rules precise hain; GV Achiever pool turnover me use hota hai; CV ki definition abhi baaki hai.</w:t>
             </w:r>
           </w:p>
         </w:tc>
@@ -31875,7 +31588,7 @@
                 <w:rFonts w:cs="Georgia"/>
                 <w:sz w:val="18"/>
               </w:rPr>
-              <w:t>Fund-request rejection — is the deposit returned or does the request simply close?</w:t>
+              <w:t>RESOLVED — Fund-request rejection: paisa wapas (refund).</w:t>
             </w:r>
           </w:p>
         </w:tc>
@@ -31905,7 +31618,7 @@
                 <w:rFonts w:cs="Georgia"/>
                 <w:sz w:val="18"/>
               </w:rPr>
-              <w:t>Wallet state machine</w:t>
+              <w:t>—</w:t>
             </w:r>
           </w:p>
         </w:tc>
@@ -31935,7 +31648,7 @@
                 <w:rFonts w:cs="Georgia"/>
                 <w:sz w:val="18"/>
               </w:rPr>
-              <w:t>Client</w:t>
+              <w:t>Closed</w:t>
             </w:r>
           </w:p>
         </w:tc>
@@ -32252,14 +31965,7 @@
                 <w:color w:val="0F172A"/>
                 <w:sz w:val="18"/>
               </w:rPr>
-              <w:t>Price ladder conflict</w:t>
-            </w:r>
-            <w:r>
-              <w:rPr>
-                <w:rFonts w:cs="Georgia"/>
-                <w:sz w:val="18"/>
-              </w:rPr>
-              <w:t xml:space="preserve"> — spec 700/725/750/800 vs handwritten note 670/700/750/800.</w:t>
+              <w:t>RESOLVED — Price ladder conflict khatam: prices aur commission product-level data hain, hardcode nahi. Numbers sirf seed example.</w:t>
             </w:r>
           </w:p>
         </w:tc>
@@ -32288,7 +31994,7 @@
                 <w:rFonts w:cs="Georgia"/>
                 <w:sz w:val="18"/>
               </w:rPr>
-              <w:t>Commission engine (data only)</w:t>
+              <w:t>—</w:t>
             </w:r>
           </w:p>
         </w:tc>
@@ -32317,7 +32023,7 @@
                 <w:rFonts w:cs="Georgia"/>
                 <w:sz w:val="18"/>
               </w:rPr>
-              <w:t>Client</w:t>
+              <w:t>Closed</w:t>
             </w:r>
           </w:p>
         </w:tc>
@@ -32384,7 +32090,7 @@
                 <w:rFonts w:cs="Georgia"/>
                 <w:sz w:val="18"/>
               </w:rPr>
-              <w:t>Mini-WH buy price ₹685 (margin ₹15) — abhi bhi sahi?</w:t>
+              <w:t>RESOLVED — Mini-WH margin bhi product-level data hai, isliye ye ab data question hai, design question nahi.</w:t>
             </w:r>
           </w:p>
         </w:tc>
@@ -32414,7 +32120,7 @@
                 <w:rFonts w:cs="Georgia"/>
                 <w:sz w:val="18"/>
               </w:rPr>
-              <w:t>Commission engine</w:t>
+              <w:t>—</w:t>
             </w:r>
           </w:p>
         </w:tc>
@@ -32444,7 +32150,7 @@
                 <w:rFonts w:cs="Georgia"/>
                 <w:sz w:val="18"/>
               </w:rPr>
-              <w:t>Client</w:t>
+              <w:t>Closed</w:t>
             </w:r>
           </w:p>
         </w:tc>
@@ -32511,14 +32217,7 @@
                 <w:sz w:val="16"/>
                 <w:shd w:val="clear" w:color="auto" w:fill="F1F5F9"/>
               </w:rPr>
-              <w:t>retail_profit</w:t>
-            </w:r>
-            <w:r>
-              <w:rPr>
-                <w:rFonts w:cs="Georgia"/>
-                <w:sz w:val="18"/>
-              </w:rPr>
-              <w:t xml:space="preserve"> kabhi withdraw ho payega ya hamesha view-only?</w:t>
+              <w:t>retail_profit kabhi withdraw ho payega ya hamesha view-only?</w:t>
             </w:r>
           </w:p>
         </w:tc>
@@ -32595,7 +32294,7 @@
         </w:pBdr>
         <w:spacing w:before="300" w:after="100" w:line="276" w:lineRule="auto"/>
       </w:pPr>
-      <w:bookmarkStart w:id="43" w:name="_Toc236790568"/>
+      <w:bookmarkStart w:id="43" w:name="_Toc239422414"/>
       <w:r>
         <w:rPr>
           <w:rFonts w:ascii="Segoe UI Semibold" w:eastAsia="Segoe UI Semibold" w:hAnsi="Segoe UI Semibold" w:cs="Segoe UI Semibold"/>
@@ -33168,6 +32867,266 @@
                 <w:sz w:val="18"/>
               </w:rPr>
               <w:t>The plan will change; history must remain reproducible.</w:t>
+            </w:r>
+          </w:p>
+        </w:tc>
+      </w:tr>
+      <w:tr>
+        <w:trPr>
+          <w:jc w:val="center"/>
+        </w:trPr>
+        <w:tc>
+          <w:tcPr>
+            <w:tcW w:w="3384" w:type="dxa"/>
+            <w:tcBorders>
+              <w:top w:val="nil"/>
+              <w:left w:val="nil"/>
+              <w:bottom w:val="single" w:sz="4" w:space="0" w:color="E2E8F0"/>
+              <w:right w:val="nil"/>
+            </w:tcBorders>
+            <w:tcMar>
+              <w:top w:w="95" w:type="dxa"/>
+              <w:left w:w="130" w:type="dxa"/>
+              <w:bottom w:w="95" w:type="dxa"/>
+              <w:right w:w="130" w:type="dxa"/>
+            </w:tcMar>
+          </w:tcPr>
+          <w:p>
+            <w:pPr>
+              <w:spacing w:after="0" w:line="307" w:lineRule="auto"/>
+            </w:pPr>
+            <w:r>
+              <w:rPr>
+                <w:rFonts w:ascii="Segoe UI" w:eastAsia="Segoe UI" w:hAnsi="Segoe UI" w:cs="Segoe UI"/>
+                <w:b/>
+                <w:color w:val="0F172A"/>
+                <w:sz w:val="18"/>
+              </w:rPr>
+              <w:t>L2 aur L3 dono L1 ke direct children</w:t>
+            </w:r>
+          </w:p>
+        </w:tc>
+        <w:tc>
+          <w:tcPr>
+            <w:tcW w:w="6120" w:type="dxa"/>
+            <w:tcBorders>
+              <w:top w:val="nil"/>
+              <w:left w:val="nil"/>
+              <w:bottom w:val="single" w:sz="4" w:space="0" w:color="E2E8F0"/>
+              <w:right w:val="nil"/>
+            </w:tcBorders>
+            <w:tcMar>
+              <w:top w:w="95" w:type="dxa"/>
+              <w:left w:w="130" w:type="dxa"/>
+              <w:bottom w:w="95" w:type="dxa"/>
+              <w:right w:w="130" w:type="dxa"/>
+            </w:tcMar>
+          </w:tcPr>
+          <w:p>
+            <w:pPr>
+              <w:spacing w:after="0" w:line="307" w:lineRule="auto"/>
+            </w:pPr>
+            <w:r>
+              <w:rPr>
+                <w:rFonts w:cs="Georgia"/>
+                <w:sz w:val="18"/>
+              </w:rPr>
+              <w:t>Structure client ne badla. Location tree me dono ka parent_id = L1. Ek chain me L1+L2+L3 kabhi nahi — isliye missing-level roll-up ka concept hi khatam.</w:t>
+            </w:r>
+          </w:p>
+        </w:tc>
+      </w:tr>
+      <w:tr>
+        <w:trPr>
+          <w:jc w:val="center"/>
+        </w:trPr>
+        <w:tc>
+          <w:tcPr>
+            <w:tcW w:w="3384" w:type="dxa"/>
+            <w:tcBorders>
+              <w:top w:val="nil"/>
+              <w:left w:val="nil"/>
+              <w:bottom w:val="single" w:sz="4" w:space="0" w:color="E2E8F0"/>
+              <w:right w:val="nil"/>
+            </w:tcBorders>
+            <w:tcMar>
+              <w:top w:w="95" w:type="dxa"/>
+              <w:left w:w="130" w:type="dxa"/>
+              <w:bottom w:w="95" w:type="dxa"/>
+              <w:right w:w="130" w:type="dxa"/>
+            </w:tcMar>
+          </w:tcPr>
+          <w:p>
+            <w:pPr>
+              <w:spacing w:after="0" w:line="307" w:lineRule="auto"/>
+            </w:pPr>
+            <w:r>
+              <w:rPr>
+                <w:rFonts w:ascii="Segoe UI" w:eastAsia="Segoe UI" w:hAnsi="Segoe UI" w:cs="Segoe UI"/>
+                <w:b/>
+                <w:color w:val="0F172A"/>
+                <w:sz w:val="18"/>
+              </w:rPr>
+              <w:t>Postpaid (L1) vs Prepaid (L2/L3)</w:t>
+            </w:r>
+          </w:p>
+        </w:tc>
+        <w:tc>
+          <w:tcPr>
+            <w:tcW w:w="6120" w:type="dxa"/>
+            <w:tcBorders>
+              <w:top w:val="nil"/>
+              <w:left w:val="nil"/>
+              <w:bottom w:val="single" w:sz="4" w:space="0" w:color="E2E8F0"/>
+              <w:right w:val="nil"/>
+            </w:tcBorders>
+            <w:tcMar>
+              <w:top w:w="95" w:type="dxa"/>
+              <w:left w:w="130" w:type="dxa"/>
+              <w:bottom w:w="95" w:type="dxa"/>
+              <w:right w:w="130" w:type="dxa"/>
+            </w:tcMar>
+          </w:tcPr>
+          <w:p>
+            <w:pPr>
+              <w:spacing w:after="0" w:line="307" w:lineRule="auto"/>
+            </w:pPr>
+            <w:r>
+              <w:rPr>
+                <w:rFonts w:cs="Georgia"/>
+                <w:sz w:val="18"/>
+              </w:rPr>
+              <w:t>Do alag capability sets, ek hi levels table me flags se. L1 hata diya gaya.</w:t>
+            </w:r>
+          </w:p>
+        </w:tc>
+      </w:tr>
+      <w:tr>
+        <w:trPr>
+          <w:jc w:val="center"/>
+        </w:trPr>
+        <w:tc>
+          <w:tcPr>
+            <w:tcW w:w="3384" w:type="dxa"/>
+            <w:tcBorders>
+              <w:top w:val="nil"/>
+              <w:left w:val="nil"/>
+              <w:bottom w:val="single" w:sz="4" w:space="0" w:color="E2E8F0"/>
+              <w:right w:val="nil"/>
+            </w:tcBorders>
+            <w:tcMar>
+              <w:top w:w="95" w:type="dxa"/>
+              <w:left w:w="130" w:type="dxa"/>
+              <w:bottom w:w="95" w:type="dxa"/>
+              <w:right w:w="130" w:type="dxa"/>
+            </w:tcMar>
+          </w:tcPr>
+          <w:p>
+            <w:pPr>
+              <w:spacing w:after="0" w:line="307" w:lineRule="auto"/>
+            </w:pPr>
+            <w:r>
+              <w:rPr>
+                <w:rFonts w:ascii="Segoe UI" w:eastAsia="Segoe UI" w:hAnsi="Segoe UI" w:cs="Segoe UI"/>
+                <w:b/>
+                <w:color w:val="0F172A"/>
+                <w:sz w:val="18"/>
+              </w:rPr>
+              <w:t>Washout: today-first, carry never washes</w:t>
+            </w:r>
+          </w:p>
+        </w:tc>
+        <w:tc>
+          <w:tcPr>
+            <w:tcW w:w="6120" w:type="dxa"/>
+            <w:tcBorders>
+              <w:top w:val="nil"/>
+              <w:left w:val="nil"/>
+              <w:bottom w:val="single" w:sz="4" w:space="0" w:color="E2E8F0"/>
+              <w:right w:val="nil"/>
+            </w:tcBorders>
+            <w:tcMar>
+              <w:top w:w="95" w:type="dxa"/>
+              <w:left w:w="130" w:type="dxa"/>
+              <w:bottom w:w="95" w:type="dxa"/>
+              <w:right w:w="130" w:type="dxa"/>
+            </w:tcMar>
+          </w:tcPr>
+          <w:p>
+            <w:pPr>
+              <w:spacing w:after="0" w:line="307" w:lineRule="auto"/>
+            </w:pPr>
+            <w:r>
+              <w:rPr>
+                <w:rFonts w:cs="Georgia"/>
+                <w:sz w:val="18"/>
+              </w:rPr>
+              <w:t>Client ke chaar examples aur unki purani sheet dono isi order se reproduce hote hain.</w:t>
+            </w:r>
+          </w:p>
+        </w:tc>
+      </w:tr>
+      <w:tr>
+        <w:trPr>
+          <w:jc w:val="center"/>
+        </w:trPr>
+        <w:tc>
+          <w:tcPr>
+            <w:tcW w:w="3384" w:type="dxa"/>
+            <w:tcBorders>
+              <w:top w:val="nil"/>
+              <w:left w:val="nil"/>
+              <w:bottom w:val="single" w:sz="4" w:space="0" w:color="E2E8F0"/>
+              <w:right w:val="nil"/>
+            </w:tcBorders>
+            <w:tcMar>
+              <w:top w:w="95" w:type="dxa"/>
+              <w:left w:w="130" w:type="dxa"/>
+              <w:bottom w:w="95" w:type="dxa"/>
+              <w:right w:w="130" w:type="dxa"/>
+            </w:tcMar>
+          </w:tcPr>
+          <w:p>
+            <w:pPr>
+              <w:spacing w:after="0" w:line="307" w:lineRule="auto"/>
+            </w:pPr>
+            <w:r>
+              <w:rPr>
+                <w:rFonts w:ascii="Segoe UI" w:eastAsia="Segoe UI" w:hAnsi="Segoe UI" w:cs="Segoe UI"/>
+                <w:b/>
+                <w:color w:val="0F172A"/>
+                <w:sz w:val="18"/>
+              </w:rPr>
+              <w:t>Direct aur Direct Team alag point types</w:t>
+            </w:r>
+          </w:p>
+        </w:tc>
+        <w:tc>
+          <w:tcPr>
+            <w:tcW w:w="6120" w:type="dxa"/>
+            <w:tcBorders>
+              <w:top w:val="nil"/>
+              <w:left w:val="nil"/>
+              <w:bottom w:val="single" w:sz="4" w:space="0" w:color="E2E8F0"/>
+              <w:right w:val="nil"/>
+            </w:tcBorders>
+            <w:tcMar>
+              <w:top w:w="95" w:type="dxa"/>
+              <w:left w:w="130" w:type="dxa"/>
+              <w:bottom w:w="95" w:type="dxa"/>
+              <w:right w:w="130" w:type="dxa"/>
+            </w:tcMar>
+          </w:tcPr>
+          <w:p>
+            <w:pPr>
+              <w:spacing w:after="0" w:line="307" w:lineRule="auto"/>
+            </w:pPr>
+            <w:r>
+              <w:rPr>
+                <w:rFonts w:cs="Georgia"/>
+                <w:sz w:val="18"/>
+              </w:rPr>
+              <w:t>Direct = one-time qualification; Direct Team = monthly maintenance. Achievers qualification dono ko alag-alag dekhta hai.</w:t>
             </w:r>
           </w:p>
         </w:tc>
@@ -33220,7 +33179,7 @@
               <w:pStyle w:val="Heading1"/>
               <w:spacing w:before="0" w:line="252" w:lineRule="auto"/>
             </w:pPr>
-            <w:bookmarkStart w:id="44" w:name="_Toc236790569"/>
+            <w:bookmarkStart w:id="44" w:name="_Toc239422415"/>
             <w:r>
               <w:rPr>
                 <w:rFonts w:ascii="Segoe UI" w:eastAsia="Segoe UI" w:hAnsi="Segoe UI" w:cs="Segoe UI"/>
@@ -33277,7 +33236,7 @@
         </w:pBdr>
         <w:spacing w:before="300" w:after="100" w:line="276" w:lineRule="auto"/>
       </w:pPr>
-      <w:bookmarkStart w:id="45" w:name="_Toc236790570"/>
+      <w:bookmarkStart w:id="45" w:name="_Toc239422416"/>
       <w:r>
         <w:rPr>
           <w:rFonts w:ascii="Segoe UI Semibold" w:eastAsia="Segoe UI Semibold" w:hAnsi="Segoe UI Semibold" w:cs="Segoe UI Semibold"/>
@@ -33466,23 +33425,7 @@
                 <w:color w:val="E2E8F0"/>
                 <w:sz w:val="16"/>
               </w:rPr>
-              <w:t xml:space="preserve">│   ├── core/           # </w:t>
-            </w:r>
-            <w:r>
-              <w:rPr>
-                <w:rFonts w:ascii="Consolas" w:eastAsia="Consolas" w:hAnsi="Consolas" w:cs="Consolas"/>
-                <w:color w:val="E2E8F0"/>
-                <w:sz w:val="16"/>
-              </w:rPr>
-              <w:t>⭐</w:t>
-            </w:r>
-            <w:r>
-              <w:rPr>
-                <w:rFonts w:ascii="Consolas" w:eastAsia="Consolas" w:hAnsi="Consolas" w:cs="Consolas"/>
-                <w:color w:val="E2E8F0"/>
-                <w:sz w:val="16"/>
-              </w:rPr>
-              <w:t xml:space="preserve"> BUSINESS RULES — plan engine, pure functions</w:t>
+              <w:t>│   ├── core/           # ⭐ BUSINESS RULES — plan engine, pure functions</w:t>
             </w:r>
           </w:p>
           <w:p>
@@ -33743,7 +33686,7 @@
         </w:pBdr>
         <w:spacing w:before="300" w:after="100" w:line="276" w:lineRule="auto"/>
       </w:pPr>
-      <w:bookmarkStart w:id="46" w:name="_Toc236790571"/>
+      <w:bookmarkStart w:id="46" w:name="_Toc239422417"/>
       <w:r>
         <w:rPr>
           <w:rFonts w:ascii="Segoe UI Semibold" w:eastAsia="Segoe UI Semibold" w:hAnsi="Segoe UI Semibold" w:cs="Segoe UI Semibold"/>
@@ -34580,7 +34523,7 @@
         </w:pBdr>
         <w:spacing w:before="300" w:after="100" w:line="276" w:lineRule="auto"/>
       </w:pPr>
-      <w:bookmarkStart w:id="47" w:name="_Toc236790572"/>
+      <w:bookmarkStart w:id="47" w:name="_Toc239422418"/>
       <w:r>
         <w:rPr>
           <w:rFonts w:ascii="Segoe UI Semibold" w:eastAsia="Segoe UI Semibold" w:hAnsi="Segoe UI Semibold" w:cs="Segoe UI Semibold"/>
@@ -34842,16 +34785,7 @@
                 <w:color w:val="0F172A"/>
                 <w:sz w:val="18"/>
               </w:rPr>
-              <w:t>✅</w:t>
-            </w:r>
-            <w:r>
-              <w:rPr>
-                <w:rFonts w:cs="Georgia"/>
-                <w:b/>
-                <w:color w:val="0F172A"/>
-                <w:sz w:val="18"/>
-              </w:rPr>
-              <w:t xml:space="preserve"> Indexed</w:t>
+              <w:t>✅ Indexed</w:t>
             </w:r>
           </w:p>
         </w:tc>
@@ -34982,16 +34916,7 @@
                 <w:color w:val="0F172A"/>
                 <w:sz w:val="18"/>
               </w:rPr>
-              <w:t>❌</w:t>
-            </w:r>
-            <w:r>
-              <w:rPr>
-                <w:rFonts w:cs="Georgia"/>
-                <w:b/>
-                <w:color w:val="0F172A"/>
-                <w:sz w:val="18"/>
-              </w:rPr>
-              <w:t xml:space="preserve"> Never</w:t>
+              <w:t>❌ Never</w:t>
             </w:r>
           </w:p>
         </w:tc>
@@ -35131,16 +35056,7 @@
                 <w:color w:val="0F172A"/>
                 <w:sz w:val="18"/>
               </w:rPr>
-              <w:t>❌</w:t>
-            </w:r>
-            <w:r>
-              <w:rPr>
-                <w:rFonts w:cs="Georgia"/>
-                <w:b/>
-                <w:color w:val="0F172A"/>
-                <w:sz w:val="18"/>
-              </w:rPr>
-              <w:t xml:space="preserve"> Never</w:t>
+              <w:t>❌ Never</w:t>
             </w:r>
           </w:p>
         </w:tc>
@@ -35387,27 +35303,7 @@
                 <w:spacing w:val="35"/>
                 <w:sz w:val="15"/>
               </w:rPr>
-              <w:t>⚠</w:t>
-            </w:r>
-            <w:r>
-              <w:rPr>
-                <w:rFonts w:ascii="Segoe UI" w:eastAsia="Segoe UI" w:hAnsi="Segoe UI" w:cs="Segoe UI"/>
-                <w:b/>
-                <w:color w:val="DC2626"/>
-                <w:spacing w:val="35"/>
-                <w:sz w:val="15"/>
-              </w:rPr>
-              <w:t>️</w:t>
-            </w:r>
-            <w:r>
-              <w:rPr>
-                <w:rFonts w:ascii="Segoe UI" w:eastAsia="Segoe UI" w:hAnsi="Segoe UI" w:cs="Segoe UI"/>
-                <w:b/>
-                <w:color w:val="DC2626"/>
-                <w:spacing w:val="35"/>
-                <w:sz w:val="15"/>
-              </w:rPr>
-              <w:t xml:space="preserve"> SABSE COMMON GALTI — ROBOTS.TXT INDEXING NAHI ROKTA</w:t>
+              <w:t>⚠️ SABSE COMMON GALTI — ROBOTS.TXT INDEXING NAHI ROKTA</w:t>
             </w:r>
           </w:p>
           <w:p>
@@ -35876,7 +35772,7 @@
         </w:pBdr>
         <w:spacing w:before="300" w:after="100" w:line="276" w:lineRule="auto"/>
       </w:pPr>
-      <w:bookmarkStart w:id="48" w:name="_Toc236790573"/>
+      <w:bookmarkStart w:id="48" w:name="_Toc239422419"/>
       <w:r>
         <w:rPr>
           <w:rFonts w:ascii="Segoe UI Semibold" w:eastAsia="Segoe UI Semibold" w:hAnsi="Segoe UI Semibold" w:cs="Segoe UI Semibold"/>
@@ -36560,7 +36456,7 @@
         </w:pBdr>
         <w:spacing w:before="300" w:after="100" w:line="276" w:lineRule="auto"/>
       </w:pPr>
-      <w:bookmarkStart w:id="49" w:name="_Toc236790574"/>
+      <w:bookmarkStart w:id="49" w:name="_Toc239422420"/>
       <w:r>
         <w:rPr>
           <w:rFonts w:ascii="Segoe UI Semibold" w:eastAsia="Segoe UI Semibold" w:hAnsi="Segoe UI Semibold" w:cs="Segoe UI Semibold"/>
@@ -37620,7 +37516,7 @@
         </w:pBdr>
         <w:spacing w:before="300" w:after="100" w:line="276" w:lineRule="auto"/>
       </w:pPr>
-      <w:bookmarkStart w:id="50" w:name="_Toc236790575"/>
+      <w:bookmarkStart w:id="50" w:name="_Toc239422421"/>
       <w:r>
         <w:rPr>
           <w:rFonts w:ascii="Segoe UI Semibold" w:eastAsia="Segoe UI Semibold" w:hAnsi="Segoe UI Semibold" w:cs="Segoe UI Semibold"/>
@@ -38547,7 +38443,7 @@
               <w:pStyle w:val="Heading1"/>
               <w:spacing w:before="0" w:line="252" w:lineRule="auto"/>
             </w:pPr>
-            <w:bookmarkStart w:id="51" w:name="_Toc236790576"/>
+            <w:bookmarkStart w:id="51" w:name="_Toc239422422"/>
             <w:r>
               <w:rPr>
                 <w:rFonts w:ascii="Segoe UI" w:eastAsia="Segoe UI" w:hAnsi="Segoe UI" w:cs="Segoe UI"/>
@@ -38590,7 +38486,7 @@
         </w:pBdr>
         <w:spacing w:before="300" w:after="100" w:line="276" w:lineRule="auto"/>
       </w:pPr>
-      <w:bookmarkStart w:id="52" w:name="_Toc236790577"/>
+      <w:bookmarkStart w:id="52" w:name="_Toc239422423"/>
       <w:r>
         <w:rPr>
           <w:rFonts w:ascii="Segoe UI Semibold" w:eastAsia="Segoe UI Semibold" w:hAnsi="Segoe UI Semibold" w:cs="Segoe UI Semibold"/>
@@ -39698,7 +39594,7 @@
         </w:pBdr>
         <w:spacing w:before="300" w:after="100" w:line="276" w:lineRule="auto"/>
       </w:pPr>
-      <w:bookmarkStart w:id="53" w:name="_Toc236790578"/>
+      <w:bookmarkStart w:id="53" w:name="_Toc239422424"/>
       <w:r>
         <w:rPr>
           <w:rFonts w:ascii="Segoe UI Semibold" w:eastAsia="Segoe UI Semibold" w:hAnsi="Segoe UI Semibold" w:cs="Segoe UI Semibold"/>
@@ -39719,16 +39615,7 @@
           <w:color w:val="6D28D9"/>
           <w:sz w:val="18"/>
         </w:rPr>
-        <w:t>▪</w:t>
-      </w:r>
-      <w:r>
-        <w:rPr>
-          <w:rFonts w:ascii="Segoe UI" w:eastAsia="Segoe UI" w:hAnsi="Segoe UI" w:cs="Segoe UI"/>
-          <w:b/>
-          <w:color w:val="6D28D9"/>
-          <w:sz w:val="18"/>
-        </w:rPr>
-        <w:t xml:space="preserve">  </w:t>
+        <w:t xml:space="preserve">▪  </w:t>
       </w:r>
       <w:r>
         <w:rPr>
@@ -39792,16 +39679,7 @@
           <w:color w:val="6D28D9"/>
           <w:sz w:val="18"/>
         </w:rPr>
-        <w:t>▪</w:t>
-      </w:r>
-      <w:r>
-        <w:rPr>
-          <w:rFonts w:ascii="Segoe UI" w:eastAsia="Segoe UI" w:hAnsi="Segoe UI" w:cs="Segoe UI"/>
-          <w:b/>
-          <w:color w:val="6D28D9"/>
-          <w:sz w:val="18"/>
-        </w:rPr>
-        <w:t xml:space="preserve">  </w:t>
+        <w:t xml:space="preserve">▪  </w:t>
       </w:r>
       <w:r>
         <w:rPr>
@@ -39836,16 +39714,7 @@
           <w:color w:val="6D28D9"/>
           <w:sz w:val="18"/>
         </w:rPr>
-        <w:t>▪</w:t>
-      </w:r>
-      <w:r>
-        <w:rPr>
-          <w:rFonts w:ascii="Segoe UI" w:eastAsia="Segoe UI" w:hAnsi="Segoe UI" w:cs="Segoe UI"/>
-          <w:b/>
-          <w:color w:val="6D28D9"/>
-          <w:sz w:val="18"/>
-        </w:rPr>
-        <w:t xml:space="preserve">  </w:t>
+        <w:t xml:space="preserve">▪  </w:t>
       </w:r>
       <w:r>
         <w:rPr>
@@ -39911,16 +39780,7 @@
           <w:color w:val="6D28D9"/>
           <w:sz w:val="18"/>
         </w:rPr>
-        <w:t>▪</w:t>
-      </w:r>
-      <w:r>
-        <w:rPr>
-          <w:rFonts w:ascii="Segoe UI" w:eastAsia="Segoe UI" w:hAnsi="Segoe UI" w:cs="Segoe UI"/>
-          <w:b/>
-          <w:color w:val="6D28D9"/>
-          <w:sz w:val="18"/>
-        </w:rPr>
-        <w:t xml:space="preserve">  </w:t>
+        <w:t xml:space="preserve">▪  </w:t>
       </w:r>
       <w:r>
         <w:rPr>
@@ -39951,7 +39811,7 @@
         </w:pBdr>
         <w:spacing w:before="300" w:after="100" w:line="276" w:lineRule="auto"/>
       </w:pPr>
-      <w:bookmarkStart w:id="54" w:name="_Toc236790579"/>
+      <w:bookmarkStart w:id="54" w:name="_Toc239422425"/>
       <w:r>
         <w:rPr>
           <w:rFonts w:ascii="Segoe UI Semibold" w:eastAsia="Segoe UI Semibold" w:hAnsi="Segoe UI Semibold" w:cs="Segoe UI Semibold"/>
@@ -40376,16 +40236,7 @@
                 <w:color w:val="0F172A"/>
                 <w:sz w:val="18"/>
               </w:rPr>
-              <w:t>Uber</w:t>
-            </w:r>
-            <w:r>
-              <w:rPr>
-                <w:rFonts w:ascii="Segoe UI" w:eastAsia="Segoe UI" w:hAnsi="Segoe UI" w:cs="Segoe UI"/>
-                <w:b/>
-                <w:color w:val="0F172A"/>
-                <w:sz w:val="18"/>
-              </w:rPr>
-              <w:t xml:space="preserve"> — “How LedgerStore Supports Trillions of Indexes”</w:t>
+              <w:t>Uber — “How LedgerStore Supports Trillions of Indexes”</w:t>
             </w:r>
           </w:p>
         </w:tc>
@@ -40870,16 +40721,7 @@
                 <w:color w:val="0F172A"/>
                 <w:sz w:val="18"/>
               </w:rPr>
-              <w:t>Exigo / ByDesign / Epixel</w:t>
-            </w:r>
-            <w:r>
-              <w:rPr>
-                <w:rFonts w:ascii="Segoe UI" w:eastAsia="Segoe UI" w:hAnsi="Segoe UI" w:cs="Segoe UI"/>
-                <w:b/>
-                <w:color w:val="0F172A"/>
-                <w:sz w:val="18"/>
-              </w:rPr>
-              <w:t xml:space="preserve"> (vendor material — directional only)</w:t>
+              <w:t>Exigo / ByDesign / Epixel (vendor material — directional only)</w:t>
             </w:r>
           </w:p>
         </w:tc>
@@ -41105,7 +40947,7 @@
         </w:pBdr>
         <w:spacing w:before="300" w:after="100" w:line="276" w:lineRule="auto"/>
       </w:pPr>
-      <w:bookmarkStart w:id="55" w:name="_Toc236790580"/>
+      <w:bookmarkStart w:id="55" w:name="_Toc239422426"/>
       <w:r>
         <w:rPr>
           <w:rFonts w:ascii="Segoe UI Semibold" w:eastAsia="Segoe UI Semibold" w:hAnsi="Segoe UI Semibold" w:cs="Segoe UI Semibold"/>
@@ -41334,7 +41176,7 @@
 </file>
 
 <file path=word/endnotes.xml><?xml version="1.0" encoding="utf-8"?>
-<w:endnotes xmlns:wpc="http://schemas.microsoft.com/office/word/2010/wordprocessingCanvas" xmlns:cx="http://schemas.microsoft.com/office/drawing/2014/chartex" xmlns:cx1="http://schemas.microsoft.com/office/drawing/2015/9/8/chartex" xmlns:cx2="http://schemas.microsoft.com/office/drawing/2015/10/21/chartex" xmlns:cx3="http://schemas.microsoft.com/office/drawing/2016/5/9/chartex" xmlns:cx4="http://schemas.microsoft.com/office/drawing/2016/5/10/chartex" xmlns:cx5="http://schemas.microsoft.com/office/drawing/2016/5/11/chartex" xmlns:cx6="http://schemas.microsoft.com/office/drawing/2016/5/12/chartex" xmlns:cx7="http://schemas.microsoft.com/office/drawing/2016/5/13/chartex" xmlns:cx8="http://schemas.microsoft.com/office/drawing/2016/5/14/chartex" xmlns:mc="http://schemas.openxmlformats.org/markup-compatibility/2006" xmlns:aink="http://schemas.microsoft.com/office/drawing/2016/ink" xmlns:am3d="http://schemas.microsoft.com/office/drawing/2017/model3d" xmlns:o="urn:schemas-microsoft-com:office:office" xmlns:oel="http://schemas.microsoft.com/office/2019/extlst" xmlns:r="http://schemas.openxmlformats.org/officeDocument/2006/relationships" xmlns:m="http://schemas.openxmlformats.org/officeDocument/2006/math" xmlns:v="urn:schemas-microsoft-com:vml" xmlns:wp14="http://schemas.microsoft.com/office/word/2010/wordprocessingDrawing" xmlns:wp="http://schemas.openxmlformats.org/drawingml/2006/wordprocessingDrawing" xmlns:w10="urn:schemas-microsoft-com:office:word" xmlns:w="http://schemas.openxmlformats.org/wordprocessingml/2006/main" xmlns:w14="http://schemas.microsoft.com/office/word/2010/wordml" xmlns:w15="http://schemas.microsoft.com/office/word/2012/wordml" xmlns:w16cei="http://schemas.microsoft.com/office/word/2026/wordml/cei" xmlns:w16cex="http://schemas.microsoft.com/office/word/2018/wordml/cex" xmlns:w16cid="http://schemas.microsoft.com/office/word/2016/wordml/cid" xmlns:w16="http://schemas.microsoft.com/office/word/2018/wordml" xmlns:w16du="http://schemas.microsoft.com/office/word/2023/wordml/word16du" xmlns:w16sdtdh="http://schemas.microsoft.com/office/word/2020/wordml/sdtdatahash" xmlns:w16sdtfl="http://schemas.microsoft.com/office/word/2024/wordml/sdtformatlock" xmlns:w16se="http://schemas.microsoft.com/office/word/2015/wordml/symex" xmlns:wpg="http://schemas.microsoft.com/office/word/2010/wordprocessingGroup" xmlns:wpi="http://schemas.microsoft.com/office/word/2010/wordprocessingInk" xmlns:wne="http://schemas.microsoft.com/office/word/2006/wordml" xmlns:wps="http://schemas.microsoft.com/office/word/2010/wordprocessingShape" mc:Ignorable="w14 w15 w16se w16cid w16 w16cex w16sdtdh w16sdtfl w16du wp14">
+<w:endnotes xmlns:wpc="http://schemas.microsoft.com/office/word/2010/wordprocessingCanvas" xmlns:cx="http://schemas.microsoft.com/office/drawing/2014/chartex" xmlns:cx1="http://schemas.microsoft.com/office/drawing/2015/9/8/chartex" xmlns:cx2="http://schemas.microsoft.com/office/drawing/2015/10/21/chartex" xmlns:cx3="http://schemas.microsoft.com/office/drawing/2016/5/9/chartex" xmlns:cx4="http://schemas.microsoft.com/office/drawing/2016/5/10/chartex" xmlns:cx5="http://schemas.microsoft.com/office/drawing/2016/5/11/chartex" xmlns:cx6="http://schemas.microsoft.com/office/drawing/2016/5/12/chartex" xmlns:cx7="http://schemas.microsoft.com/office/drawing/2016/5/13/chartex" xmlns:cx8="http://schemas.microsoft.com/office/drawing/2016/5/14/chartex" xmlns:mc="http://schemas.openxmlformats.org/markup-compatibility/2006" xmlns:aink="http://schemas.microsoft.com/office/drawing/2016/ink" xmlns:am3d="http://schemas.microsoft.com/office/drawing/2017/model3d" xmlns:o="urn:schemas-microsoft-com:office:office" xmlns:oel="http://schemas.microsoft.com/office/2019/extlst" xmlns:r="http://schemas.openxmlformats.org/officeDocument/2006/relationships" xmlns:m="http://schemas.openxmlformats.org/officeDocument/2006/math" xmlns:v="urn:schemas-microsoft-com:vml" xmlns:wp14="http://schemas.microsoft.com/office/word/2010/wordprocessingDrawing" xmlns:wp="http://schemas.openxmlformats.org/drawingml/2006/wordprocessingDrawing" xmlns:w10="urn:schemas-microsoft-com:office:word" xmlns:w="http://schemas.openxmlformats.org/wordprocessingml/2006/main" xmlns:w14="http://schemas.microsoft.com/office/word/2010/wordml" xmlns:w15="http://schemas.microsoft.com/office/word/2012/wordml" xmlns:w16cex="http://schemas.microsoft.com/office/word/2018/wordml/cex" xmlns:w16cid="http://schemas.microsoft.com/office/word/2016/wordml/cid" xmlns:w16="http://schemas.microsoft.com/office/word/2018/wordml" xmlns:w16du="http://schemas.microsoft.com/office/word/2023/wordml/word16du" xmlns:w16sdtdh="http://schemas.microsoft.com/office/word/2020/wordml/sdtdatahash" xmlns:w16sdtfl="http://schemas.microsoft.com/office/word/2024/wordml/sdtformatlock" xmlns:w16se="http://schemas.microsoft.com/office/word/2015/wordml/symex" xmlns:wpg="http://schemas.microsoft.com/office/word/2010/wordprocessingGroup" xmlns:wpi="http://schemas.microsoft.com/office/word/2010/wordprocessingInk" xmlns:wne="http://schemas.microsoft.com/office/word/2006/wordml" xmlns:wps="http://schemas.microsoft.com/office/word/2010/wordprocessingShape" mc:Ignorable="w14 w15 w16se w16cid w16 w16cex w16sdtdh w16sdtfl w16du wp14">
   <w:endnote w:type="separator" w:id="-1">
     <w:p>
       <w:pPr>
@@ -41359,7 +41201,7 @@
 </file>
 
 <file path=word/footer1.xml><?xml version="1.0" encoding="utf-8"?>
-<w:ftr xmlns:wpc="http://schemas.microsoft.com/office/word/2010/wordprocessingCanvas" xmlns:cx="http://schemas.microsoft.com/office/drawing/2014/chartex" xmlns:cx1="http://schemas.microsoft.com/office/drawing/2015/9/8/chartex" xmlns:cx2="http://schemas.microsoft.com/office/drawing/2015/10/21/chartex" xmlns:cx3="http://schemas.microsoft.com/office/drawing/2016/5/9/chartex" xmlns:cx4="http://schemas.microsoft.com/office/drawing/2016/5/10/chartex" xmlns:cx5="http://schemas.microsoft.com/office/drawing/2016/5/11/chartex" xmlns:cx6="http://schemas.microsoft.com/office/drawing/2016/5/12/chartex" xmlns:cx7="http://schemas.microsoft.com/office/drawing/2016/5/13/chartex" xmlns:cx8="http://schemas.microsoft.com/office/drawing/2016/5/14/chartex" xmlns:mc="http://schemas.openxmlformats.org/markup-compatibility/2006" xmlns:aink="http://schemas.microsoft.com/office/drawing/2016/ink" xmlns:am3d="http://schemas.microsoft.com/office/drawing/2017/model3d" xmlns:o="urn:schemas-microsoft-com:office:office" xmlns:oel="http://schemas.microsoft.com/office/2019/extlst" xmlns:r="http://schemas.openxmlformats.org/officeDocument/2006/relationships" xmlns:m="http://schemas.openxmlformats.org/officeDocument/2006/math" xmlns:v="urn:schemas-microsoft-com:vml" xmlns:wp14="http://schemas.microsoft.com/office/word/2010/wordprocessingDrawing" xmlns:wp="http://schemas.openxmlformats.org/drawingml/2006/wordprocessingDrawing" xmlns:w10="urn:schemas-microsoft-com:office:word" xmlns:w="http://schemas.openxmlformats.org/wordprocessingml/2006/main" xmlns:w14="http://schemas.microsoft.com/office/word/2010/wordml" xmlns:w15="http://schemas.microsoft.com/office/word/2012/wordml" xmlns:w16cei="http://schemas.microsoft.com/office/word/2026/wordml/cei" xmlns:w16cex="http://schemas.microsoft.com/office/word/2018/wordml/cex" xmlns:w16cid="http://schemas.microsoft.com/office/word/2016/wordml/cid" xmlns:w16="http://schemas.microsoft.com/office/word/2018/wordml" xmlns:w16du="http://schemas.microsoft.com/office/word/2023/wordml/word16du" xmlns:w16sdtdh="http://schemas.microsoft.com/office/word/2020/wordml/sdtdatahash" xmlns:w16sdtfl="http://schemas.microsoft.com/office/word/2024/wordml/sdtformatlock" xmlns:w16se="http://schemas.microsoft.com/office/word/2015/wordml/symex" xmlns:wpg="http://schemas.microsoft.com/office/word/2010/wordprocessingGroup" xmlns:wpi="http://schemas.microsoft.com/office/word/2010/wordprocessingInk" xmlns:wne="http://schemas.microsoft.com/office/word/2006/wordml" xmlns:wps="http://schemas.microsoft.com/office/word/2010/wordprocessingShape" mc:Ignorable="w14 w15 w16se w16cid w16 w16cex w16sdtdh w16sdtfl w16du wp14">
+<w:ftr xmlns:wpc="http://schemas.microsoft.com/office/word/2010/wordprocessingCanvas" xmlns:cx="http://schemas.microsoft.com/office/drawing/2014/chartex" xmlns:cx1="http://schemas.microsoft.com/office/drawing/2015/9/8/chartex" xmlns:cx2="http://schemas.microsoft.com/office/drawing/2015/10/21/chartex" xmlns:cx3="http://schemas.microsoft.com/office/drawing/2016/5/9/chartex" xmlns:cx4="http://schemas.microsoft.com/office/drawing/2016/5/10/chartex" xmlns:cx5="http://schemas.microsoft.com/office/drawing/2016/5/11/chartex" xmlns:cx6="http://schemas.microsoft.com/office/drawing/2016/5/12/chartex" xmlns:cx7="http://schemas.microsoft.com/office/drawing/2016/5/13/chartex" xmlns:cx8="http://schemas.microsoft.com/office/drawing/2016/5/14/chartex" xmlns:mc="http://schemas.openxmlformats.org/markup-compatibility/2006" xmlns:aink="http://schemas.microsoft.com/office/drawing/2016/ink" xmlns:am3d="http://schemas.microsoft.com/office/drawing/2017/model3d" xmlns:o="urn:schemas-microsoft-com:office:office" xmlns:oel="http://schemas.microsoft.com/office/2019/extlst" xmlns:r="http://schemas.openxmlformats.org/officeDocument/2006/relationships" xmlns:m="http://schemas.openxmlformats.org/officeDocument/2006/math" xmlns:v="urn:schemas-microsoft-com:vml" xmlns:wp14="http://schemas.microsoft.com/office/word/2010/wordprocessingDrawing" xmlns:wp="http://schemas.openxmlformats.org/drawingml/2006/wordprocessingDrawing" xmlns:w10="urn:schemas-microsoft-com:office:word" xmlns:w="http://schemas.openxmlformats.org/wordprocessingml/2006/main" xmlns:w14="http://schemas.microsoft.com/office/word/2010/wordml" xmlns:w15="http://schemas.microsoft.com/office/word/2012/wordml" xmlns:w16cex="http://schemas.microsoft.com/office/word/2018/wordml/cex" xmlns:w16cid="http://schemas.microsoft.com/office/word/2016/wordml/cid" xmlns:w16="http://schemas.microsoft.com/office/word/2018/wordml" xmlns:w16du="http://schemas.microsoft.com/office/word/2023/wordml/word16du" xmlns:w16sdtdh="http://schemas.microsoft.com/office/word/2020/wordml/sdtdatahash" xmlns:w16sdtfl="http://schemas.microsoft.com/office/word/2024/wordml/sdtformatlock" xmlns:w16se="http://schemas.microsoft.com/office/word/2015/wordml/symex" xmlns:wpg="http://schemas.microsoft.com/office/word/2010/wordprocessingGroup" xmlns:wpi="http://schemas.microsoft.com/office/word/2010/wordprocessingInk" xmlns:wne="http://schemas.microsoft.com/office/word/2006/wordml" xmlns:wps="http://schemas.microsoft.com/office/word/2010/wordprocessingShape" mc:Ignorable="w14 w15 w16se w16cid w16 w16cex w16sdtdh w16sdtfl w16du wp14">
   <w:p>
     <w:pPr>
       <w:pStyle w:val="Footer"/>
@@ -41469,7 +41311,7 @@
 </file>
 
 <file path=word/footnotes.xml><?xml version="1.0" encoding="utf-8"?>
-<w:footnotes xmlns:wpc="http://schemas.microsoft.com/office/word/2010/wordprocessingCanvas" xmlns:cx="http://schemas.microsoft.com/office/drawing/2014/chartex" xmlns:cx1="http://schemas.microsoft.com/office/drawing/2015/9/8/chartex" xmlns:cx2="http://schemas.microsoft.com/office/drawing/2015/10/21/chartex" xmlns:cx3="http://schemas.microsoft.com/office/drawing/2016/5/9/chartex" xmlns:cx4="http://schemas.microsoft.com/office/drawing/2016/5/10/chartex" xmlns:cx5="http://schemas.microsoft.com/office/drawing/2016/5/11/chartex" xmlns:cx6="http://schemas.microsoft.com/office/drawing/2016/5/12/chartex" xmlns:cx7="http://schemas.microsoft.com/office/drawing/2016/5/13/chartex" xmlns:cx8="http://schemas.microsoft.com/office/drawing/2016/5/14/chartex" xmlns:mc="http://schemas.openxmlformats.org/markup-compatibility/2006" xmlns:aink="http://schemas.microsoft.com/office/drawing/2016/ink" xmlns:am3d="http://schemas.microsoft.com/office/drawing/2017/model3d" xmlns:o="urn:schemas-microsoft-com:office:office" xmlns:oel="http://schemas.microsoft.com/office/2019/extlst" xmlns:r="http://schemas.openxmlformats.org/officeDocument/2006/relationships" xmlns:m="http://schemas.openxmlformats.org/officeDocument/2006/math" xmlns:v="urn:schemas-microsoft-com:vml" xmlns:wp14="http://schemas.microsoft.com/office/word/2010/wordprocessingDrawing" xmlns:wp="http://schemas.openxmlformats.org/drawingml/2006/wordprocessingDrawing" xmlns:w10="urn:schemas-microsoft-com:office:word" xmlns:w="http://schemas.openxmlformats.org/wordprocessingml/2006/main" xmlns:w14="http://schemas.microsoft.com/office/word/2010/wordml" xmlns:w15="http://schemas.microsoft.com/office/word/2012/wordml" xmlns:w16cei="http://schemas.microsoft.com/office/word/2026/wordml/cei" xmlns:w16cex="http://schemas.microsoft.com/office/word/2018/wordml/cex" xmlns:w16cid="http://schemas.microsoft.com/office/word/2016/wordml/cid" xmlns:w16="http://schemas.microsoft.com/office/word/2018/wordml" xmlns:w16du="http://schemas.microsoft.com/office/word/2023/wordml/word16du" xmlns:w16sdtdh="http://schemas.microsoft.com/office/word/2020/wordml/sdtdatahash" xmlns:w16sdtfl="http://schemas.microsoft.com/office/word/2024/wordml/sdtformatlock" xmlns:w16se="http://schemas.microsoft.com/office/word/2015/wordml/symex" xmlns:wpg="http://schemas.microsoft.com/office/word/2010/wordprocessingGroup" xmlns:wpi="http://schemas.microsoft.com/office/word/2010/wordprocessingInk" xmlns:wne="http://schemas.microsoft.com/office/word/2006/wordml" xmlns:wps="http://schemas.microsoft.com/office/word/2010/wordprocessingShape" mc:Ignorable="w14 w15 w16se w16cid w16 w16cex w16sdtdh w16sdtfl w16du wp14">
+<w:footnotes xmlns:wpc="http://schemas.microsoft.com/office/word/2010/wordprocessingCanvas" xmlns:cx="http://schemas.microsoft.com/office/drawing/2014/chartex" xmlns:cx1="http://schemas.microsoft.com/office/drawing/2015/9/8/chartex" xmlns:cx2="http://schemas.microsoft.com/office/drawing/2015/10/21/chartex" xmlns:cx3="http://schemas.microsoft.com/office/drawing/2016/5/9/chartex" xmlns:cx4="http://schemas.microsoft.com/office/drawing/2016/5/10/chartex" xmlns:cx5="http://schemas.microsoft.com/office/drawing/2016/5/11/chartex" xmlns:cx6="http://schemas.microsoft.com/office/drawing/2016/5/12/chartex" xmlns:cx7="http://schemas.microsoft.com/office/drawing/2016/5/13/chartex" xmlns:cx8="http://schemas.microsoft.com/office/drawing/2016/5/14/chartex" xmlns:mc="http://schemas.openxmlformats.org/markup-compatibility/2006" xmlns:aink="http://schemas.microsoft.com/office/drawing/2016/ink" xmlns:am3d="http://schemas.microsoft.com/office/drawing/2017/model3d" xmlns:o="urn:schemas-microsoft-com:office:office" xmlns:oel="http://schemas.microsoft.com/office/2019/extlst" xmlns:r="http://schemas.openxmlformats.org/officeDocument/2006/relationships" xmlns:m="http://schemas.openxmlformats.org/officeDocument/2006/math" xmlns:v="urn:schemas-microsoft-com:vml" xmlns:wp14="http://schemas.microsoft.com/office/word/2010/wordprocessingDrawing" xmlns:wp="http://schemas.openxmlformats.org/drawingml/2006/wordprocessingDrawing" xmlns:w10="urn:schemas-microsoft-com:office:word" xmlns:w="http://schemas.openxmlformats.org/wordprocessingml/2006/main" xmlns:w14="http://schemas.microsoft.com/office/word/2010/wordml" xmlns:w15="http://schemas.microsoft.com/office/word/2012/wordml" xmlns:w16cex="http://schemas.microsoft.com/office/word/2018/wordml/cex" xmlns:w16cid="http://schemas.microsoft.com/office/word/2016/wordml/cid" xmlns:w16="http://schemas.microsoft.com/office/word/2018/wordml" xmlns:w16du="http://schemas.microsoft.com/office/word/2023/wordml/word16du" xmlns:w16sdtdh="http://schemas.microsoft.com/office/word/2020/wordml/sdtdatahash" xmlns:w16sdtfl="http://schemas.microsoft.com/office/word/2024/wordml/sdtformatlock" xmlns:w16se="http://schemas.microsoft.com/office/word/2015/wordml/symex" xmlns:wpg="http://schemas.microsoft.com/office/word/2010/wordprocessingGroup" xmlns:wpi="http://schemas.microsoft.com/office/word/2010/wordprocessingInk" xmlns:wne="http://schemas.microsoft.com/office/word/2006/wordml" xmlns:wps="http://schemas.microsoft.com/office/word/2010/wordprocessingShape" mc:Ignorable="w14 w15 w16se w16cid w16 w16cex w16sdtdh w16sdtfl w16du wp14">
   <w:footnote w:type="separator" w:id="-1">
     <w:p>
       <w:pPr>
@@ -41494,7 +41336,7 @@
 </file>
 
 <file path=word/header1.xml><?xml version="1.0" encoding="utf-8"?>
-<w:hdr xmlns:wpc="http://schemas.microsoft.com/office/word/2010/wordprocessingCanvas" xmlns:cx="http://schemas.microsoft.com/office/drawing/2014/chartex" xmlns:cx1="http://schemas.microsoft.com/office/drawing/2015/9/8/chartex" xmlns:cx2="http://schemas.microsoft.com/office/drawing/2015/10/21/chartex" xmlns:cx3="http://schemas.microsoft.com/office/drawing/2016/5/9/chartex" xmlns:cx4="http://schemas.microsoft.com/office/drawing/2016/5/10/chartex" xmlns:cx5="http://schemas.microsoft.com/office/drawing/2016/5/11/chartex" xmlns:cx6="http://schemas.microsoft.com/office/drawing/2016/5/12/chartex" xmlns:cx7="http://schemas.microsoft.com/office/drawing/2016/5/13/chartex" xmlns:cx8="http://schemas.microsoft.com/office/drawing/2016/5/14/chartex" xmlns:mc="http://schemas.openxmlformats.org/markup-compatibility/2006" xmlns:aink="http://schemas.microsoft.com/office/drawing/2016/ink" xmlns:am3d="http://schemas.microsoft.com/office/drawing/2017/model3d" xmlns:o="urn:schemas-microsoft-com:office:office" xmlns:oel="http://schemas.microsoft.com/office/2019/extlst" xmlns:r="http://schemas.openxmlformats.org/officeDocument/2006/relationships" xmlns:m="http://schemas.openxmlformats.org/officeDocument/2006/math" xmlns:v="urn:schemas-microsoft-com:vml" xmlns:wp14="http://schemas.microsoft.com/office/word/2010/wordprocessingDrawing" xmlns:wp="http://schemas.openxmlformats.org/drawingml/2006/wordprocessingDrawing" xmlns:w10="urn:schemas-microsoft-com:office:word" xmlns:w="http://schemas.openxmlformats.org/wordprocessingml/2006/main" xmlns:w14="http://schemas.microsoft.com/office/word/2010/wordml" xmlns:w15="http://schemas.microsoft.com/office/word/2012/wordml" xmlns:w16cei="http://schemas.microsoft.com/office/word/2026/wordml/cei" xmlns:w16cex="http://schemas.microsoft.com/office/word/2018/wordml/cex" xmlns:w16cid="http://schemas.microsoft.com/office/word/2016/wordml/cid" xmlns:w16="http://schemas.microsoft.com/office/word/2018/wordml" xmlns:w16du="http://schemas.microsoft.com/office/word/2023/wordml/word16du" xmlns:w16sdtdh="http://schemas.microsoft.com/office/word/2020/wordml/sdtdatahash" xmlns:w16sdtfl="http://schemas.microsoft.com/office/word/2024/wordml/sdtformatlock" xmlns:w16se="http://schemas.microsoft.com/office/word/2015/wordml/symex" xmlns:wpg="http://schemas.microsoft.com/office/word/2010/wordprocessingGroup" xmlns:wpi="http://schemas.microsoft.com/office/word/2010/wordprocessingInk" xmlns:wne="http://schemas.microsoft.com/office/word/2006/wordml" xmlns:wps="http://schemas.microsoft.com/office/word/2010/wordprocessingShape" mc:Ignorable="w14 w15 w16se w16cid w16 w16cex w16sdtdh w16sdtfl w16du wp14">
+<w:hdr xmlns:wpc="http://schemas.microsoft.com/office/word/2010/wordprocessingCanvas" xmlns:cx="http://schemas.microsoft.com/office/drawing/2014/chartex" xmlns:cx1="http://schemas.microsoft.com/office/drawing/2015/9/8/chartex" xmlns:cx2="http://schemas.microsoft.com/office/drawing/2015/10/21/chartex" xmlns:cx3="http://schemas.microsoft.com/office/drawing/2016/5/9/chartex" xmlns:cx4="http://schemas.microsoft.com/office/drawing/2016/5/10/chartex" xmlns:cx5="http://schemas.microsoft.com/office/drawing/2016/5/11/chartex" xmlns:cx6="http://schemas.microsoft.com/office/drawing/2016/5/12/chartex" xmlns:cx7="http://schemas.microsoft.com/office/drawing/2016/5/13/chartex" xmlns:cx8="http://schemas.microsoft.com/office/drawing/2016/5/14/chartex" xmlns:mc="http://schemas.openxmlformats.org/markup-compatibility/2006" xmlns:aink="http://schemas.microsoft.com/office/drawing/2016/ink" xmlns:am3d="http://schemas.microsoft.com/office/drawing/2017/model3d" xmlns:o="urn:schemas-microsoft-com:office:office" xmlns:oel="http://schemas.microsoft.com/office/2019/extlst" xmlns:r="http://schemas.openxmlformats.org/officeDocument/2006/relationships" xmlns:m="http://schemas.openxmlformats.org/officeDocument/2006/math" xmlns:v="urn:schemas-microsoft-com:vml" xmlns:wp14="http://schemas.microsoft.com/office/word/2010/wordprocessingDrawing" xmlns:wp="http://schemas.openxmlformats.org/drawingml/2006/wordprocessingDrawing" xmlns:w10="urn:schemas-microsoft-com:office:word" xmlns:w="http://schemas.openxmlformats.org/wordprocessingml/2006/main" xmlns:w14="http://schemas.microsoft.com/office/word/2010/wordml" xmlns:w15="http://schemas.microsoft.com/office/word/2012/wordml" xmlns:w16cex="http://schemas.microsoft.com/office/word/2018/wordml/cex" xmlns:w16cid="http://schemas.microsoft.com/office/word/2016/wordml/cid" xmlns:w16="http://schemas.microsoft.com/office/word/2018/wordml" xmlns:w16du="http://schemas.microsoft.com/office/word/2023/wordml/word16du" xmlns:w16sdtdh="http://schemas.microsoft.com/office/word/2020/wordml/sdtdatahash" xmlns:w16sdtfl="http://schemas.microsoft.com/office/word/2024/wordml/sdtformatlock" xmlns:w16se="http://schemas.microsoft.com/office/word/2015/wordml/symex" xmlns:wpg="http://schemas.microsoft.com/office/word/2010/wordprocessingGroup" xmlns:wpi="http://schemas.microsoft.com/office/word/2010/wordprocessingInk" xmlns:wne="http://schemas.microsoft.com/office/word/2006/wordml" xmlns:wps="http://schemas.microsoft.com/office/word/2010/wordprocessingShape" mc:Ignorable="w14 w15 w16se w16cid w16 w16cex w16sdtdh w16sdtfl w16du wp14">
   <w:p>
     <w:pPr>
       <w:pStyle w:val="Header"/>
@@ -41519,7 +41361,7 @@
 </file>
 
 <file path=word/numbering.xml><?xml version="1.0" encoding="utf-8"?>
-<w:numbering xmlns:wpc="http://schemas.microsoft.com/office/word/2010/wordprocessingCanvas" xmlns:cx="http://schemas.microsoft.com/office/drawing/2014/chartex" xmlns:cx1="http://schemas.microsoft.com/office/drawing/2015/9/8/chartex" xmlns:cx2="http://schemas.microsoft.com/office/drawing/2015/10/21/chartex" xmlns:cx3="http://schemas.microsoft.com/office/drawing/2016/5/9/chartex" xmlns:cx4="http://schemas.microsoft.com/office/drawing/2016/5/10/chartex" xmlns:cx5="http://schemas.microsoft.com/office/drawing/2016/5/11/chartex" xmlns:cx6="http://schemas.microsoft.com/office/drawing/2016/5/12/chartex" xmlns:cx7="http://schemas.microsoft.com/office/drawing/2016/5/13/chartex" xmlns:cx8="http://schemas.microsoft.com/office/drawing/2016/5/14/chartex" xmlns:mc="http://schemas.openxmlformats.org/markup-compatibility/2006" xmlns:aink="http://schemas.microsoft.com/office/drawing/2016/ink" xmlns:am3d="http://schemas.microsoft.com/office/drawing/2017/model3d" xmlns:o="urn:schemas-microsoft-com:office:office" xmlns:oel="http://schemas.microsoft.com/office/2019/extlst" xmlns:r="http://schemas.openxmlformats.org/officeDocument/2006/relationships" xmlns:m="http://schemas.openxmlformats.org/officeDocument/2006/math" xmlns:v="urn:schemas-microsoft-com:vml" xmlns:wp14="http://schemas.microsoft.com/office/word/2010/wordprocessingDrawing" xmlns:wp="http://schemas.openxmlformats.org/drawingml/2006/wordprocessingDrawing" xmlns:w10="urn:schemas-microsoft-com:office:word" xmlns:w="http://schemas.openxmlformats.org/wordprocessingml/2006/main" xmlns:w14="http://schemas.microsoft.com/office/word/2010/wordml" xmlns:w15="http://schemas.microsoft.com/office/word/2012/wordml" xmlns:w16cei="http://schemas.microsoft.com/office/word/2026/wordml/cei" xmlns:w16cex="http://schemas.microsoft.com/office/word/2018/wordml/cex" xmlns:w16cid="http://schemas.microsoft.com/office/word/2016/wordml/cid" xmlns:w16="http://schemas.microsoft.com/office/word/2018/wordml" xmlns:w16du="http://schemas.microsoft.com/office/word/2023/wordml/word16du" xmlns:w16sdtdh="http://schemas.microsoft.com/office/word/2020/wordml/sdtdatahash" xmlns:w16sdtfl="http://schemas.microsoft.com/office/word/2024/wordml/sdtformatlock" xmlns:w16se="http://schemas.microsoft.com/office/word/2015/wordml/symex" xmlns:wpg="http://schemas.microsoft.com/office/word/2010/wordprocessingGroup" xmlns:wpi="http://schemas.microsoft.com/office/word/2010/wordprocessingInk" xmlns:wne="http://schemas.microsoft.com/office/word/2006/wordml" xmlns:wps="http://schemas.microsoft.com/office/word/2010/wordprocessingShape" mc:Ignorable="w14 w15 w16se w16cid w16 w16cex w16sdtdh w16sdtfl w16du wp14">
+<w:numbering xmlns:wpc="http://schemas.microsoft.com/office/word/2010/wordprocessingCanvas" xmlns:cx="http://schemas.microsoft.com/office/drawing/2014/chartex" xmlns:cx1="http://schemas.microsoft.com/office/drawing/2015/9/8/chartex" xmlns:cx2="http://schemas.microsoft.com/office/drawing/2015/10/21/chartex" xmlns:cx3="http://schemas.microsoft.com/office/drawing/2016/5/9/chartex" xmlns:cx4="http://schemas.microsoft.com/office/drawing/2016/5/10/chartex" xmlns:cx5="http://schemas.microsoft.com/office/drawing/2016/5/11/chartex" xmlns:cx6="http://schemas.microsoft.com/office/drawing/2016/5/12/chartex" xmlns:cx7="http://schemas.microsoft.com/office/drawing/2016/5/13/chartex" xmlns:cx8="http://schemas.microsoft.com/office/drawing/2016/5/14/chartex" xmlns:mc="http://schemas.openxmlformats.org/markup-compatibility/2006" xmlns:aink="http://schemas.microsoft.com/office/drawing/2016/ink" xmlns:am3d="http://schemas.microsoft.com/office/drawing/2017/model3d" xmlns:o="urn:schemas-microsoft-com:office:office" xmlns:oel="http://schemas.microsoft.com/office/2019/extlst" xmlns:r="http://schemas.openxmlformats.org/officeDocument/2006/relationships" xmlns:m="http://schemas.openxmlformats.org/officeDocument/2006/math" xmlns:v="urn:schemas-microsoft-com:vml" xmlns:wp14="http://schemas.microsoft.com/office/word/2010/wordprocessingDrawing" xmlns:wp="http://schemas.openxmlformats.org/drawingml/2006/wordprocessingDrawing" xmlns:w10="urn:schemas-microsoft-com:office:word" xmlns:w="http://schemas.openxmlformats.org/wordprocessingml/2006/main" xmlns:w14="http://schemas.microsoft.com/office/word/2010/wordml" xmlns:w15="http://schemas.microsoft.com/office/word/2012/wordml" xmlns:w16cex="http://schemas.microsoft.com/office/word/2018/wordml/cex" xmlns:w16cid="http://schemas.microsoft.com/office/word/2016/wordml/cid" xmlns:w16="http://schemas.microsoft.com/office/word/2018/wordml" xmlns:w16du="http://schemas.microsoft.com/office/word/2023/wordml/word16du" xmlns:w16sdtdh="http://schemas.microsoft.com/office/word/2020/wordml/sdtdatahash" xmlns:w16sdtfl="http://schemas.microsoft.com/office/word/2024/wordml/sdtformatlock" xmlns:w16se="http://schemas.microsoft.com/office/word/2015/wordml/symex" xmlns:wpg="http://schemas.microsoft.com/office/word/2010/wordprocessingGroup" xmlns:wpi="http://schemas.microsoft.com/office/word/2010/wordprocessingInk" xmlns:wne="http://schemas.microsoft.com/office/word/2006/wordml" xmlns:wps="http://schemas.microsoft.com/office/word/2010/wordprocessingShape" mc:Ignorable="w14 w15 w16se w16cid w16 w16cex w16sdtdh w16sdtfl w16du wp14">
   <w:abstractNum w:abstractNumId="0" w15:restartNumberingAfterBreak="0">
     <w:nsid w:val="FFFFFF7C"/>
     <w:multiLevelType w:val="singleLevel"/>

</xml_diff>